<commit_message>
docs: keep appliance guides aligned with release version
</commit_message>
<xml_diff>
--- a/docs/AHV-Appliance-Build-Guide.docx
+++ b/docs/AHV-Appliance-Build-Guide.docx
@@ -261,17 +261,33 @@
           </w:p>
         </w:tc>
       </w:tr>
+      <w:tr>
+        <w:tc>
+          <w:tcPr>
+            <w:tcW w:type="dxa" w:w="2600"/>
+          </w:tcPr>
+          <w:p>
+            <w:r>
+              <w:t>Current ZTF-Orchestrator release</w:t>
+            </w:r>
+          </w:p>
+        </w:tc>
+        <w:tc>
+          <w:tcPr>
+            <w:tcW w:type="dxa" w:w="6760"/>
+          </w:tcPr>
+          <w:p>
+            <w:r>
+              <w:t>v1.5.6</w:t>
+            </w:r>
+          </w:p>
+        </w:tc>
+      </w:tr>
     </w:tbl>
     <w:p/>
     <w:p>
       <w:r>
-        <w:rPr>
-          <w:b/>
-        </w:rPr>
-        <w:t xml:space="preserve">Purpose. </w:t>
-      </w:r>
-      <w:r>
-        <w:t>This guide describes how to build a portable ZTF-Orchestrator AHV appliance for connected staging or air-gapped Nutanix AHV environments. The current build process can bake the ZTF-Orchestrator application image, legacy ZeroTouch Framework v1.5.2, and NKP framework assets into the QCOW2 before transfer.</w:t>
+        <w:t>Purpose. This guide describes how to build a portable ZTF-Orchestrator AHV appliance for connected staging or air-gapped Nutanix AHV environments. For this source tree, the current ZTF-Orchestrator release is v1.5.6. The current build process can bake the ZTF-Orchestrator application image, legacy ZeroTouch Framework v1.5.2, and NKP framework assets into the QCOW2 before transfer.</w:t>
       </w:r>
     </w:p>
     <w:p>
@@ -351,7 +367,6 @@
         <w:pStyle w:val="Heading1"/>
       </w:pPr>
       <w:r>
-        <w:lastRenderedPageBreak/>
         <w:t>Build Variables</w:t>
       </w:r>
     </w:p>
@@ -467,7 +482,7 @@
           </w:tcPr>
           <w:p>
             <w:r>
-              <w:t>v1.2.9 or main</w:t>
+              <w:t>v1.5.6 or main</w:t>
             </w:r>
           </w:p>
         </w:tc>
@@ -520,7 +535,7 @@
           </w:tcPr>
           <w:p>
             <w:r>
-              <w:t>v1.2.9 or latest</w:t>
+              <w:t>v1.5.6 or latest</w:t>
             </w:r>
           </w:p>
         </w:tc>
@@ -966,7 +981,6 @@
           <w:color w:val="111827"/>
           <w:sz w:val="17"/>
         </w:rPr>
-        <w:lastRenderedPageBreak/>
         <w:t># Optional local bundle staging before build</w:t>
       </w:r>
       <w:r>
@@ -1024,7 +1038,7 @@
           <w:sz w:val="17"/>
         </w:rPr>
         <w:br/>
-        <w:t>VERSION=v1.2.9 \</w:t>
+        <w:t>VERSION=v1.5.6 \</w:t>
       </w:r>
       <w:r>
         <w:rPr>
@@ -1033,7 +1047,7 @@
           <w:sz w:val="17"/>
         </w:rPr>
         <w:br/>
-        <w:t>ZTF_ORCHESTRATOR_VERSION=v1.2.9 \</w:t>
+        <w:t>ZTF_ORCHESTRATOR_VERSION=v1.5.6 \</w:t>
       </w:r>
       <w:r>
         <w:rPr>
@@ -1479,7 +1493,6 @@
           </w:tcPr>
           <w:p>
             <w:r>
-              <w:lastRenderedPageBreak/>
               <w:t>bake_nkp_framework</w:t>
             </w:r>
           </w:p>
@@ -1952,7 +1965,6 @@
           <w:color w:val="111827"/>
           <w:sz w:val="17"/>
         </w:rPr>
-        <w:lastRenderedPageBreak/>
         <w:t>sudo docker compose -f appliance/docker-compose.appliance.yml exec ztf-orchestrator ls -la /var/lib/ztf-orchestrator/nkp-zerotouch-framework</w:t>
       </w:r>
       <w:r>

</xml_diff>

<commit_message>
Release v1.6.0 upgrade advisor
</commit_message>
<xml_diff>
--- a/docs/AHV-Appliance-Build-Guide.docx
+++ b/docs/AHV-Appliance-Build-Guide.docx
@@ -278,7 +278,7 @@
           </w:tcPr>
           <w:p>
             <w:r>
-              <w:t>v1.5.6</w:t>
+              <w:t>v1.6.0</w:t>
             </w:r>
           </w:p>
         </w:tc>
@@ -287,7 +287,7 @@
     <w:p/>
     <w:p>
       <w:r>
-        <w:t>Purpose. This guide describes how to build a portable ZTF-Orchestrator AHV appliance for connected staging or air-gapped Nutanix AHV environments. For this source tree, the current ZTF-Orchestrator release is v1.5.6. The current build process can bake the ZTF-Orchestrator application image, legacy ZeroTouch Framework v1.5.2, and NKP framework assets into the QCOW2 before transfer.</w:t>
+        <w:t>Purpose. This guide describes how to build a portable ZTF-Orchestrator AHV appliance for connected staging or air-gapped Nutanix AHV environments. For this source tree, the current ZTF-Orchestrator release is v1.6.0. The current build process can bake the ZTF-Orchestrator application image, legacy ZeroTouch Framework v1.5.2, and NKP framework assets into the QCOW2 before transfer.</w:t>
       </w:r>
     </w:p>
     <w:p>
@@ -482,7 +482,7 @@
           </w:tcPr>
           <w:p>
             <w:r>
-              <w:t>v1.5.6 or main</w:t>
+              <w:t>v1.6.0 or main</w:t>
             </w:r>
           </w:p>
         </w:tc>
@@ -535,7 +535,7 @@
           </w:tcPr>
           <w:p>
             <w:r>
-              <w:t>v1.5.6 or latest</w:t>
+              <w:t>v1.6.0 or latest</w:t>
             </w:r>
           </w:p>
         </w:tc>
@@ -1038,7 +1038,7 @@
           <w:sz w:val="17"/>
         </w:rPr>
         <w:br/>
-        <w:t>VERSION=v1.5.6 \</w:t>
+        <w:t>VERSION=v1.6.0 \</w:t>
       </w:r>
       <w:r>
         <w:rPr>
@@ -1047,7 +1047,7 @@
           <w:sz w:val="17"/>
         </w:rPr>
         <w:br/>
-        <w:t>ZTF_ORCHESTRATOR_VERSION=v1.5.6 \</w:t>
+        <w:t>ZTF_ORCHESTRATOR_VERSION=v1.6.0 \</w:t>
       </w:r>
       <w:r>
         <w:rPr>

</xml_diff>

<commit_message>
Release v1.7.1 dashboard readability and docs
</commit_message>
<xml_diff>
--- a/docs/AHV-Appliance-Build-Guide.docx
+++ b/docs/AHV-Appliance-Build-Guide.docx
@@ -278,7 +278,7 @@
           </w:tcPr>
           <w:p>
             <w:r>
-              <w:t>v1.7.0</w:t>
+              <w:t>v1.7.1</w:t>
             </w:r>
           </w:p>
         </w:tc>
@@ -287,7 +287,7 @@
     <w:p/>
     <w:p>
       <w:r>
-        <w:t>Purpose. This guide describes how to build a portable ZTF-Orchestrator AHV appliance for connected staging or air-gapped Nutanix AHV environments. For this source tree, the current ZTF-Orchestrator release is v1.7.0. The current build process can bake the ZTF-Orchestrator application image, legacy ZeroTouch Framework v1.5.2, and NKP framework assets into the QCOW2 before transfer.</w:t>
+        <w:t>Purpose. This guide describes how to build a portable ZTF-Orchestrator AHV appliance for connected staging or air-gapped Nutanix AHV environments. For this source tree, the current ZTF-Orchestrator release is v1.7.1. The current build process can bake the ZTF-Orchestrator application image, legacy ZeroTouch Framework v1.5.2, and NKP framework assets into the QCOW2 before transfer.</w:t>
       </w:r>
     </w:p>
     <w:p>
@@ -482,7 +482,7 @@
           </w:tcPr>
           <w:p>
             <w:r>
-              <w:t>v1.7.0 or main</w:t>
+              <w:t>v1.7.1 or main</w:t>
             </w:r>
           </w:p>
         </w:tc>
@@ -535,7 +535,7 @@
           </w:tcPr>
           <w:p>
             <w:r>
-              <w:t>v1.7.0 or latest</w:t>
+              <w:t>v1.7.1 or latest</w:t>
             </w:r>
           </w:p>
         </w:tc>
@@ -1038,7 +1038,7 @@
           <w:sz w:val="17"/>
         </w:rPr>
         <w:br/>
-        <w:t>VERSION=v1.7.0 \</w:t>
+        <w:t>VERSION=v1.7.1 \</w:t>
       </w:r>
       <w:r>
         <w:rPr>
@@ -1047,7 +1047,7 @@
           <w:sz w:val="17"/>
         </w:rPr>
         <w:br/>
-        <w:t>ZTF_ORCHESTRATOR_VERSION=v1.7.0 \</w:t>
+        <w:t>ZTF_ORCHESTRATOR_VERSION=v1.7.1 \</w:t>
       </w:r>
       <w:r>
         <w:rPr>

</xml_diff>

<commit_message>
Fix cluster-create schema compatibility
</commit_message>
<xml_diff>
--- a/docs/AHV-Appliance-Build-Guide.docx
+++ b/docs/AHV-Appliance-Build-Guide.docx
@@ -278,7 +278,7 @@
           </w:tcPr>
           <w:p>
             <w:r>
-              <w:t>v1.7.1</w:t>
+              <w:t>v1.7.2</w:t>
             </w:r>
           </w:p>
         </w:tc>
@@ -287,7 +287,7 @@
     <w:p/>
     <w:p>
       <w:r>
-        <w:t>Purpose. This guide describes how to build a portable ZTF-Orchestrator AHV appliance for connected staging or air-gapped Nutanix AHV environments. For this source tree, the current ZTF-Orchestrator release is v1.7.1. The current build process can bake the ZTF-Orchestrator application image, legacy ZeroTouch Framework v1.5.2, and NKP framework assets into the QCOW2 before transfer.</w:t>
+        <w:t>Purpose. This guide describes how to build a portable ZTF-Orchestrator AHV appliance for connected staging or air-gapped Nutanix AHV environments. For this source tree, the current ZTF-Orchestrator release is v1.7.2. The current build process can bake the ZTF-Orchestrator application image, legacy ZeroTouch Framework v1.5.2, and NKP framework assets into the QCOW2 before transfer.</w:t>
       </w:r>
     </w:p>
     <w:p>
@@ -482,7 +482,7 @@
           </w:tcPr>
           <w:p>
             <w:r>
-              <w:t>v1.7.1 or main</w:t>
+              <w:t>v1.7.2 or main</w:t>
             </w:r>
           </w:p>
         </w:tc>
@@ -535,7 +535,7 @@
           </w:tcPr>
           <w:p>
             <w:r>
-              <w:t>v1.7.1 or latest</w:t>
+              <w:t>v1.7.2 or latest</w:t>
             </w:r>
           </w:p>
         </w:tc>
@@ -1038,7 +1038,7 @@
           <w:sz w:val="17"/>
         </w:rPr>
         <w:br/>
-        <w:t>VERSION=v1.7.1 \</w:t>
+        <w:t>VERSION=v1.7.2 \</w:t>
       </w:r>
       <w:r>
         <w:rPr>
@@ -1047,7 +1047,7 @@
           <w:sz w:val="17"/>
         </w:rPr>
         <w:br/>
-        <w:t>ZTF_ORCHESTRATOR_VERSION=v1.7.1 \</w:t>
+        <w:t>ZTF_ORCHESTRATOR_VERSION=v1.7.2 \</w:t>
       </w:r>
       <w:r>
         <w:rPr>

</xml_diff>

<commit_message>
Release v1.7.3 cluster-create schema fix
</commit_message>
<xml_diff>
--- a/docs/AHV-Appliance-Build-Guide.docx
+++ b/docs/AHV-Appliance-Build-Guide.docx
@@ -278,7 +278,7 @@
           </w:tcPr>
           <w:p>
             <w:r>
-              <w:t>v1.7.2</w:t>
+              <w:t>v1.7.3</w:t>
             </w:r>
           </w:p>
         </w:tc>
@@ -287,7 +287,7 @@
     <w:p/>
     <w:p>
       <w:r>
-        <w:t>Purpose. This guide describes how to build a portable ZTF-Orchestrator AHV appliance for connected staging or air-gapped Nutanix AHV environments. For this source tree, the current ZTF-Orchestrator release is v1.7.2. The current build process can bake the ZTF-Orchestrator application image, legacy ZeroTouch Framework v1.5.2, and NKP framework assets into the QCOW2 before transfer.</w:t>
+        <w:t>Purpose. This guide describes how to build a portable ZTF-Orchestrator AHV appliance for connected staging or air-gapped Nutanix AHV environments. For this source tree, the current ZTF-Orchestrator release is v1.7.3. The current build process can bake the ZTF-Orchestrator application image, legacy ZeroTouch Framework v1.5.2, and NKP framework assets into the QCOW2 before transfer.</w:t>
       </w:r>
     </w:p>
     <w:p>
@@ -482,7 +482,7 @@
           </w:tcPr>
           <w:p>
             <w:r>
-              <w:t>v1.7.2 or main</w:t>
+              <w:t>v1.7.3 or main</w:t>
             </w:r>
           </w:p>
         </w:tc>
@@ -535,7 +535,7 @@
           </w:tcPr>
           <w:p>
             <w:r>
-              <w:t>v1.7.2 or latest</w:t>
+              <w:t>v1.7.3 or latest</w:t>
             </w:r>
           </w:p>
         </w:tc>
@@ -1038,7 +1038,7 @@
           <w:sz w:val="17"/>
         </w:rPr>
         <w:br/>
-        <w:t>VERSION=v1.7.2 \</w:t>
+        <w:t>VERSION=v1.7.3 \</w:t>
       </w:r>
       <w:r>
         <w:rPr>
@@ -1047,7 +1047,7 @@
           <w:sz w:val="17"/>
         </w:rPr>
         <w:br/>
-        <w:t>ZTF_ORCHESTRATOR_VERSION=v1.7.2 \</w:t>
+        <w:t>ZTF_ORCHESTRATOR_VERSION=v1.7.3 \</w:t>
       </w:r>
       <w:r>
         <w:rPr>

</xml_diff>

<commit_message>
Release v1.7.4 cluster-create node serial fix
</commit_message>
<xml_diff>
--- a/docs/AHV-Appliance-Build-Guide.docx
+++ b/docs/AHV-Appliance-Build-Guide.docx
@@ -278,7 +278,7 @@
           </w:tcPr>
           <w:p>
             <w:r>
-              <w:t>v1.7.3</w:t>
+              <w:t>v1.7.4</w:t>
             </w:r>
           </w:p>
         </w:tc>
@@ -287,7 +287,7 @@
     <w:p/>
     <w:p>
       <w:r>
-        <w:t>Purpose. This guide describes how to build a portable ZTF-Orchestrator AHV appliance for connected staging or air-gapped Nutanix AHV environments. For this source tree, the current ZTF-Orchestrator release is v1.7.3. The current build process can bake the ZTF-Orchestrator application image, legacy ZeroTouch Framework v1.5.2, and NKP framework assets into the QCOW2 before transfer.</w:t>
+        <w:t>Purpose. This guide describes how to build a portable ZTF-Orchestrator AHV appliance for connected staging or air-gapped Nutanix AHV environments. For this source tree, the current ZTF-Orchestrator release is v1.7.4. The current build process can bake the ZTF-Orchestrator application image, legacy ZeroTouch Framework v1.5.2, and NKP framework assets into the QCOW2 before transfer.</w:t>
       </w:r>
     </w:p>
     <w:p>
@@ -482,7 +482,7 @@
           </w:tcPr>
           <w:p>
             <w:r>
-              <w:t>v1.7.3 or main</w:t>
+              <w:t>v1.7.4 or main</w:t>
             </w:r>
           </w:p>
         </w:tc>
@@ -535,7 +535,7 @@
           </w:tcPr>
           <w:p>
             <w:r>
-              <w:t>v1.7.3 or latest</w:t>
+              <w:t>v1.7.4 or latest</w:t>
             </w:r>
           </w:p>
         </w:tc>
@@ -1038,7 +1038,7 @@
           <w:sz w:val="17"/>
         </w:rPr>
         <w:br/>
-        <w:t>VERSION=v1.7.3 \</w:t>
+        <w:t>VERSION=v1.7.4 \</w:t>
       </w:r>
       <w:r>
         <w:rPr>
@@ -1047,7 +1047,7 @@
           <w:sz w:val="17"/>
         </w:rPr>
         <w:br/>
-        <w:t>ZTF_ORCHESTRATOR_VERSION=v1.7.3 \</w:t>
+        <w:t>ZTF_ORCHESTRATOR_VERSION=v1.7.4 \</w:t>
       </w:r>
       <w:r>
         <w:rPr>

</xml_diff>

<commit_message>
Release v1.7.5 global config ipam fix
</commit_message>
<xml_diff>
--- a/docs/AHV-Appliance-Build-Guide.docx
+++ b/docs/AHV-Appliance-Build-Guide.docx
@@ -278,7 +278,7 @@
           </w:tcPr>
           <w:p>
             <w:r>
-              <w:t>v1.7.4</w:t>
+              <w:t>v1.7.5</w:t>
             </w:r>
           </w:p>
         </w:tc>
@@ -287,7 +287,7 @@
     <w:p/>
     <w:p>
       <w:r>
-        <w:t>Purpose. This guide describes how to build a portable ZTF-Orchestrator AHV appliance for connected staging or air-gapped Nutanix AHV environments. For this source tree, the current ZTF-Orchestrator release is v1.7.4. The current build process can bake the ZTF-Orchestrator application image, legacy ZeroTouch Framework v1.5.2, and NKP framework assets into the QCOW2 before transfer.</w:t>
+        <w:t>Purpose. This guide describes how to build a portable ZTF-Orchestrator AHV appliance for connected staging or air-gapped Nutanix AHV environments. For this source tree, the current ZTF-Orchestrator release is v1.7.5. The current build process can bake the ZTF-Orchestrator application image, legacy ZeroTouch Framework v1.5.2, and NKP framework assets into the QCOW2 before transfer.</w:t>
       </w:r>
     </w:p>
     <w:p>
@@ -482,7 +482,7 @@
           </w:tcPr>
           <w:p>
             <w:r>
-              <w:t>v1.7.4 or main</w:t>
+              <w:t>v1.7.5 or main</w:t>
             </w:r>
           </w:p>
         </w:tc>
@@ -535,7 +535,7 @@
           </w:tcPr>
           <w:p>
             <w:r>
-              <w:t>v1.7.4 or latest</w:t>
+              <w:t>v1.7.5 or latest</w:t>
             </w:r>
           </w:p>
         </w:tc>
@@ -1038,7 +1038,7 @@
           <w:sz w:val="17"/>
         </w:rPr>
         <w:br/>
-        <w:t>VERSION=v1.7.4 \</w:t>
+        <w:t>VERSION=v1.7.5 \</w:t>
       </w:r>
       <w:r>
         <w:rPr>
@@ -1047,7 +1047,7 @@
           <w:sz w:val="17"/>
         </w:rPr>
         <w:br/>
-        <w:t>ZTF_ORCHESTRATOR_VERSION=v1.7.4 \</w:t>
+        <w:t>ZTF_ORCHESTRATOR_VERSION=v1.7.5 \</w:t>
       </w:r>
       <w:r>
         <w:rPr>

</xml_diff>

<commit_message>
Release v1.7.6 foundation central credential fix
</commit_message>
<xml_diff>
--- a/docs/AHV-Appliance-Build-Guide.docx
+++ b/docs/AHV-Appliance-Build-Guide.docx
@@ -278,7 +278,7 @@
           </w:tcPr>
           <w:p>
             <w:r>
-              <w:t>v1.7.5</w:t>
+              <w:t>v1.7.6</w:t>
             </w:r>
           </w:p>
         </w:tc>
@@ -287,7 +287,7 @@
     <w:p/>
     <w:p>
       <w:r>
-        <w:t>Purpose. This guide describes how to build a portable ZTF-Orchestrator AHV appliance for connected staging or air-gapped Nutanix AHV environments. For this source tree, the current ZTF-Orchestrator release is v1.7.5. The current build process can bake the ZTF-Orchestrator application image, legacy ZeroTouch Framework v1.5.2, and NKP framework assets into the QCOW2 before transfer.</w:t>
+        <w:t>Purpose. This guide describes how to build a portable ZTF-Orchestrator AHV appliance for connected staging or air-gapped Nutanix AHV environments. For this source tree, the current ZTF-Orchestrator release is v1.7.6. The current build process can bake the ZTF-Orchestrator application image, legacy ZeroTouch Framework v1.5.2, and NKP framework assets into the QCOW2 before transfer.</w:t>
       </w:r>
     </w:p>
     <w:p>
@@ -482,7 +482,7 @@
           </w:tcPr>
           <w:p>
             <w:r>
-              <w:t>v1.7.5 or main</w:t>
+              <w:t>v1.7.6 or main</w:t>
             </w:r>
           </w:p>
         </w:tc>
@@ -535,7 +535,7 @@
           </w:tcPr>
           <w:p>
             <w:r>
-              <w:t>v1.7.5 or latest</w:t>
+              <w:t>v1.7.6 or latest</w:t>
             </w:r>
           </w:p>
         </w:tc>
@@ -1038,7 +1038,7 @@
           <w:sz w:val="17"/>
         </w:rPr>
         <w:br/>
-        <w:t>VERSION=v1.7.5 \</w:t>
+        <w:t>VERSION=v1.7.6 \</w:t>
       </w:r>
       <w:r>
         <w:rPr>
@@ -1047,7 +1047,7 @@
           <w:sz w:val="17"/>
         </w:rPr>
         <w:br/>
-        <w:t>ZTF_ORCHESTRATOR_VERSION=v1.7.5 \</w:t>
+        <w:t>ZTF_ORCHESTRATOR_VERSION=v1.7.6 \</w:t>
       </w:r>
       <w:r>
         <w:rPr>

</xml_diff>

<commit_message>
Release v1.7.7 Foundation Central target mode
</commit_message>
<xml_diff>
--- a/docs/AHV-Appliance-Build-Guide.docx
+++ b/docs/AHV-Appliance-Build-Guide.docx
@@ -278,7 +278,7 @@
           </w:tcPr>
           <w:p>
             <w:r>
-              <w:t>v1.7.6</w:t>
+              <w:t>v1.7.7</w:t>
             </w:r>
           </w:p>
         </w:tc>
@@ -287,7 +287,7 @@
     <w:p/>
     <w:p>
       <w:r>
-        <w:t>Purpose. This guide describes how to build a portable ZTF-Orchestrator AHV appliance for connected staging or air-gapped Nutanix AHV environments. For this source tree, the current ZTF-Orchestrator release is v1.7.6. The current build process can bake the ZTF-Orchestrator application image, legacy ZeroTouch Framework v1.5.2, and NKP framework assets into the QCOW2 before transfer.</w:t>
+        <w:t>Purpose. This guide describes how to build a portable ZTF-Orchestrator AHV appliance for connected staging or air-gapped Nutanix AHV environments. For this source tree, the current ZTF-Orchestrator release is v1.7.7. The current build process can bake the ZTF-Orchestrator application image, legacy ZeroTouch Framework v1.5.2, and NKP framework assets into the QCOW2 before transfer.</w:t>
       </w:r>
     </w:p>
     <w:p>
@@ -482,7 +482,7 @@
           </w:tcPr>
           <w:p>
             <w:r>
-              <w:t>v1.7.6 or main</w:t>
+              <w:t>v1.7.7 or main</w:t>
             </w:r>
           </w:p>
         </w:tc>
@@ -535,7 +535,7 @@
           </w:tcPr>
           <w:p>
             <w:r>
-              <w:t>v1.7.6 or latest</w:t>
+              <w:t>v1.7.7 or latest</w:t>
             </w:r>
           </w:p>
         </w:tc>
@@ -1038,7 +1038,7 @@
           <w:sz w:val="17"/>
         </w:rPr>
         <w:br/>
-        <w:t>VERSION=v1.7.6 \</w:t>
+        <w:t>VERSION=v1.7.7 \</w:t>
       </w:r>
       <w:r>
         <w:rPr>
@@ -1047,7 +1047,7 @@
           <w:sz w:val="17"/>
         </w:rPr>
         <w:br/>
-        <w:t>ZTF_ORCHESTRATOR_VERSION=v1.7.6 \</w:t>
+        <w:t>ZTF_ORCHESTRATOR_VERSION=v1.7.7 \</w:t>
       </w:r>
       <w:r>
         <w:rPr>

</xml_diff>

<commit_message>
Release v1.7.8 post-cluster hardening
</commit_message>
<xml_diff>
--- a/docs/AHV-Appliance-Build-Guide.docx
+++ b/docs/AHV-Appliance-Build-Guide.docx
@@ -278,7 +278,7 @@
           </w:tcPr>
           <w:p>
             <w:r>
-              <w:t>v1.7.7</w:t>
+              <w:t>v1.7.8</w:t>
             </w:r>
           </w:p>
         </w:tc>
@@ -287,7 +287,7 @@
     <w:p/>
     <w:p>
       <w:r>
-        <w:t>Purpose. This guide describes how to build a portable ZTF-Orchestrator AHV appliance for connected staging or air-gapped Nutanix AHV environments. For this source tree, the current ZTF-Orchestrator release is v1.7.7. The current build process can bake the ZTF-Orchestrator application image, legacy ZeroTouch Framework v1.5.2, and NKP framework assets into the QCOW2 before transfer.</w:t>
+        <w:t>Purpose. This guide describes how to build a portable ZTF-Orchestrator AHV appliance for connected staging or air-gapped Nutanix AHV environments. For this source tree, the current ZTF-Orchestrator release is v1.7.8. The current build process can bake the ZTF-Orchestrator application image, legacy ZeroTouch Framework v1.5.2, and NKP framework assets into the QCOW2 before transfer.</w:t>
       </w:r>
     </w:p>
     <w:p>
@@ -482,7 +482,7 @@
           </w:tcPr>
           <w:p>
             <w:r>
-              <w:t>v1.7.7 or main</w:t>
+              <w:t>v1.7.8 or main</w:t>
             </w:r>
           </w:p>
         </w:tc>
@@ -535,7 +535,7 @@
           </w:tcPr>
           <w:p>
             <w:r>
-              <w:t>v1.7.7 or latest</w:t>
+              <w:t>v1.7.8 or latest</w:t>
             </w:r>
           </w:p>
         </w:tc>
@@ -1038,7 +1038,7 @@
           <w:sz w:val="17"/>
         </w:rPr>
         <w:br/>
-        <w:t>VERSION=v1.7.7 \</w:t>
+        <w:t>VERSION=v1.7.8 \</w:t>
       </w:r>
       <w:r>
         <w:rPr>
@@ -1047,7 +1047,7 @@
           <w:sz w:val="17"/>
         </w:rPr>
         <w:br/>
-        <w:t>ZTF_ORCHESTRATOR_VERSION=v1.7.7 \</w:t>
+        <w:t>ZTF_ORCHESTRATOR_VERSION=v1.7.8 \</w:t>
       </w:r>
       <w:r>
         <w:rPr>

</xml_diff>

<commit_message>
Release v1.7.9 appliance privacy correction
</commit_message>
<xml_diff>
--- a/docs/AHV-Appliance-Build-Guide.docx
+++ b/docs/AHV-Appliance-Build-Guide.docx
@@ -278,7 +278,7 @@
           </w:tcPr>
           <w:p>
             <w:r>
-              <w:t>v1.7.8</w:t>
+              <w:t>v1.7.9</w:t>
             </w:r>
           </w:p>
         </w:tc>
@@ -287,7 +287,7 @@
     <w:p/>
     <w:p>
       <w:r>
-        <w:t>Purpose. This guide describes how to build a portable ZTF-Orchestrator AHV appliance for connected staging or air-gapped Nutanix AHV environments. For this source tree, the current ZTF-Orchestrator release is v1.7.8. The current build process can bake the ZTF-Orchestrator application image, legacy ZeroTouch Framework v1.5.2, and NKP framework assets into the QCOW2 before transfer.</w:t>
+        <w:t>Purpose. This guide describes how to build a portable ZTF-Orchestrator AHV appliance for connected staging or air-gapped Nutanix AHV environments. For this source tree, the current ZTF-Orchestrator release is v1.7.9. The current build process can bake the ZTF-Orchestrator application image, legacy ZeroTouch Framework v1.5.2, and NKP framework assets into the QCOW2 before transfer.</w:t>
       </w:r>
     </w:p>
     <w:p>
@@ -482,7 +482,7 @@
           </w:tcPr>
           <w:p>
             <w:r>
-              <w:t>v1.7.8 or main</w:t>
+              <w:t>v1.7.9 or main</w:t>
             </w:r>
           </w:p>
         </w:tc>
@@ -535,7 +535,7 @@
           </w:tcPr>
           <w:p>
             <w:r>
-              <w:t>v1.7.8 or latest</w:t>
+              <w:t>v1.7.9 or latest</w:t>
             </w:r>
           </w:p>
         </w:tc>
@@ -1038,7 +1038,7 @@
           <w:sz w:val="17"/>
         </w:rPr>
         <w:br/>
-        <w:t>VERSION=v1.7.8 \</w:t>
+        <w:t>VERSION=v1.7.9 \</w:t>
       </w:r>
       <w:r>
         <w:rPr>
@@ -1047,7 +1047,7 @@
           <w:sz w:val="17"/>
         </w:rPr>
         <w:br/>
-        <w:t>ZTF_ORCHESTRATOR_VERSION=v1.7.8 \</w:t>
+        <w:t>ZTF_ORCHESTRATOR_VERSION=v1.7.9 \</w:t>
       </w:r>
       <w:r>
         <w:rPr>

</xml_diff>

<commit_message>
Release v1.7.10 appliance runtime sanitization
</commit_message>
<xml_diff>
--- a/docs/AHV-Appliance-Build-Guide.docx
+++ b/docs/AHV-Appliance-Build-Guide.docx
@@ -278,7 +278,7 @@
           </w:tcPr>
           <w:p>
             <w:r>
-              <w:t>v1.7.9</w:t>
+              <w:t>v1.7.10</w:t>
             </w:r>
           </w:p>
         </w:tc>
@@ -287,7 +287,7 @@
     <w:p/>
     <w:p>
       <w:r>
-        <w:t>Purpose. This guide describes how to build a portable ZTF-Orchestrator AHV appliance for connected staging or air-gapped Nutanix AHV environments. For this source tree, the current ZTF-Orchestrator release is v1.7.9. The current build process can bake the ZTF-Orchestrator application image, legacy ZeroTouch Framework v1.5.2, and NKP framework assets into the QCOW2 before transfer.</w:t>
+        <w:t>Purpose. This guide describes how to build a portable ZTF-Orchestrator AHV appliance for connected staging or air-gapped Nutanix AHV environments. For this source tree, the current ZTF-Orchestrator release is v1.7.10. The current build process can bake the ZTF-Orchestrator application image, legacy ZeroTouch Framework v1.5.2, and NKP framework assets into the QCOW2 before transfer.</w:t>
       </w:r>
     </w:p>
     <w:p>
@@ -482,7 +482,7 @@
           </w:tcPr>
           <w:p>
             <w:r>
-              <w:t>v1.7.9 or main</w:t>
+              <w:t>v1.7.10 or main</w:t>
             </w:r>
           </w:p>
         </w:tc>
@@ -535,7 +535,7 @@
           </w:tcPr>
           <w:p>
             <w:r>
-              <w:t>v1.7.9 or latest</w:t>
+              <w:t>v1.7.10 or latest</w:t>
             </w:r>
           </w:p>
         </w:tc>
@@ -1038,7 +1038,7 @@
           <w:sz w:val="17"/>
         </w:rPr>
         <w:br/>
-        <w:t>VERSION=v1.7.9 \</w:t>
+        <w:t>VERSION=v1.7.10 \</w:t>
       </w:r>
       <w:r>
         <w:rPr>
@@ -1047,7 +1047,7 @@
           <w:sz w:val="17"/>
         </w:rPr>
         <w:br/>
-        <w:t>ZTF_ORCHESTRATOR_VERSION=v1.7.9 \</w:t>
+        <w:t>ZTF_ORCHESTRATOR_VERSION=v1.7.10 \</w:t>
       </w:r>
       <w:r>
         <w:rPr>

</xml_diff>

<commit_message>
Fix standalone FCA site deploy node fields
</commit_message>
<xml_diff>
--- a/docs/AHV-Appliance-Build-Guide.docx
+++ b/docs/AHV-Appliance-Build-Guide.docx
@@ -278,7 +278,7 @@
           </w:tcPr>
           <w:p>
             <w:r>
-              <w:t>v1.7.10</w:t>
+              <w:t>v1.7.11</w:t>
             </w:r>
           </w:p>
         </w:tc>
@@ -287,7 +287,7 @@
     <w:p/>
     <w:p>
       <w:r>
-        <w:t>Purpose. This guide describes how to build a portable ZTF-Orchestrator AHV appliance for connected staging or air-gapped Nutanix AHV environments. For this source tree, the current ZTF-Orchestrator release is v1.7.10. The current build process can bake the ZTF-Orchestrator application image, legacy ZeroTouch Framework v1.5.2, and NKP framework assets into the QCOW2 before transfer.</w:t>
+        <w:t>Purpose. This guide describes how to build a portable ZTF-Orchestrator AHV appliance for connected staging or air-gapped Nutanix AHV environments. For this source tree, the current ZTF-Orchestrator release is v1.7.11. The current build process can bake the ZTF-Orchestrator application image, legacy ZeroTouch Framework v1.5.2, and NKP framework assets into the QCOW2 before transfer.</w:t>
       </w:r>
     </w:p>
     <w:p>
@@ -482,7 +482,7 @@
           </w:tcPr>
           <w:p>
             <w:r>
-              <w:t>v1.7.10 or main</w:t>
+              <w:t>v1.7.11 or main</w:t>
             </w:r>
           </w:p>
         </w:tc>
@@ -535,7 +535,7 @@
           </w:tcPr>
           <w:p>
             <w:r>
-              <w:t>v1.7.10 or latest</w:t>
+              <w:t>v1.7.11 or latest</w:t>
             </w:r>
           </w:p>
         </w:tc>
@@ -1038,7 +1038,7 @@
           <w:sz w:val="17"/>
         </w:rPr>
         <w:br/>
-        <w:t>VERSION=v1.7.10 \</w:t>
+        <w:t>VERSION=v1.7.11 \</w:t>
       </w:r>
       <w:r>
         <w:rPr>
@@ -1047,7 +1047,7 @@
           <w:sz w:val="17"/>
         </w:rPr>
         <w:br/>
-        <w:t>ZTF_ORCHESTRATOR_VERSION=v1.7.10 \</w:t>
+        <w:t>ZTF_ORCHESTRATOR_VERSION=v1.7.11 \</w:t>
       </w:r>
       <w:r>
         <w:rPr>

</xml_diff>

<commit_message>
Fix FCA handoff labels and dashboard brand link
</commit_message>
<xml_diff>
--- a/docs/AHV-Appliance-Build-Guide.docx
+++ b/docs/AHV-Appliance-Build-Guide.docx
@@ -278,7 +278,7 @@
           </w:tcPr>
           <w:p>
             <w:r>
-              <w:t>v1.7.11</w:t>
+              <w:t>v1.7.12</w:t>
             </w:r>
           </w:p>
         </w:tc>
@@ -287,7 +287,7 @@
     <w:p/>
     <w:p>
       <w:r>
-        <w:t>Purpose. This guide describes how to build a portable ZTF-Orchestrator AHV appliance for connected staging or air-gapped Nutanix AHV environments. For this source tree, the current ZTF-Orchestrator release is v1.7.11. The current build process can bake the ZTF-Orchestrator application image, legacy ZeroTouch Framework v1.5.2, and NKP framework assets into the QCOW2 before transfer.</w:t>
+        <w:t>Purpose. This guide describes how to build a portable ZTF-Orchestrator AHV appliance for connected staging or air-gapped Nutanix AHV environments. For this source tree, the current ZTF-Orchestrator release is v1.7.12. The current build process can bake the ZTF-Orchestrator application image, legacy ZeroTouch Framework v1.5.2, and NKP framework assets into the QCOW2 before transfer.</w:t>
       </w:r>
     </w:p>
     <w:p>
@@ -482,7 +482,7 @@
           </w:tcPr>
           <w:p>
             <w:r>
-              <w:t>v1.7.11 or main</w:t>
+              <w:t>v1.7.12 or main</w:t>
             </w:r>
           </w:p>
         </w:tc>
@@ -535,7 +535,7 @@
           </w:tcPr>
           <w:p>
             <w:r>
-              <w:t>v1.7.11 or latest</w:t>
+              <w:t>v1.7.12 or latest</w:t>
             </w:r>
           </w:p>
         </w:tc>
@@ -1038,7 +1038,7 @@
           <w:sz w:val="17"/>
         </w:rPr>
         <w:br/>
-        <w:t>VERSION=v1.7.11 \</w:t>
+        <w:t>VERSION=v1.7.12 \</w:t>
       </w:r>
       <w:r>
         <w:rPr>
@@ -1047,7 +1047,7 @@
           <w:sz w:val="17"/>
         </w:rPr>
         <w:br/>
-        <w:t>ZTF_ORCHESTRATOR_VERSION=v1.7.11 \</w:t>
+        <w:t>ZTF_ORCHESTRATOR_VERSION=v1.7.12 \</w:t>
       </w:r>
       <w:r>
         <w:rPr>

</xml_diff>

<commit_message>
Release ZTF 2.x governed IaC preview
</commit_message>
<xml_diff>
--- a/docs/AHV-Appliance-Build-Guide.docx
+++ b/docs/AHV-Appliance-Build-Guide.docx
@@ -278,7 +278,7 @@
           </w:tcPr>
           <w:p>
             <w:r>
-              <w:t>v1.7.12</w:t>
+              <w:t>v1.8.0</w:t>
             </w:r>
           </w:p>
         </w:tc>
@@ -287,7 +287,7 @@
     <w:p/>
     <w:p>
       <w:r>
-        <w:t>Purpose. This guide describes how to build a portable ZTF-Orchestrator AHV appliance for connected staging or air-gapped Nutanix AHV environments. For this source tree, the current ZTF-Orchestrator release is v1.7.12. The current build process can bake the ZTF-Orchestrator application image, legacy ZeroTouch Framework v1.5.2, and NKP framework assets into the QCOW2 before transfer.</w:t>
+        <w:t>Purpose. This guide describes how to build a portable ZTF-Orchestrator AHV appliance for connected staging or air-gapped Nutanix AHV environments. For this source tree, the current ZTF-Orchestrator release is v1.8.0. The current build process can bake the ZTF-Orchestrator application image, legacy ZeroTouch Framework v1.5.2, and NKP framework assets into the QCOW2 before transfer.</w:t>
       </w:r>
     </w:p>
     <w:p>
@@ -482,7 +482,7 @@
           </w:tcPr>
           <w:p>
             <w:r>
-              <w:t>v1.7.12 or main</w:t>
+              <w:t>v1.8.0 or main</w:t>
             </w:r>
           </w:p>
         </w:tc>
@@ -535,7 +535,7 @@
           </w:tcPr>
           <w:p>
             <w:r>
-              <w:t>v1.7.12 or latest</w:t>
+              <w:t>v1.8.0 or latest</w:t>
             </w:r>
           </w:p>
         </w:tc>
@@ -1038,7 +1038,7 @@
           <w:sz w:val="17"/>
         </w:rPr>
         <w:br/>
-        <w:t>VERSION=v1.7.12 \</w:t>
+        <w:t>VERSION=v1.8.0 \</w:t>
       </w:r>
       <w:r>
         <w:rPr>
@@ -1047,7 +1047,7 @@
           <w:sz w:val="17"/>
         </w:rPr>
         <w:br/>
-        <w:t>ZTF_ORCHESTRATOR_VERSION=v1.7.12 \</w:t>
+        <w:t>ZTF_ORCHESTRATOR_VERSION=v1.8.0 \</w:t>
       </w:r>
       <w:r>
         <w:rPr>

</xml_diff>

<commit_message>
Release v1.8.0 ZTF 2.x governed IaC preview
Release v1.8.0 with separate governed ZTF 2.x IaC runtime support, split 1.x/2.x workflows and scripts, baked Docker/appliance runtimes, approval-bound apply/destroy controls, and aligned operator documentation.
</commit_message>
<xml_diff>
--- a/docs/AHV-Appliance-Build-Guide.docx
+++ b/docs/AHV-Appliance-Build-Guide.docx
@@ -278,7 +278,7 @@
           </w:tcPr>
           <w:p>
             <w:r>
-              <w:t>v1.7.12</w:t>
+              <w:t>v1.8.0</w:t>
             </w:r>
           </w:p>
         </w:tc>
@@ -287,7 +287,7 @@
     <w:p/>
     <w:p>
       <w:r>
-        <w:t>Purpose. This guide describes how to build a portable ZTF-Orchestrator AHV appliance for connected staging or air-gapped Nutanix AHV environments. For this source tree, the current ZTF-Orchestrator release is v1.7.12. The current build process can bake the ZTF-Orchestrator application image, legacy ZeroTouch Framework v1.5.2, and NKP framework assets into the QCOW2 before transfer.</w:t>
+        <w:t>Purpose. This guide describes how to build a portable ZTF-Orchestrator AHV appliance for connected staging or air-gapped Nutanix AHV environments. For this source tree, the current ZTF-Orchestrator release is v1.8.0. The current build process can bake the ZTF-Orchestrator application image, legacy ZeroTouch Framework v1.5.2, and NKP framework assets into the QCOW2 before transfer.</w:t>
       </w:r>
     </w:p>
     <w:p>
@@ -482,7 +482,7 @@
           </w:tcPr>
           <w:p>
             <w:r>
-              <w:t>v1.7.12 or main</w:t>
+              <w:t>v1.8.0 or main</w:t>
             </w:r>
           </w:p>
         </w:tc>
@@ -535,7 +535,7 @@
           </w:tcPr>
           <w:p>
             <w:r>
-              <w:t>v1.7.12 or latest</w:t>
+              <w:t>v1.8.0 or latest</w:t>
             </w:r>
           </w:p>
         </w:tc>
@@ -1038,7 +1038,7 @@
           <w:sz w:val="17"/>
         </w:rPr>
         <w:br/>
-        <w:t>VERSION=v1.7.12 \</w:t>
+        <w:t>VERSION=v1.8.0 \</w:t>
       </w:r>
       <w:r>
         <w:rPr>
@@ -1047,7 +1047,7 @@
           <w:sz w:val="17"/>
         </w:rPr>
         <w:br/>
-        <w:t>ZTF_ORCHESTRATOR_VERSION=v1.7.12 \</w:t>
+        <w:t>ZTF_ORCHESTRATOR_VERSION=v1.8.0 \</w:t>
       </w:r>
       <w:r>
         <w:rPr>

</xml_diff>

<commit_message>
Release v1.8.1 native foundation validation
</commit_message>
<xml_diff>
--- a/docs/AHV-Appliance-Build-Guide.docx
+++ b/docs/AHV-Appliance-Build-Guide.docx
@@ -1,2090 +1,2090 @@
 
 <file path=word/document.xml><?xml version="1.0" encoding="utf-8"?>
-<w:document xmlns:wpc="http://schemas.microsoft.com/office/word/2010/wordprocessingCanvas" xmlns:cx="http://schemas.microsoft.com/office/drawing/2014/chartex" xmlns:cx1="http://schemas.microsoft.com/office/drawing/2015/9/8/chartex" xmlns:cx2="http://schemas.microsoft.com/office/drawing/2015/10/21/chartex" xmlns:cx3="http://schemas.microsoft.com/office/drawing/2016/5/9/chartex" xmlns:cx4="http://schemas.microsoft.com/office/drawing/2016/5/10/chartex" xmlns:cx5="http://schemas.microsoft.com/office/drawing/2016/5/11/chartex" xmlns:cx6="http://schemas.microsoft.com/office/drawing/2016/5/12/chartex" xmlns:cx7="http://schemas.microsoft.com/office/drawing/2016/5/13/chartex" xmlns:cx8="http://schemas.microsoft.com/office/drawing/2016/5/14/chartex" xmlns:mc="http://schemas.openxmlformats.org/markup-compatibility/2006" xmlns:aink="http://schemas.microsoft.com/office/drawing/2016/ink" xmlns:am3d="http://schemas.microsoft.com/office/drawing/2017/model3d" xmlns:o="urn:schemas-microsoft-com:office:office" xmlns:oel="http://schemas.microsoft.com/office/2019/extlst" xmlns:r="http://schemas.openxmlformats.org/officeDocument/2006/relationships" xmlns:m="http://schemas.openxmlformats.org/officeDocument/2006/math" xmlns:v="urn:schemas-microsoft-com:vml" xmlns:wp14="http://schemas.microsoft.com/office/word/2010/wordprocessingDrawing" xmlns:wp="http://schemas.openxmlformats.org/drawingml/2006/wordprocessingDrawing" xmlns:w10="urn:schemas-microsoft-com:office:word" xmlns:w="http://schemas.openxmlformats.org/wordprocessingml/2006/main" xmlns:w14="http://schemas.microsoft.com/office/word/2010/wordml" xmlns:w15="http://schemas.microsoft.com/office/word/2012/wordml" xmlns:w16cex="http://schemas.microsoft.com/office/word/2018/wordml/cex" xmlns:w16cid="http://schemas.microsoft.com/office/word/2016/wordml/cid" xmlns:w16="http://schemas.microsoft.com/office/word/2018/wordml" xmlns:w16du="http://schemas.microsoft.com/office/word/2023/wordml/word16du" xmlns:w16sdtdh="http://schemas.microsoft.com/office/word/2020/wordml/sdtdatahash" xmlns:w16sdtfl="http://schemas.microsoft.com/office/word/2024/wordml/sdtformatlock" xmlns:w16se="http://schemas.microsoft.com/office/word/2015/wordml/symex" xmlns:wpg="http://schemas.microsoft.com/office/word/2010/wordprocessingGroup" xmlns:wpi="http://schemas.microsoft.com/office/word/2010/wordprocessingInk" xmlns:wne="http://schemas.microsoft.com/office/word/2006/wordml" xmlns:wps="http://schemas.microsoft.com/office/word/2010/wordprocessingShape" mc:Ignorable="w14 w15 w16se w16cid w16 w16cex w16sdtdh w16sdtfl w16du wp14">
-  <w:body>
-    <w:p>
-      <w:pPr>
-        <w:spacing w:after="60"/>
-      </w:pPr>
-      <w:r>
-        <w:rPr>
-          <w:b/>
-          <w:color w:val="0B2545"/>
-          <w:sz w:val="44"/>
-        </w:rPr>
-        <w:t>AHV Appliance Build Guide</w:t>
-      </w:r>
-    </w:p>
-    <w:p>
-      <w:r>
-        <w:rPr>
-          <w:color w:val="4B5563"/>
-        </w:rPr>
-        <w:t>ZTF-Orchestrator with baked ZeroTouch Framework and optional NKP framework and bundle preload</w:t>
-      </w:r>
-    </w:p>
-    <w:tbl>
-      <w:tblPr>
-        <w:tblStyle w:val="TableGrid"/>
-        <w:tblW w:w="9360" w:type="dxa"/>
-        <w:tblInd w:w="120" w:type="dxa"/>
-        <w:tblLayout w:type="fixed"/>
-        <w:tblLook w:val="04A0" w:firstRow="1" w:lastRow="0" w:firstColumn="1" w:lastColumn="0" w:noHBand="0" w:noVBand="1"/>
-      </w:tblPr>
-      <w:tblGrid>
-        <w:gridCol w:w="2600"/>
-        <w:gridCol w:w="6760"/>
-      </w:tblGrid>
-      <w:tr>
-        <w:tc>
-          <w:tcPr>
-            <w:tcW w:w="2600" w:type="dxa"/>
-            <w:shd w:val="clear" w:color="auto" w:fill="E8EEF5"/>
-            <w:tcMar>
-              <w:top w:w="80" w:type="dxa"/>
-              <w:left w:w="120" w:type="dxa"/>
-              <w:bottom w:w="80" w:type="dxa"/>
-              <w:right w:w="120" w:type="dxa"/>
-            </w:tcMar>
-            <w:vAlign w:val="center"/>
-          </w:tcPr>
-          <w:p>
-            <w:r>
-              <w:rPr>
-                <w:b/>
-                <w:color w:val="1F4D78"/>
-              </w:rPr>
-              <w:t>Field</w:t>
-            </w:r>
-          </w:p>
-        </w:tc>
-        <w:tc>
-          <w:tcPr>
-            <w:tcW w:w="6760" w:type="dxa"/>
-            <w:shd w:val="clear" w:color="auto" w:fill="E8EEF5"/>
-            <w:tcMar>
-              <w:top w:w="80" w:type="dxa"/>
-              <w:left w:w="120" w:type="dxa"/>
-              <w:bottom w:w="80" w:type="dxa"/>
-              <w:right w:w="120" w:type="dxa"/>
-            </w:tcMar>
-            <w:vAlign w:val="center"/>
-          </w:tcPr>
-          <w:p>
-            <w:r>
-              <w:rPr>
-                <w:b/>
-                <w:color w:val="1F4D78"/>
-              </w:rPr>
-              <w:t>Value</w:t>
-            </w:r>
-          </w:p>
-        </w:tc>
-      </w:tr>
-      <w:tr>
-        <w:tc>
-          <w:tcPr>
-            <w:tcW w:w="2600" w:type="dxa"/>
-            <w:tcMar>
-              <w:top w:w="80" w:type="dxa"/>
-              <w:left w:w="120" w:type="dxa"/>
-              <w:bottom w:w="80" w:type="dxa"/>
-              <w:right w:w="120" w:type="dxa"/>
-            </w:tcMar>
-            <w:vAlign w:val="center"/>
-          </w:tcPr>
-          <w:p>
-            <w:r>
-              <w:t>Repository</w:t>
-            </w:r>
-          </w:p>
-        </w:tc>
-        <w:tc>
-          <w:tcPr>
-            <w:tcW w:w="6760" w:type="dxa"/>
-            <w:tcMar>
-              <w:top w:w="80" w:type="dxa"/>
-              <w:left w:w="120" w:type="dxa"/>
-              <w:bottom w:w="80" w:type="dxa"/>
-              <w:right w:w="120" w:type="dxa"/>
-            </w:tcMar>
-            <w:vAlign w:val="center"/>
-          </w:tcPr>
-          <w:p>
-            <w:r>
-              <w:t>VirtuArchitect/ZTF-Orchestrator</w:t>
-            </w:r>
-          </w:p>
-        </w:tc>
-      </w:tr>
-      <w:tr>
-        <w:tc>
-          <w:tcPr>
-            <w:tcW w:w="2600" w:type="dxa"/>
-            <w:tcMar>
-              <w:top w:w="80" w:type="dxa"/>
-              <w:left w:w="120" w:type="dxa"/>
-              <w:bottom w:w="80" w:type="dxa"/>
-              <w:right w:w="120" w:type="dxa"/>
-            </w:tcMar>
-            <w:vAlign w:val="center"/>
-          </w:tcPr>
-          <w:p>
-            <w:r>
-              <w:t>Primary artifact</w:t>
-            </w:r>
-          </w:p>
-        </w:tc>
-        <w:tc>
-          <w:tcPr>
-            <w:tcW w:w="6760" w:type="dxa"/>
-            <w:tcMar>
-              <w:top w:w="80" w:type="dxa"/>
-              <w:left w:w="120" w:type="dxa"/>
-              <w:bottom w:w="80" w:type="dxa"/>
-              <w:right w:w="120" w:type="dxa"/>
-            </w:tcMar>
-            <w:vAlign w:val="center"/>
-          </w:tcPr>
-          <w:p>
-            <w:r>
-              <w:t>AHV-importable QCOW2 appliance</w:t>
-            </w:r>
-          </w:p>
-        </w:tc>
-      </w:tr>
-      <w:tr>
-        <w:tc>
-          <w:tcPr>
-            <w:tcW w:w="2600" w:type="dxa"/>
-            <w:tcMar>
-              <w:top w:w="80" w:type="dxa"/>
-              <w:left w:w="120" w:type="dxa"/>
-              <w:bottom w:w="80" w:type="dxa"/>
-              <w:right w:w="120" w:type="dxa"/>
-            </w:tcMar>
-            <w:vAlign w:val="center"/>
-          </w:tcPr>
-          <w:p>
-            <w:r>
-              <w:t>ZTF framework baked into app image</w:t>
-            </w:r>
-          </w:p>
-        </w:tc>
-        <w:tc>
-          <w:tcPr>
-            <w:tcW w:w="6760" w:type="dxa"/>
-            <w:tcMar>
-              <w:top w:w="80" w:type="dxa"/>
-              <w:left w:w="120" w:type="dxa"/>
-              <w:bottom w:w="80" w:type="dxa"/>
-              <w:right w:w="120" w:type="dxa"/>
-            </w:tcMar>
-            <w:vAlign w:val="center"/>
-          </w:tcPr>
-          <w:p>
-            <w:r>
-              <w:t>/opt/zerotouch-framework</w:t>
-            </w:r>
-          </w:p>
-        </w:tc>
-      </w:tr>
-      <w:tr>
-        <w:tc>
-          <w:tcPr>
-            <w:tcW w:w="2600" w:type="dxa"/>
-            <w:tcMar>
-              <w:top w:w="80" w:type="dxa"/>
-              <w:left w:w="120" w:type="dxa"/>
-              <w:bottom w:w="80" w:type="dxa"/>
-              <w:right w:w="120" w:type="dxa"/>
-            </w:tcMar>
-            <w:vAlign w:val="center"/>
-          </w:tcPr>
-          <w:p>
-            <w:r>
-              <w:t>NKP framework container path</w:t>
-            </w:r>
-          </w:p>
-        </w:tc>
-        <w:tc>
-          <w:tcPr>
-            <w:tcW w:w="6760" w:type="dxa"/>
-            <w:tcMar>
-              <w:top w:w="80" w:type="dxa"/>
-              <w:left w:w="120" w:type="dxa"/>
-              <w:bottom w:w="80" w:type="dxa"/>
-              <w:right w:w="120" w:type="dxa"/>
-            </w:tcMar>
-            <w:vAlign w:val="center"/>
-          </w:tcPr>
-          <w:p>
-            <w:r>
-              <w:t>/var/lib/ztf-orchestrator/nkp-zerotouch-framework</w:t>
-            </w:r>
-          </w:p>
-        </w:tc>
-      </w:tr>
-      <w:tr>
-        <w:tc>
-          <w:tcPr>
-            <w:tcW w:w="2600" w:type="dxa"/>
-            <w:tcMar>
-              <w:top w:w="80" w:type="dxa"/>
-              <w:left w:w="120" w:type="dxa"/>
-              <w:bottom w:w="80" w:type="dxa"/>
-              <w:right w:w="120" w:type="dxa"/>
-            </w:tcMar>
-            <w:vAlign w:val="center"/>
-          </w:tcPr>
-          <w:p>
-            <w:r>
-              <w:t>NKP bundle container path</w:t>
-            </w:r>
-          </w:p>
-        </w:tc>
-        <w:tc>
-          <w:tcPr>
-            <w:tcW w:w="6760" w:type="dxa"/>
-            <w:tcMar>
-              <w:top w:w="80" w:type="dxa"/>
-              <w:left w:w="120" w:type="dxa"/>
-              <w:bottom w:w="80" w:type="dxa"/>
-              <w:right w:w="120" w:type="dxa"/>
-            </w:tcMar>
-            <w:vAlign w:val="center"/>
-          </w:tcPr>
-          <w:p>
-            <w:r>
-              <w:t>/var/lib/ztf-orchestrator/bundles</w:t>
-            </w:r>
-          </w:p>
-        </w:tc>
-      </w:tr>
-      <w:tr>
-        <w:tc>
-          <w:tcPr>
-            <w:tcW w:type="dxa" w:w="2600"/>
-          </w:tcPr>
-          <w:p>
-            <w:r>
-              <w:t>Current ZTF-Orchestrator release</w:t>
-            </w:r>
-          </w:p>
-        </w:tc>
-        <w:tc>
-          <w:tcPr>
-            <w:tcW w:type="dxa" w:w="6760"/>
-          </w:tcPr>
-          <w:p>
-            <w:r>
-              <w:t>v1.8.0</w:t>
-            </w:r>
-          </w:p>
-        </w:tc>
-      </w:tr>
-    </w:tbl>
-    <w:p/>
-    <w:p>
-      <w:r>
-        <w:t>Purpose. This guide describes how to build a portable ZTF-Orchestrator AHV appliance for connected staging or air-gapped Nutanix AHV environments. For this source tree, the current ZTF-Orchestrator release is v1.8.0. The current build process can bake the ZTF-Orchestrator application image, legacy ZeroTouch Framework v1.5.2, and NKP framework assets into the QCOW2 before transfer.</w:t>
-      </w:r>
-    </w:p>
-    <w:p>
-      <w:pPr>
-        <w:pStyle w:val="Heading1"/>
-      </w:pPr>
-      <w:r>
-        <w:t>Build Host Requirements</w:t>
-      </w:r>
-    </w:p>
-    <w:p>
-      <w:pPr>
-        <w:pStyle w:val="ListBullet"/>
-        <w:spacing w:after="80"/>
-        <w:ind w:left="540" w:hanging="271"/>
-      </w:pPr>
-      <w:r>
-        <w:t>Use a connected Linux build host or GitHub Actions for the actual QCOW2 build.</w:t>
-      </w:r>
-    </w:p>
-    <w:p>
-      <w:pPr>
-        <w:pStyle w:val="ListBullet"/>
-        <w:spacing w:after="80"/>
-        <w:ind w:left="540" w:hanging="271"/>
-      </w:pPr>
-      <w:r>
-        <w:t>Install Git, QEMU, qemu-utils, and HashiCorp Packer on local Linux build hosts.</w:t>
-      </w:r>
-    </w:p>
-    <w:p>
-      <w:pPr>
-        <w:pStyle w:val="ListBullet"/>
-        <w:spacing w:after="80"/>
-        <w:ind w:left="540" w:hanging="271"/>
-      </w:pPr>
-      <w:r>
-        <w:t>Ensure outbound access to Ubuntu cloud images, GitHub, the ZeroTouch Framework repository, and the NKP framework repository when NKP bake-in is enabled.</w:t>
-      </w:r>
-    </w:p>
-    <w:p>
-      <w:pPr>
-        <w:pStyle w:val="ListBullet"/>
-        <w:spacing w:after="80"/>
-        <w:ind w:left="540" w:hanging="271"/>
-      </w:pPr>
-      <w:r>
-        <w:t>For air-gapped handoff, use an approved media or artifact transfer process for the finished QCOW2 and SHA256SUMS file.</w:t>
-      </w:r>
-    </w:p>
-    <w:p>
-      <w:pPr>
-        <w:shd w:val="clear" w:color="auto" w:fill="F2F4F7"/>
-        <w:spacing w:before="40"/>
-        <w:ind w:left="216"/>
-      </w:pPr>
-      <w:r>
-        <w:rPr>
-          <w:rFonts w:ascii="Consolas" w:hAnsi="Consolas"/>
-          <w:color w:val="111827"/>
-          <w:sz w:val="17"/>
-        </w:rPr>
-        <w:t>sudo apt-get update</w:t>
-      </w:r>
-      <w:r>
-        <w:rPr>
-          <w:rFonts w:ascii="Consolas" w:hAnsi="Consolas"/>
-          <w:color w:val="111827"/>
-          <w:sz w:val="17"/>
-        </w:rPr>
-        <w:br/>
-        <w:t>sudo apt-get install -y git qemu-system-x86 qemu-utils packer</w:t>
-      </w:r>
-    </w:p>
-    <w:p>
-      <w:pPr>
-        <w:pStyle w:val="Heading1"/>
-      </w:pPr>
-      <w:r>
-        <w:t>Build Variables</w:t>
-      </w:r>
-    </w:p>
-    <w:tbl>
-      <w:tblPr>
-        <w:tblStyle w:val="TableGrid"/>
-        <w:tblW w:w="9360" w:type="dxa"/>
-        <w:tblInd w:w="120" w:type="dxa"/>
-        <w:tblLayout w:type="fixed"/>
-        <w:tblLook w:val="04A0" w:firstRow="1" w:lastRow="0" w:firstColumn="1" w:lastColumn="0" w:noHBand="0" w:noVBand="1"/>
-      </w:tblPr>
-      <w:tblGrid>
-        <w:gridCol w:w="2100"/>
-        <w:gridCol w:w="2300"/>
-        <w:gridCol w:w="4960"/>
-      </w:tblGrid>
-      <w:tr>
-        <w:tc>
-          <w:tcPr>
-            <w:tcW w:w="2100" w:type="dxa"/>
-            <w:shd w:val="clear" w:color="auto" w:fill="E8EEF5"/>
-            <w:tcMar>
-              <w:top w:w="80" w:type="dxa"/>
-              <w:left w:w="120" w:type="dxa"/>
-              <w:bottom w:w="80" w:type="dxa"/>
-              <w:right w:w="120" w:type="dxa"/>
-            </w:tcMar>
-            <w:vAlign w:val="center"/>
-          </w:tcPr>
-          <w:p>
-            <w:r>
-              <w:rPr>
-                <w:b/>
-                <w:color w:val="1F4D78"/>
-              </w:rPr>
-              <w:t>Variable</w:t>
-            </w:r>
-          </w:p>
-        </w:tc>
-        <w:tc>
-          <w:tcPr>
-            <w:tcW w:w="2300" w:type="dxa"/>
-            <w:shd w:val="clear" w:color="auto" w:fill="E8EEF5"/>
-            <w:tcMar>
-              <w:top w:w="80" w:type="dxa"/>
-              <w:left w:w="120" w:type="dxa"/>
-              <w:bottom w:w="80" w:type="dxa"/>
-              <w:right w:w="120" w:type="dxa"/>
-            </w:tcMar>
-            <w:vAlign w:val="center"/>
-          </w:tcPr>
-          <w:p>
-            <w:r>
-              <w:rPr>
-                <w:b/>
-                <w:color w:val="1F4D78"/>
-              </w:rPr>
-              <w:t>Default / Example</w:t>
-            </w:r>
-          </w:p>
-        </w:tc>
-        <w:tc>
-          <w:tcPr>
-            <w:tcW w:w="4960" w:type="dxa"/>
-            <w:shd w:val="clear" w:color="auto" w:fill="E8EEF5"/>
-            <w:tcMar>
-              <w:top w:w="80" w:type="dxa"/>
-              <w:left w:w="120" w:type="dxa"/>
-              <w:bottom w:w="80" w:type="dxa"/>
-              <w:right w:w="120" w:type="dxa"/>
-            </w:tcMar>
-            <w:vAlign w:val="center"/>
-          </w:tcPr>
-          <w:p>
-            <w:r>
-              <w:rPr>
-                <w:b/>
-                <w:color w:val="1F4D78"/>
-              </w:rPr>
-              <w:t>Purpose</w:t>
-            </w:r>
-          </w:p>
-        </w:tc>
-      </w:tr>
-      <w:tr>
-        <w:tc>
-          <w:tcPr>
-            <w:tcW w:w="2100" w:type="dxa"/>
-            <w:tcMar>
-              <w:top w:w="80" w:type="dxa"/>
-              <w:left w:w="120" w:type="dxa"/>
-              <w:bottom w:w="80" w:type="dxa"/>
-              <w:right w:w="120" w:type="dxa"/>
-            </w:tcMar>
-            <w:vAlign w:val="center"/>
-          </w:tcPr>
-          <w:p>
-            <w:r>
-              <w:t>VERSION</w:t>
-            </w:r>
-          </w:p>
-        </w:tc>
-        <w:tc>
-          <w:tcPr>
-            <w:tcW w:w="2300" w:type="dxa"/>
-            <w:tcMar>
-              <w:top w:w="80" w:type="dxa"/>
-              <w:left w:w="120" w:type="dxa"/>
-              <w:bottom w:w="80" w:type="dxa"/>
-              <w:right w:w="120" w:type="dxa"/>
-            </w:tcMar>
-            <w:vAlign w:val="center"/>
-          </w:tcPr>
-          <w:p>
-            <w:r>
-              <w:t>v1.8.0 or main</w:t>
-            </w:r>
-          </w:p>
-        </w:tc>
-        <w:tc>
-          <w:tcPr>
-            <w:tcW w:w="4960" w:type="dxa"/>
-            <w:tcMar>
-              <w:top w:w="80" w:type="dxa"/>
-              <w:left w:w="120" w:type="dxa"/>
-              <w:bottom w:w="80" w:type="dxa"/>
-              <w:right w:w="120" w:type="dxa"/>
-            </w:tcMar>
-            <w:vAlign w:val="center"/>
-          </w:tcPr>
-          <w:p>
-            <w:r>
-              <w:t>Git ref staged into the appliance source checkout.</w:t>
-            </w:r>
-          </w:p>
-        </w:tc>
-      </w:tr>
-      <w:tr>
-        <w:tc>
-          <w:tcPr>
-            <w:tcW w:w="2100" w:type="dxa"/>
-            <w:tcMar>
-              <w:top w:w="80" w:type="dxa"/>
-              <w:left w:w="120" w:type="dxa"/>
-              <w:bottom w:w="80" w:type="dxa"/>
-              <w:right w:w="120" w:type="dxa"/>
-            </w:tcMar>
-            <w:vAlign w:val="center"/>
-          </w:tcPr>
-          <w:p>
-            <w:r>
-              <w:t>ZTF_ORCHESTRATOR_VERSION</w:t>
-            </w:r>
-          </w:p>
-        </w:tc>
-        <w:tc>
-          <w:tcPr>
-            <w:tcW w:w="2300" w:type="dxa"/>
-            <w:tcMar>
-              <w:top w:w="80" w:type="dxa"/>
-              <w:left w:w="120" w:type="dxa"/>
-              <w:bottom w:w="80" w:type="dxa"/>
-              <w:right w:w="120" w:type="dxa"/>
-            </w:tcMar>
-            <w:vAlign w:val="center"/>
-          </w:tcPr>
-          <w:p>
-            <w:r>
-              <w:t>v1.8.0 or latest</w:t>
-            </w:r>
-          </w:p>
-        </w:tc>
-        <w:tc>
-          <w:tcPr>
-            <w:tcW w:w="4960" w:type="dxa"/>
-            <w:tcMar>
-              <w:top w:w="80" w:type="dxa"/>
-              <w:left w:w="120" w:type="dxa"/>
-              <w:bottom w:w="80" w:type="dxa"/>
-              <w:right w:w="120" w:type="dxa"/>
-            </w:tcMar>
-            <w:vAlign w:val="center"/>
-          </w:tcPr>
-          <w:p>
-            <w:r>
-              <w:t>Container tag the appliance runs.</w:t>
-            </w:r>
-          </w:p>
-        </w:tc>
-      </w:tr>
-      <w:tr>
-        <w:tc>
-          <w:tcPr>
-            <w:tcW w:w="2100" w:type="dxa"/>
-            <w:tcMar>
-              <w:top w:w="80" w:type="dxa"/>
-              <w:left w:w="120" w:type="dxa"/>
-              <w:bottom w:w="80" w:type="dxa"/>
-              <w:right w:w="120" w:type="dxa"/>
-            </w:tcMar>
-            <w:vAlign w:val="center"/>
-          </w:tcPr>
-          <w:p>
-            <w:r>
-              <w:t>ZTF_BUILD_CONTAINER_IMAGE</w:t>
-            </w:r>
-          </w:p>
-        </w:tc>
-        <w:tc>
-          <w:tcPr>
-            <w:tcW w:w="2300" w:type="dxa"/>
-            <w:tcMar>
-              <w:top w:w="80" w:type="dxa"/>
-              <w:left w:w="120" w:type="dxa"/>
-              <w:bottom w:w="80" w:type="dxa"/>
-              <w:right w:w="120" w:type="dxa"/>
-            </w:tcMar>
-            <w:vAlign w:val="center"/>
-          </w:tcPr>
-          <w:p>
-            <w:r>
-              <w:t>true</w:t>
-            </w:r>
-          </w:p>
-        </w:tc>
-        <w:tc>
-          <w:tcPr>
-            <w:tcW w:w="4960" w:type="dxa"/>
-            <w:tcMar>
-              <w:top w:w="80" w:type="dxa"/>
-              <w:left w:w="120" w:type="dxa"/>
-              <w:bottom w:w="80" w:type="dxa"/>
-              <w:right w:w="120" w:type="dxa"/>
-            </w:tcMar>
-            <w:vAlign w:val="center"/>
-          </w:tcPr>
-          <w:p>
-            <w:r>
-              <w:t>Builds the app image inside the QCOW2.</w:t>
-            </w:r>
-          </w:p>
-        </w:tc>
-      </w:tr>
-      <w:tr>
-        <w:tc>
-          <w:tcPr>
-            <w:tcW w:w="2100" w:type="dxa"/>
-            <w:tcMar>
-              <w:top w:w="80" w:type="dxa"/>
-              <w:left w:w="120" w:type="dxa"/>
-              <w:bottom w:w="80" w:type="dxa"/>
-              <w:right w:w="120" w:type="dxa"/>
-            </w:tcMar>
-            <w:vAlign w:val="center"/>
-          </w:tcPr>
-          <w:p>
-            <w:r>
-              <w:t>ZTF_FRAMEWORK_REF</w:t>
-            </w:r>
-          </w:p>
-        </w:tc>
-        <w:tc>
-          <w:tcPr>
-            <w:tcW w:w="2300" w:type="dxa"/>
-            <w:tcMar>
-              <w:top w:w="80" w:type="dxa"/>
-              <w:left w:w="120" w:type="dxa"/>
-              <w:bottom w:w="80" w:type="dxa"/>
-              <w:right w:w="120" w:type="dxa"/>
-            </w:tcMar>
-            <w:vAlign w:val="center"/>
-          </w:tcPr>
-          <w:p>
-            <w:r>
-              <w:t>v1.5.2</w:t>
-            </w:r>
-          </w:p>
-        </w:tc>
-        <w:tc>
-          <w:tcPr>
-            <w:tcW w:w="4960" w:type="dxa"/>
-            <w:tcMar>
-              <w:top w:w="80" w:type="dxa"/>
-              <w:left w:w="120" w:type="dxa"/>
-              <w:bottom w:w="80" w:type="dxa"/>
-              <w:right w:w="120" w:type="dxa"/>
-            </w:tcMar>
-            <w:vAlign w:val="center"/>
-          </w:tcPr>
-          <w:p>
-            <w:r>
-              <w:t>Legacy ZeroTouch Framework ref baked into the app image.</w:t>
-            </w:r>
-          </w:p>
-        </w:tc>
-      </w:tr>
-      <w:tr>
-        <w:tc>
-          <w:tcPr>
-            <w:tcW w:w="2100" w:type="dxa"/>
-            <w:tcMar>
-              <w:top w:w="80" w:type="dxa"/>
-              <w:left w:w="120" w:type="dxa"/>
-              <w:bottom w:w="80" w:type="dxa"/>
-              <w:right w:w="120" w:type="dxa"/>
-            </w:tcMar>
-            <w:vAlign w:val="center"/>
-          </w:tcPr>
-          <w:p>
-            <w:r>
-              <w:t>ZTF_BAKE_NKP_FRAMEWORK</w:t>
-            </w:r>
-          </w:p>
-        </w:tc>
-        <w:tc>
-          <w:tcPr>
-            <w:tcW w:w="2300" w:type="dxa"/>
-            <w:tcMar>
-              <w:top w:w="80" w:type="dxa"/>
-              <w:left w:w="120" w:type="dxa"/>
-              <w:bottom w:w="80" w:type="dxa"/>
-              <w:right w:w="120" w:type="dxa"/>
-            </w:tcMar>
-            <w:vAlign w:val="center"/>
-          </w:tcPr>
-          <w:p>
-            <w:r>
-              <w:t>true</w:t>
-            </w:r>
-          </w:p>
-        </w:tc>
-        <w:tc>
-          <w:tcPr>
-            <w:tcW w:w="4960" w:type="dxa"/>
-            <w:tcMar>
-              <w:top w:w="80" w:type="dxa"/>
-              <w:left w:w="120" w:type="dxa"/>
-              <w:bottom w:w="80" w:type="dxa"/>
-              <w:right w:w="120" w:type="dxa"/>
-            </w:tcMar>
-            <w:vAlign w:val="center"/>
-          </w:tcPr>
-          <w:p>
-            <w:r>
-              <w:t>Clones or copies the NKP framework into the appliance.</w:t>
-            </w:r>
-          </w:p>
-        </w:tc>
-      </w:tr>
-      <w:tr>
-        <w:tc>
-          <w:tcPr>
-            <w:tcW w:w="2100" w:type="dxa"/>
-            <w:tcMar>
-              <w:top w:w="80" w:type="dxa"/>
-              <w:left w:w="120" w:type="dxa"/>
-              <w:bottom w:w="80" w:type="dxa"/>
-              <w:right w:w="120" w:type="dxa"/>
-            </w:tcMar>
-            <w:vAlign w:val="center"/>
-          </w:tcPr>
-          <w:p>
-            <w:r>
-              <w:t>ZTF_NKP_FRAMEWORK_REF</w:t>
-            </w:r>
-          </w:p>
-        </w:tc>
-        <w:tc>
-          <w:tcPr>
-            <w:tcW w:w="2300" w:type="dxa"/>
-            <w:tcMar>
-              <w:top w:w="80" w:type="dxa"/>
-              <w:left w:w="120" w:type="dxa"/>
-              <w:bottom w:w="80" w:type="dxa"/>
-              <w:right w:w="120" w:type="dxa"/>
-            </w:tcMar>
-            <w:vAlign w:val="center"/>
-          </w:tcPr>
-          <w:p>
-            <w:r>
-              <w:t>main</w:t>
-            </w:r>
-          </w:p>
-        </w:tc>
-        <w:tc>
-          <w:tcPr>
-            <w:tcW w:w="4960" w:type="dxa"/>
-            <w:tcMar>
-              <w:top w:w="80" w:type="dxa"/>
-              <w:left w:w="120" w:type="dxa"/>
-              <w:bottom w:w="80" w:type="dxa"/>
-              <w:right w:w="120" w:type="dxa"/>
-            </w:tcMar>
-            <w:vAlign w:val="center"/>
-          </w:tcPr>
-          <w:p>
-            <w:r>
-              <w:t>NKP framework ref to bake.</w:t>
-            </w:r>
-          </w:p>
-        </w:tc>
-      </w:tr>
-      <w:tr>
-        <w:tc>
-          <w:tcPr>
-            <w:tcW w:w="2100" w:type="dxa"/>
-            <w:tcMar>
-              <w:top w:w="80" w:type="dxa"/>
-              <w:left w:w="120" w:type="dxa"/>
-              <w:bottom w:w="80" w:type="dxa"/>
-              <w:right w:w="120" w:type="dxa"/>
-            </w:tcMar>
-            <w:vAlign w:val="center"/>
-          </w:tcPr>
-          <w:p>
-            <w:r>
-              <w:t>ZTF_NKP_BUNDLE_URLS</w:t>
-            </w:r>
-          </w:p>
-        </w:tc>
-        <w:tc>
-          <w:tcPr>
-            <w:tcW w:w="2300" w:type="dxa"/>
-            <w:tcMar>
-              <w:top w:w="80" w:type="dxa"/>
-              <w:left w:w="120" w:type="dxa"/>
-              <w:bottom w:w="80" w:type="dxa"/>
-              <w:right w:w="120" w:type="dxa"/>
-            </w:tcMar>
-            <w:vAlign w:val="center"/>
-          </w:tcPr>
-          <w:p>
-            <w:r>
-              <w:t>comma-separated URLs</w:t>
-            </w:r>
-          </w:p>
-        </w:tc>
-        <w:tc>
-          <w:tcPr>
-            <w:tcW w:w="4960" w:type="dxa"/>
-            <w:tcMar>
-              <w:top w:w="80" w:type="dxa"/>
-              <w:left w:w="120" w:type="dxa"/>
-              <w:bottom w:w="80" w:type="dxa"/>
-              <w:right w:w="120" w:type="dxa"/>
-            </w:tcMar>
-            <w:vAlign w:val="center"/>
-          </w:tcPr>
-          <w:p>
-            <w:r>
-              <w:t>Optional bundle downloads during connected staging builds.</w:t>
-            </w:r>
-          </w:p>
-        </w:tc>
-      </w:tr>
-      <w:tr>
-        <w:tc>
-          <w:tcPr>
-            <w:tcW w:w="2100" w:type="dxa"/>
-            <w:tcMar>
-              <w:top w:w="80" w:type="dxa"/>
-              <w:left w:w="120" w:type="dxa"/>
-              <w:bottom w:w="80" w:type="dxa"/>
-              <w:right w:w="120" w:type="dxa"/>
-            </w:tcMar>
-            <w:vAlign w:val="center"/>
-          </w:tcPr>
-          <w:p>
-            <w:r>
-              <w:t>QEMU_ACCELERATOR</w:t>
-            </w:r>
-          </w:p>
-        </w:tc>
-        <w:tc>
-          <w:tcPr>
-            <w:tcW w:w="2300" w:type="dxa"/>
-            <w:tcMar>
-              <w:top w:w="80" w:type="dxa"/>
-              <w:left w:w="120" w:type="dxa"/>
-              <w:bottom w:w="80" w:type="dxa"/>
-              <w:right w:w="120" w:type="dxa"/>
-            </w:tcMar>
-            <w:vAlign w:val="center"/>
-          </w:tcPr>
-          <w:p>
-            <w:r>
-              <w:t>kvm or tcg</w:t>
-            </w:r>
-          </w:p>
-        </w:tc>
-        <w:tc>
-          <w:tcPr>
-            <w:tcW w:w="4960" w:type="dxa"/>
-            <w:tcMar>
-              <w:top w:w="80" w:type="dxa"/>
-              <w:left w:w="120" w:type="dxa"/>
-              <w:bottom w:w="80" w:type="dxa"/>
-              <w:right w:w="120" w:type="dxa"/>
-            </w:tcMar>
-            <w:vAlign w:val="center"/>
-          </w:tcPr>
-          <w:p>
-            <w:r>
-              <w:t>Use kvm on Linux hosts with virtualization; use tcg otherwise.</w:t>
-            </w:r>
-          </w:p>
-        </w:tc>
-      </w:tr>
-    </w:tbl>
-    <w:p/>
-    <w:p>
-      <w:pPr>
-        <w:pStyle w:val="Heading1"/>
-      </w:pPr>
-      <w:r>
-        <w:t>Step-by-Step Local Build</w:t>
-      </w:r>
-    </w:p>
-    <w:p>
-      <w:pPr>
-        <w:pStyle w:val="ListNumber"/>
-        <w:spacing w:after="80"/>
-        <w:ind w:left="540" w:hanging="271"/>
-      </w:pPr>
-      <w:r>
-        <w:t>Clone the repository on a connected Linux build host.</w:t>
-      </w:r>
-    </w:p>
-    <w:p>
-      <w:pPr>
-        <w:pStyle w:val="ListNumber"/>
-        <w:spacing w:after="80"/>
-        <w:ind w:left="540" w:hanging="271"/>
-      </w:pPr>
-      <w:r>
-        <w:t>Optionally stage local NKP bundle artifacts before running Packer.</w:t>
-      </w:r>
-    </w:p>
-    <w:p>
-      <w:pPr>
-        <w:pStyle w:val="ListNumber"/>
-        <w:spacing w:after="80"/>
-        <w:ind w:left="540" w:hanging="271"/>
-      </w:pPr>
-      <w:r>
-        <w:t>Optionally stage a reviewed local NKP framework checkout if you do not want Packer to clone it from Git.</w:t>
-      </w:r>
-    </w:p>
-    <w:p>
-      <w:pPr>
-        <w:pStyle w:val="ListNumber"/>
-        <w:spacing w:after="80"/>
-        <w:ind w:left="540" w:hanging="271"/>
-      </w:pPr>
-      <w:r>
-        <w:t>Run the AHV QCOW2 build wrapper with ZTF and NKP bake-in enabled.</w:t>
-      </w:r>
-    </w:p>
-    <w:p>
-      <w:pPr>
-        <w:pStyle w:val="ListNumber"/>
-        <w:spacing w:after="80"/>
-        <w:ind w:left="540" w:hanging="271"/>
-      </w:pPr>
-      <w:r>
-        <w:t>Verify the generated SHA256SUMS file.</w:t>
-      </w:r>
-    </w:p>
-    <w:p>
-      <w:pPr>
-        <w:pStyle w:val="ListNumber"/>
-        <w:spacing w:after="80"/>
-        <w:ind w:left="540" w:hanging="271"/>
-      </w:pPr>
-      <w:r>
-        <w:t>Transfer the QCOW2 and checksum to the target AHV environment.</w:t>
-      </w:r>
-    </w:p>
-    <w:p>
-      <w:pPr>
-        <w:shd w:val="clear" w:color="auto" w:fill="F2F4F7"/>
-        <w:spacing w:before="40"/>
-        <w:ind w:left="216"/>
-      </w:pPr>
-      <w:r>
-        <w:rPr>
-          <w:rFonts w:ascii="Consolas" w:hAnsi="Consolas"/>
-          <w:color w:val="111827"/>
-          <w:sz w:val="17"/>
-        </w:rPr>
-        <w:t>git clone https://github.com/VirtuArchitect/ZTF-Orchestrator.git</w:t>
-      </w:r>
-      <w:r>
-        <w:rPr>
-          <w:rFonts w:ascii="Consolas" w:hAnsi="Consolas"/>
-          <w:color w:val="111827"/>
-          <w:sz w:val="17"/>
-        </w:rPr>
-        <w:br/>
-        <w:t>cd ZTF-Orchestrator</w:t>
-      </w:r>
-    </w:p>
-    <w:p>
-      <w:pPr>
-        <w:shd w:val="clear" w:color="auto" w:fill="F2F4F7"/>
-        <w:spacing w:before="40"/>
-        <w:ind w:left="216"/>
-      </w:pPr>
-      <w:r>
-        <w:rPr>
-          <w:rFonts w:ascii="Consolas" w:hAnsi="Consolas"/>
-          <w:color w:val="111827"/>
-          <w:sz w:val="17"/>
-        </w:rPr>
-        <w:t># Optional local bundle staging before build</w:t>
-      </w:r>
-      <w:r>
-        <w:rPr>
-          <w:rFonts w:ascii="Consolas" w:hAnsi="Consolas"/>
-          <w:color w:val="111827"/>
-          <w:sz w:val="17"/>
-        </w:rPr>
-        <w:br/>
-        <w:t>cp /path/to/nkp-bundle-or-binary appliance/preload/bundles/</w:t>
-      </w:r>
-    </w:p>
-    <w:p>
-      <w:pPr>
-        <w:shd w:val="clear" w:color="auto" w:fill="F2F4F7"/>
-        <w:spacing w:before="40"/>
-        <w:ind w:left="216"/>
-      </w:pPr>
-      <w:r>
-        <w:rPr>
-          <w:rFonts w:ascii="Consolas" w:hAnsi="Consolas"/>
-          <w:color w:val="111827"/>
-          <w:sz w:val="17"/>
-        </w:rPr>
-        <w:t># Optional local NKP framework staging before build</w:t>
-      </w:r>
-      <w:r>
-        <w:rPr>
-          <w:rFonts w:ascii="Consolas" w:hAnsi="Consolas"/>
-          <w:color w:val="111827"/>
-          <w:sz w:val="17"/>
-        </w:rPr>
-        <w:br/>
-        <w:t>rsync -a /path/to/nkp-zerotouch-framework/ appliance/preload/nkp-zerotouch-framework/</w:t>
-      </w:r>
-    </w:p>
-    <w:p>
-      <w:pPr>
-        <w:shd w:val="clear" w:color="auto" w:fill="F2F4F7"/>
-        <w:spacing w:before="40"/>
-        <w:ind w:left="216"/>
-      </w:pPr>
-      <w:r>
-        <w:rPr>
-          <w:rFonts w:ascii="Consolas" w:hAnsi="Consolas"/>
-          <w:color w:val="111827"/>
-          <w:sz w:val="17"/>
-        </w:rPr>
-        <w:t>cd appliance</w:t>
-      </w:r>
-      <w:r>
-        <w:rPr>
-          <w:rFonts w:ascii="Consolas" w:hAnsi="Consolas"/>
-          <w:color w:val="111827"/>
-          <w:sz w:val="17"/>
-        </w:rPr>
-        <w:br/>
-        <w:t>VERSION=v1.8.0 \</w:t>
-      </w:r>
-      <w:r>
-        <w:rPr>
-          <w:rFonts w:ascii="Consolas" w:hAnsi="Consolas"/>
-          <w:color w:val="111827"/>
-          <w:sz w:val="17"/>
-        </w:rPr>
-        <w:br/>
-        <w:t>ZTF_ORCHESTRATOR_VERSION=v1.8.0 \</w:t>
-      </w:r>
-      <w:r>
-        <w:rPr>
-          <w:rFonts w:ascii="Consolas" w:hAnsi="Consolas"/>
-          <w:color w:val="111827"/>
-          <w:sz w:val="17"/>
-        </w:rPr>
-        <w:br/>
-        <w:t>ZTF_BUILD_CONTAINER_IMAGE=true \</w:t>
-      </w:r>
-      <w:r>
-        <w:rPr>
-          <w:rFonts w:ascii="Consolas" w:hAnsi="Consolas"/>
-          <w:color w:val="111827"/>
-          <w:sz w:val="17"/>
-        </w:rPr>
-        <w:br/>
-        <w:t>ZTF_PULL_CONTAINER_IMAGES=true \</w:t>
-      </w:r>
-      <w:r>
-        <w:rPr>
-          <w:rFonts w:ascii="Consolas" w:hAnsi="Consolas"/>
-          <w:color w:val="111827"/>
-          <w:sz w:val="17"/>
-        </w:rPr>
-        <w:br/>
-        <w:t>ZTF_FRAMEWORK_REF=v1.5.2 \</w:t>
-      </w:r>
-      <w:r>
-        <w:rPr>
-          <w:rFonts w:ascii="Consolas" w:hAnsi="Consolas"/>
-          <w:color w:val="111827"/>
-          <w:sz w:val="17"/>
-        </w:rPr>
-        <w:br/>
-        <w:t>ZTF_BAKE_NKP_FRAMEWORK=true \</w:t>
-      </w:r>
-      <w:r>
-        <w:rPr>
-          <w:rFonts w:ascii="Consolas" w:hAnsi="Consolas"/>
-          <w:color w:val="111827"/>
-          <w:sz w:val="17"/>
-        </w:rPr>
-        <w:br/>
-        <w:t>ZTF_NKP_FRAMEWORK_REF=main \</w:t>
-      </w:r>
-      <w:r>
-        <w:rPr>
-          <w:rFonts w:ascii="Consolas" w:hAnsi="Consolas"/>
-          <w:color w:val="111827"/>
-          <w:sz w:val="17"/>
-        </w:rPr>
-        <w:br/>
-        <w:t>QEMU_ACCELERATOR=kvm \</w:t>
-      </w:r>
-      <w:r>
-        <w:rPr>
-          <w:rFonts w:ascii="Consolas" w:hAnsi="Consolas"/>
-          <w:color w:val="111827"/>
-          <w:sz w:val="17"/>
-        </w:rPr>
-        <w:br/>
-        <w:t>scripts/build-ahv-qcow2.sh</w:t>
-      </w:r>
-    </w:p>
-    <w:p>
-      <w:pPr>
-        <w:shd w:val="clear" w:color="auto" w:fill="F2F4F7"/>
-        <w:spacing w:before="40"/>
-        <w:ind w:left="216"/>
-      </w:pPr>
-      <w:r>
-        <w:rPr>
-          <w:rFonts w:ascii="Consolas" w:hAnsi="Consolas"/>
-          <w:color w:val="111827"/>
-          <w:sz w:val="17"/>
-        </w:rPr>
-        <w:t>cd appliance/packer/output</w:t>
-      </w:r>
-      <w:r>
-        <w:rPr>
-          <w:rFonts w:ascii="Consolas" w:hAnsi="Consolas"/>
-          <w:color w:val="111827"/>
-          <w:sz w:val="17"/>
-        </w:rPr>
-        <w:br/>
-        <w:t>sha256sum -c SHA256SUMS</w:t>
-      </w:r>
-    </w:p>
-    <w:p>
-      <w:pPr>
-        <w:pStyle w:val="Heading1"/>
-      </w:pPr>
-      <w:r>
-        <w:t>GitHub Actions Build Path</w:t>
-      </w:r>
-    </w:p>
-    <w:p>
-      <w:pPr>
-        <w:pStyle w:val="ListBullet"/>
-        <w:spacing w:after="80"/>
-        <w:ind w:left="540" w:hanging="271"/>
-      </w:pPr>
-      <w:r>
-        <w:t>Open Actions &gt; Build AHV Appliance Image in the repository.</w:t>
-      </w:r>
-    </w:p>
-    <w:p>
-      <w:pPr>
-        <w:pStyle w:val="ListBullet"/>
-        <w:spacing w:after="80"/>
-        <w:ind w:left="540" w:hanging="271"/>
-      </w:pPr>
-      <w:r>
-        <w:t>Select Run workflow.</w:t>
-      </w:r>
-    </w:p>
-    <w:p>
-      <w:pPr>
-        <w:pStyle w:val="ListBullet"/>
-        <w:spacing w:after="80"/>
-        <w:ind w:left="540" w:hanging="271"/>
-      </w:pPr>
-      <w:r>
-        <w:t>Use source_ref main or a release tag, image_version latest or the release tag, and qemu_accelerator tcg for GitHub-hosted runners.</w:t>
-      </w:r>
-    </w:p>
-    <w:p>
-      <w:pPr>
-        <w:pStyle w:val="ListBullet"/>
-        <w:spacing w:after="80"/>
-        <w:ind w:left="540" w:hanging="271"/>
-      </w:pPr>
-      <w:r>
-        <w:t>Leave build_container_image, pull_container_images, and bake_nkp_framework set to true for a portable appliance.</w:t>
-      </w:r>
-    </w:p>
-    <w:p>
-      <w:pPr>
-        <w:pStyle w:val="ListBullet"/>
-        <w:spacing w:after="80"/>
-        <w:ind w:left="540" w:hanging="271"/>
-      </w:pPr>
-      <w:r>
-        <w:t>Set nkp_bundle_urls only when bundles are available from approved connected staging URLs.</w:t>
-      </w:r>
-    </w:p>
-    <w:p>
-      <w:pPr>
-        <w:pStyle w:val="ListBullet"/>
-        <w:spacing w:after="80"/>
-        <w:ind w:left="540" w:hanging="271"/>
-      </w:pPr>
-      <w:r>
-        <w:t>Download the ztf-orchestrator-ahv-qcow2 artifact and verify SHA256SUMS before importing into AHV.</w:t>
-      </w:r>
-    </w:p>
-    <w:tbl>
-      <w:tblPr>
-        <w:tblStyle w:val="TableGrid"/>
-        <w:tblW w:w="9360" w:type="dxa"/>
-        <w:tblInd w:w="120" w:type="dxa"/>
-        <w:tblLayout w:type="fixed"/>
-        <w:tblLook w:val="04A0" w:firstRow="1" w:lastRow="0" w:firstColumn="1" w:lastColumn="0" w:noHBand="0" w:noVBand="1"/>
-      </w:tblPr>
-      <w:tblGrid>
-        <w:gridCol w:w="3000"/>
-        <w:gridCol w:w="6360"/>
-      </w:tblGrid>
-      <w:tr>
-        <w:tc>
-          <w:tcPr>
-            <w:tcW w:w="3000" w:type="dxa"/>
-            <w:shd w:val="clear" w:color="auto" w:fill="E8EEF5"/>
-            <w:tcMar>
-              <w:top w:w="80" w:type="dxa"/>
-              <w:left w:w="120" w:type="dxa"/>
-              <w:bottom w:w="80" w:type="dxa"/>
-              <w:right w:w="120" w:type="dxa"/>
-            </w:tcMar>
-            <w:vAlign w:val="center"/>
-          </w:tcPr>
-          <w:p>
-            <w:r>
-              <w:rPr>
-                <w:b/>
-                <w:color w:val="1F4D78"/>
-              </w:rPr>
-              <w:t>Workflow Input</w:t>
-            </w:r>
-          </w:p>
-        </w:tc>
-        <w:tc>
-          <w:tcPr>
-            <w:tcW w:w="6360" w:type="dxa"/>
-            <w:shd w:val="clear" w:color="auto" w:fill="E8EEF5"/>
-            <w:tcMar>
-              <w:top w:w="80" w:type="dxa"/>
-              <w:left w:w="120" w:type="dxa"/>
-              <w:bottom w:w="80" w:type="dxa"/>
-              <w:right w:w="120" w:type="dxa"/>
-            </w:tcMar>
-            <w:vAlign w:val="center"/>
-          </w:tcPr>
-          <w:p>
-            <w:r>
-              <w:rPr>
-                <w:b/>
-                <w:color w:val="1F4D78"/>
-              </w:rPr>
-              <w:t>Recommended Value</w:t>
-            </w:r>
-          </w:p>
-        </w:tc>
-      </w:tr>
-      <w:tr>
-        <w:tc>
-          <w:tcPr>
-            <w:tcW w:w="3000" w:type="dxa"/>
-            <w:tcMar>
-              <w:top w:w="80" w:type="dxa"/>
-              <w:left w:w="120" w:type="dxa"/>
-              <w:bottom w:w="80" w:type="dxa"/>
-              <w:right w:w="120" w:type="dxa"/>
-            </w:tcMar>
-            <w:vAlign w:val="center"/>
-          </w:tcPr>
-          <w:p>
-            <w:r>
-              <w:t>source_ref</w:t>
-            </w:r>
-          </w:p>
-        </w:tc>
-        <w:tc>
-          <w:tcPr>
-            <w:tcW w:w="6360" w:type="dxa"/>
-            <w:tcMar>
-              <w:top w:w="80" w:type="dxa"/>
-              <w:left w:w="120" w:type="dxa"/>
-              <w:bottom w:w="80" w:type="dxa"/>
-              <w:right w:w="120" w:type="dxa"/>
-            </w:tcMar>
-            <w:vAlign w:val="center"/>
-          </w:tcPr>
-          <w:p>
-            <w:r>
-              <w:t>main or release tag</w:t>
-            </w:r>
-          </w:p>
-        </w:tc>
-      </w:tr>
-      <w:tr>
-        <w:tc>
-          <w:tcPr>
-            <w:tcW w:w="3000" w:type="dxa"/>
-            <w:tcMar>
-              <w:top w:w="80" w:type="dxa"/>
-              <w:left w:w="120" w:type="dxa"/>
-              <w:bottom w:w="80" w:type="dxa"/>
-              <w:right w:w="120" w:type="dxa"/>
-            </w:tcMar>
-            <w:vAlign w:val="center"/>
-          </w:tcPr>
-          <w:p>
-            <w:r>
-              <w:t>image_version</w:t>
-            </w:r>
-          </w:p>
-        </w:tc>
-        <w:tc>
-          <w:tcPr>
-            <w:tcW w:w="6360" w:type="dxa"/>
-            <w:tcMar>
-              <w:top w:w="80" w:type="dxa"/>
-              <w:left w:w="120" w:type="dxa"/>
-              <w:bottom w:w="80" w:type="dxa"/>
-              <w:right w:w="120" w:type="dxa"/>
-            </w:tcMar>
-            <w:vAlign w:val="center"/>
-          </w:tcPr>
-          <w:p>
-            <w:r>
-              <w:t>latest or release tag</w:t>
-            </w:r>
-          </w:p>
-        </w:tc>
-      </w:tr>
-      <w:tr>
-        <w:tc>
-          <w:tcPr>
-            <w:tcW w:w="3000" w:type="dxa"/>
-            <w:tcMar>
-              <w:top w:w="80" w:type="dxa"/>
-              <w:left w:w="120" w:type="dxa"/>
-              <w:bottom w:w="80" w:type="dxa"/>
-              <w:right w:w="120" w:type="dxa"/>
-            </w:tcMar>
-            <w:vAlign w:val="center"/>
-          </w:tcPr>
-          <w:p>
-            <w:r>
-              <w:t>qemu_accelerator</w:t>
-            </w:r>
-          </w:p>
-        </w:tc>
-        <w:tc>
-          <w:tcPr>
-            <w:tcW w:w="6360" w:type="dxa"/>
-            <w:tcMar>
-              <w:top w:w="80" w:type="dxa"/>
-              <w:left w:w="120" w:type="dxa"/>
-              <w:bottom w:w="80" w:type="dxa"/>
-              <w:right w:w="120" w:type="dxa"/>
-            </w:tcMar>
-            <w:vAlign w:val="center"/>
-          </w:tcPr>
-          <w:p>
-            <w:r>
-              <w:t>tcg</w:t>
-            </w:r>
-          </w:p>
-        </w:tc>
-      </w:tr>
-      <w:tr>
-        <w:tc>
-          <w:tcPr>
-            <w:tcW w:w="3000" w:type="dxa"/>
-            <w:tcMar>
-              <w:top w:w="80" w:type="dxa"/>
-              <w:left w:w="120" w:type="dxa"/>
-              <w:bottom w:w="80" w:type="dxa"/>
-              <w:right w:w="120" w:type="dxa"/>
-            </w:tcMar>
-            <w:vAlign w:val="center"/>
-          </w:tcPr>
-          <w:p>
-            <w:r>
-              <w:t>build_container_image</w:t>
-            </w:r>
-          </w:p>
-        </w:tc>
-        <w:tc>
-          <w:tcPr>
-            <w:tcW w:w="6360" w:type="dxa"/>
-            <w:tcMar>
-              <w:top w:w="80" w:type="dxa"/>
-              <w:left w:w="120" w:type="dxa"/>
-              <w:bottom w:w="80" w:type="dxa"/>
-              <w:right w:w="120" w:type="dxa"/>
-            </w:tcMar>
-            <w:vAlign w:val="center"/>
-          </w:tcPr>
-          <w:p>
-            <w:r>
-              <w:t>true</w:t>
-            </w:r>
-          </w:p>
-        </w:tc>
-      </w:tr>
-      <w:tr>
-        <w:tc>
-          <w:tcPr>
-            <w:tcW w:w="3000" w:type="dxa"/>
-            <w:tcMar>
-              <w:top w:w="80" w:type="dxa"/>
-              <w:left w:w="120" w:type="dxa"/>
-              <w:bottom w:w="80" w:type="dxa"/>
-              <w:right w:w="120" w:type="dxa"/>
-            </w:tcMar>
-            <w:vAlign w:val="center"/>
-          </w:tcPr>
-          <w:p>
-            <w:r>
-              <w:t>pull_container_images</w:t>
-            </w:r>
-          </w:p>
-        </w:tc>
-        <w:tc>
-          <w:tcPr>
-            <w:tcW w:w="6360" w:type="dxa"/>
-            <w:tcMar>
-              <w:top w:w="80" w:type="dxa"/>
-              <w:left w:w="120" w:type="dxa"/>
-              <w:bottom w:w="80" w:type="dxa"/>
-              <w:right w:w="120" w:type="dxa"/>
-            </w:tcMar>
-            <w:vAlign w:val="center"/>
-          </w:tcPr>
-          <w:p>
-            <w:r>
-              <w:t>true</w:t>
-            </w:r>
-          </w:p>
-        </w:tc>
-      </w:tr>
-      <w:tr>
-        <w:tc>
-          <w:tcPr>
-            <w:tcW w:w="3000" w:type="dxa"/>
-            <w:tcMar>
-              <w:top w:w="80" w:type="dxa"/>
-              <w:left w:w="120" w:type="dxa"/>
-              <w:bottom w:w="80" w:type="dxa"/>
-              <w:right w:w="120" w:type="dxa"/>
-            </w:tcMar>
-            <w:vAlign w:val="center"/>
-          </w:tcPr>
-          <w:p>
-            <w:r>
-              <w:t>ztf_framework_ref</w:t>
-            </w:r>
-          </w:p>
-        </w:tc>
-        <w:tc>
-          <w:tcPr>
-            <w:tcW w:w="6360" w:type="dxa"/>
-            <w:tcMar>
-              <w:top w:w="80" w:type="dxa"/>
-              <w:left w:w="120" w:type="dxa"/>
-              <w:bottom w:w="80" w:type="dxa"/>
-              <w:right w:w="120" w:type="dxa"/>
-            </w:tcMar>
-            <w:vAlign w:val="center"/>
-          </w:tcPr>
-          <w:p>
-            <w:r>
-              <w:t>v1.5.2</w:t>
-            </w:r>
-          </w:p>
-        </w:tc>
-      </w:tr>
-      <w:tr>
-        <w:tc>
-          <w:tcPr>
-            <w:tcW w:w="3000" w:type="dxa"/>
-            <w:tcMar>
-              <w:top w:w="80" w:type="dxa"/>
-              <w:left w:w="120" w:type="dxa"/>
-              <w:bottom w:w="80" w:type="dxa"/>
-              <w:right w:w="120" w:type="dxa"/>
-            </w:tcMar>
-            <w:vAlign w:val="center"/>
-          </w:tcPr>
-          <w:p>
-            <w:r>
-              <w:t>bake_nkp_framework</w:t>
-            </w:r>
-          </w:p>
-        </w:tc>
-        <w:tc>
-          <w:tcPr>
-            <w:tcW w:w="6360" w:type="dxa"/>
-            <w:tcMar>
-              <w:top w:w="80" w:type="dxa"/>
-              <w:left w:w="120" w:type="dxa"/>
-              <w:bottom w:w="80" w:type="dxa"/>
-              <w:right w:w="120" w:type="dxa"/>
-            </w:tcMar>
-            <w:vAlign w:val="center"/>
-          </w:tcPr>
-          <w:p>
-            <w:r>
-              <w:t>true</w:t>
-            </w:r>
-          </w:p>
-        </w:tc>
-      </w:tr>
-      <w:tr>
-        <w:tc>
-          <w:tcPr>
-            <w:tcW w:w="3000" w:type="dxa"/>
-            <w:tcMar>
-              <w:top w:w="80" w:type="dxa"/>
-              <w:left w:w="120" w:type="dxa"/>
-              <w:bottom w:w="80" w:type="dxa"/>
-              <w:right w:w="120" w:type="dxa"/>
-            </w:tcMar>
-            <w:vAlign w:val="center"/>
-          </w:tcPr>
-          <w:p>
-            <w:r>
-              <w:t>nkp_framework_ref</w:t>
-            </w:r>
-          </w:p>
-        </w:tc>
-        <w:tc>
-          <w:tcPr>
-            <w:tcW w:w="6360" w:type="dxa"/>
-            <w:tcMar>
-              <w:top w:w="80" w:type="dxa"/>
-              <w:left w:w="120" w:type="dxa"/>
-              <w:bottom w:w="80" w:type="dxa"/>
-              <w:right w:w="120" w:type="dxa"/>
-            </w:tcMar>
-            <w:vAlign w:val="center"/>
-          </w:tcPr>
-          <w:p>
-            <w:r>
-              <w:t>main</w:t>
-            </w:r>
-          </w:p>
-        </w:tc>
-      </w:tr>
-      <w:tr>
-        <w:tc>
-          <w:tcPr>
-            <w:tcW w:w="3000" w:type="dxa"/>
-            <w:tcMar>
-              <w:top w:w="80" w:type="dxa"/>
-              <w:left w:w="120" w:type="dxa"/>
-              <w:bottom w:w="80" w:type="dxa"/>
-              <w:right w:w="120" w:type="dxa"/>
-            </w:tcMar>
-            <w:vAlign w:val="center"/>
-          </w:tcPr>
-          <w:p>
-            <w:r>
-              <w:t>nkp_bundle_urls</w:t>
-            </w:r>
-          </w:p>
-        </w:tc>
-        <w:tc>
-          <w:tcPr>
-            <w:tcW w:w="6360" w:type="dxa"/>
-            <w:tcMar>
-              <w:top w:w="80" w:type="dxa"/>
-              <w:left w:w="120" w:type="dxa"/>
-              <w:bottom w:w="80" w:type="dxa"/>
-              <w:right w:w="120" w:type="dxa"/>
-            </w:tcMar>
-            <w:vAlign w:val="center"/>
-          </w:tcPr>
-          <w:p>
-            <w:r>
-              <w:t>blank or approved comma-separated URLs</w:t>
-            </w:r>
-          </w:p>
-        </w:tc>
-      </w:tr>
-    </w:tbl>
-    <w:p/>
-    <w:p>
-      <w:pPr>
-        <w:pStyle w:val="Heading1"/>
-      </w:pPr>
-      <w:r>
-        <w:t>Import Into Nutanix AHV</w:t>
-      </w:r>
-    </w:p>
-    <w:p>
-      <w:pPr>
-        <w:pStyle w:val="ListNumber"/>
-        <w:spacing w:after="80"/>
-        <w:ind w:left="540" w:hanging="271"/>
-      </w:pPr>
-      <w:r>
-        <w:t>Upload the QCOW2 into Prism Central or Prism Element image management.</w:t>
-      </w:r>
-    </w:p>
-    <w:p>
-      <w:pPr>
-        <w:pStyle w:val="ListNumber"/>
-        <w:spacing w:after="80"/>
-        <w:ind w:left="540" w:hanging="271"/>
-      </w:pPr>
-      <w:r>
-        <w:t>Create a VM from the image with 2 vCPU, 4-8 GB RAM, 80-100 GB disk, and the management VLAN.</w:t>
-      </w:r>
-    </w:p>
-    <w:p>
-      <w:pPr>
-        <w:pStyle w:val="ListNumber"/>
-        <w:spacing w:after="80"/>
-        <w:ind w:left="540" w:hanging="271"/>
-      </w:pPr>
-      <w:r>
-        <w:t>Provide cloud-init or your normal image process for administrator SSH access.</w:t>
-      </w:r>
-    </w:p>
-    <w:p>
-      <w:pPr>
-        <w:pStyle w:val="ListNumber"/>
-        <w:spacing w:after="80"/>
-        <w:ind w:left="540" w:hanging="271"/>
-      </w:pPr>
-      <w:r>
-        <w:t>Boot the VM and wait for first boot to finish.</w:t>
-      </w:r>
-    </w:p>
-    <w:p>
-      <w:pPr>
-        <w:pStyle w:val="ListNumber"/>
-        <w:spacing w:after="80"/>
-        <w:ind w:left="540" w:hanging="271"/>
-      </w:pPr>
-      <w:r>
-        <w:t>Open http://&lt;appliance-ip&gt;:5001 and sign in as admin using the generated password from service logs.</w:t>
-      </w:r>
-    </w:p>
-    <w:p>
-      <w:pPr>
-        <w:shd w:val="clear" w:color="auto" w:fill="F2F4F7"/>
-        <w:spacing w:before="40"/>
-        <w:ind w:left="216"/>
-      </w:pPr>
-      <w:r>
-        <w:rPr>
-          <w:rFonts w:ascii="Consolas" w:hAnsi="Consolas"/>
-          <w:color w:val="111827"/>
-          <w:sz w:val="17"/>
-        </w:rPr>
-        <w:t>sudo systemctl status ztf-orchestrator-firstboot</w:t>
-      </w:r>
-      <w:r>
-        <w:rPr>
-          <w:rFonts w:ascii="Consolas" w:hAnsi="Consolas"/>
-          <w:color w:val="111827"/>
-          <w:sz w:val="17"/>
-        </w:rPr>
-        <w:br/>
-        <w:t>sudo systemctl status ztf-orchestrator</w:t>
-      </w:r>
-      <w:r>
-        <w:rPr>
-          <w:rFonts w:ascii="Consolas" w:hAnsi="Consolas"/>
-          <w:color w:val="111827"/>
-          <w:sz w:val="17"/>
-        </w:rPr>
-        <w:br/>
-        <w:t>sudo journalctl -u ztf-orchestrator -n 200 --no-pager</w:t>
-      </w:r>
-    </w:p>
-    <w:p>
-      <w:pPr>
-        <w:pStyle w:val="Heading1"/>
-      </w:pPr>
-      <w:r>
-        <w:t>Post-Boot Validation</w:t>
-      </w:r>
-    </w:p>
-    <w:tbl>
-      <w:tblPr>
-        <w:tblStyle w:val="TableGrid"/>
-        <w:tblW w:w="9360" w:type="dxa"/>
-        <w:tblInd w:w="120" w:type="dxa"/>
-        <w:tblLayout w:type="fixed"/>
-        <w:tblLook w:val="04A0" w:firstRow="1" w:lastRow="0" w:firstColumn="1" w:lastColumn="0" w:noHBand="0" w:noVBand="1"/>
-      </w:tblPr>
-      <w:tblGrid>
-        <w:gridCol w:w="2500"/>
-        <w:gridCol w:w="6860"/>
-      </w:tblGrid>
-      <w:tr>
-        <w:tc>
-          <w:tcPr>
-            <w:tcW w:w="2500" w:type="dxa"/>
-            <w:shd w:val="clear" w:color="auto" w:fill="E8EEF5"/>
-            <w:tcMar>
-              <w:top w:w="80" w:type="dxa"/>
-              <w:left w:w="120" w:type="dxa"/>
-              <w:bottom w:w="80" w:type="dxa"/>
-              <w:right w:w="120" w:type="dxa"/>
-            </w:tcMar>
-            <w:vAlign w:val="center"/>
-          </w:tcPr>
-          <w:p>
-            <w:r>
-              <w:rPr>
-                <w:b/>
-                <w:color w:val="1F4D78"/>
-              </w:rPr>
-              <w:t>Check</w:t>
-            </w:r>
-          </w:p>
-        </w:tc>
-        <w:tc>
-          <w:tcPr>
-            <w:tcW w:w="6860" w:type="dxa"/>
-            <w:shd w:val="clear" w:color="auto" w:fill="E8EEF5"/>
-            <w:tcMar>
-              <w:top w:w="80" w:type="dxa"/>
-              <w:left w:w="120" w:type="dxa"/>
-              <w:bottom w:w="80" w:type="dxa"/>
-              <w:right w:w="120" w:type="dxa"/>
-            </w:tcMar>
-            <w:vAlign w:val="center"/>
-          </w:tcPr>
-          <w:p>
-            <w:r>
-              <w:rPr>
-                <w:b/>
-                <w:color w:val="1F4D78"/>
-              </w:rPr>
-              <w:t>Command / Path</w:t>
-            </w:r>
-          </w:p>
-        </w:tc>
-      </w:tr>
-      <w:tr>
-        <w:tc>
-          <w:tcPr>
-            <w:tcW w:w="2500" w:type="dxa"/>
-            <w:tcMar>
-              <w:top w:w="80" w:type="dxa"/>
-              <w:left w:w="120" w:type="dxa"/>
-              <w:bottom w:w="80" w:type="dxa"/>
-              <w:right w:w="120" w:type="dxa"/>
-            </w:tcMar>
-            <w:vAlign w:val="center"/>
-          </w:tcPr>
-          <w:p>
-            <w:r>
-              <w:t>Compose services</w:t>
-            </w:r>
-          </w:p>
-        </w:tc>
-        <w:tc>
-          <w:tcPr>
-            <w:tcW w:w="6860" w:type="dxa"/>
-            <w:tcMar>
-              <w:top w:w="80" w:type="dxa"/>
-              <w:left w:w="120" w:type="dxa"/>
-              <w:bottom w:w="80" w:type="dxa"/>
-              <w:right w:w="120" w:type="dxa"/>
-            </w:tcMar>
-            <w:vAlign w:val="center"/>
-          </w:tcPr>
-          <w:p>
-            <w:r>
-              <w:t>sudo docker compose -f appliance/docker-compose.appliance.yml ps</w:t>
-            </w:r>
-          </w:p>
-        </w:tc>
-      </w:tr>
-      <w:tr>
-        <w:tc>
-          <w:tcPr>
-            <w:tcW w:w="2500" w:type="dxa"/>
-            <w:tcMar>
-              <w:top w:w="80" w:type="dxa"/>
-              <w:left w:w="120" w:type="dxa"/>
-              <w:bottom w:w="80" w:type="dxa"/>
-              <w:right w:w="120" w:type="dxa"/>
-            </w:tcMar>
-            <w:vAlign w:val="center"/>
-          </w:tcPr>
-          <w:p>
-            <w:r>
-              <w:t>Application health</w:t>
-            </w:r>
-          </w:p>
-        </w:tc>
-        <w:tc>
-          <w:tcPr>
-            <w:tcW w:w="6860" w:type="dxa"/>
-            <w:tcMar>
-              <w:top w:w="80" w:type="dxa"/>
-              <w:left w:w="120" w:type="dxa"/>
-              <w:bottom w:w="80" w:type="dxa"/>
-              <w:right w:w="120" w:type="dxa"/>
-            </w:tcMar>
-            <w:vAlign w:val="center"/>
-          </w:tcPr>
-          <w:p>
-            <w:r>
-              <w:t>curl http://localhost:5001/health</w:t>
-            </w:r>
-          </w:p>
-        </w:tc>
-      </w:tr>
-      <w:tr>
-        <w:tc>
-          <w:tcPr>
-            <w:tcW w:w="2500" w:type="dxa"/>
-            <w:tcMar>
-              <w:top w:w="80" w:type="dxa"/>
-              <w:left w:w="120" w:type="dxa"/>
-              <w:bottom w:w="80" w:type="dxa"/>
-              <w:right w:w="120" w:type="dxa"/>
-            </w:tcMar>
-            <w:vAlign w:val="center"/>
-          </w:tcPr>
-          <w:p>
-            <w:r>
-              <w:t>Baked ZTF framework</w:t>
-            </w:r>
-          </w:p>
-        </w:tc>
-        <w:tc>
-          <w:tcPr>
-            <w:tcW w:w="6860" w:type="dxa"/>
-            <w:tcMar>
-              <w:top w:w="80" w:type="dxa"/>
-              <w:left w:w="120" w:type="dxa"/>
-              <w:bottom w:w="80" w:type="dxa"/>
-              <w:right w:w="120" w:type="dxa"/>
-            </w:tcMar>
-            <w:vAlign w:val="center"/>
-          </w:tcPr>
-          <w:p>
-            <w:r>
-              <w:t>ls -la /opt/zerotouch-framework inside the ztf-orchestrator container</w:t>
-            </w:r>
-          </w:p>
-        </w:tc>
-      </w:tr>
-      <w:tr>
-        <w:tc>
-          <w:tcPr>
-            <w:tcW w:w="2500" w:type="dxa"/>
-            <w:tcMar>
-              <w:top w:w="80" w:type="dxa"/>
-              <w:left w:w="120" w:type="dxa"/>
-              <w:bottom w:w="80" w:type="dxa"/>
-              <w:right w:w="120" w:type="dxa"/>
-            </w:tcMar>
-            <w:vAlign w:val="center"/>
-          </w:tcPr>
-          <w:p>
-            <w:r>
-              <w:t>Preloaded NKP framework</w:t>
-            </w:r>
-          </w:p>
-        </w:tc>
-        <w:tc>
-          <w:tcPr>
-            <w:tcW w:w="6860" w:type="dxa"/>
-            <w:tcMar>
-              <w:top w:w="80" w:type="dxa"/>
-              <w:left w:w="120" w:type="dxa"/>
-              <w:bottom w:w="80" w:type="dxa"/>
-              <w:right w:w="120" w:type="dxa"/>
-            </w:tcMar>
-            <w:vAlign w:val="center"/>
-          </w:tcPr>
-          <w:p>
-            <w:r>
-              <w:t>ls -la /var/lib/ztf-orchestrator/nkp-zerotouch-framework inside the container</w:t>
-            </w:r>
-          </w:p>
-        </w:tc>
-      </w:tr>
-      <w:tr>
-        <w:tc>
-          <w:tcPr>
-            <w:tcW w:w="2500" w:type="dxa"/>
-            <w:tcMar>
-              <w:top w:w="80" w:type="dxa"/>
-              <w:left w:w="120" w:type="dxa"/>
-              <w:bottom w:w="80" w:type="dxa"/>
-              <w:right w:w="120" w:type="dxa"/>
-            </w:tcMar>
-            <w:vAlign w:val="center"/>
-          </w:tcPr>
-          <w:p>
-            <w:r>
-              <w:t>Preloaded NKP bundles</w:t>
-            </w:r>
-          </w:p>
-        </w:tc>
-        <w:tc>
-          <w:tcPr>
-            <w:tcW w:w="6860" w:type="dxa"/>
-            <w:tcMar>
-              <w:top w:w="80" w:type="dxa"/>
-              <w:left w:w="120" w:type="dxa"/>
-              <w:bottom w:w="80" w:type="dxa"/>
-              <w:right w:w="120" w:type="dxa"/>
-            </w:tcMar>
-            <w:vAlign w:val="center"/>
-          </w:tcPr>
-          <w:p>
-            <w:r>
-              <w:t>ls -la /var/lib/ztf-orchestrator/bundles inside the container</w:t>
-            </w:r>
-          </w:p>
-        </w:tc>
-      </w:tr>
-    </w:tbl>
-    <w:p/>
-    <w:p>
-      <w:pPr>
-        <w:shd w:val="clear" w:color="auto" w:fill="F2F4F7"/>
-        <w:spacing w:before="40"/>
-        <w:ind w:left="216"/>
-      </w:pPr>
-      <w:r>
-        <w:rPr>
-          <w:rFonts w:ascii="Consolas" w:hAnsi="Consolas"/>
-          <w:color w:val="111827"/>
-          <w:sz w:val="17"/>
-        </w:rPr>
-        <w:t>cd /opt/ztf-orchestrator</w:t>
-      </w:r>
-      <w:r>
-        <w:rPr>
-          <w:rFonts w:ascii="Consolas" w:hAnsi="Consolas"/>
-          <w:color w:val="111827"/>
-          <w:sz w:val="17"/>
-        </w:rPr>
-        <w:br/>
-        <w:t>sudo docker compose -f appliance/docker-compose.appliance.yml exec ztf-orchestrator ls -la /opt/zerotouch-framework</w:t>
-      </w:r>
-      <w:r>
-        <w:rPr>
-          <w:rFonts w:ascii="Consolas" w:hAnsi="Consolas"/>
-          <w:color w:val="111827"/>
-          <w:sz w:val="17"/>
-        </w:rPr>
-        <w:br/>
-      </w:r>
-      <w:r>
-        <w:rPr>
-          <w:rFonts w:ascii="Consolas" w:hAnsi="Consolas"/>
-          <w:color w:val="111827"/>
-          <w:sz w:val="17"/>
-        </w:rPr>
-        <w:t>sudo docker compose -f appliance/docker-compose.appliance.yml exec ztf-orchestrator ls -la /var/lib/ztf-orchestrator/nkp-zerotouch-framework</w:t>
-      </w:r>
-      <w:r>
-        <w:rPr>
-          <w:rFonts w:ascii="Consolas" w:hAnsi="Consolas"/>
-          <w:color w:val="111827"/>
-          <w:sz w:val="17"/>
-        </w:rPr>
-        <w:br/>
-        <w:t>sudo docker compose -f appliance/docker-compose.appliance.yml exec ztf-orchestrator ls -la /var/lib/ztf-orchestrator/bundles</w:t>
-      </w:r>
-      <w:r>
-        <w:rPr>
-          <w:rFonts w:ascii="Consolas" w:hAnsi="Consolas"/>
-          <w:color w:val="111827"/>
-          <w:sz w:val="17"/>
-        </w:rPr>
-        <w:br/>
-        <w:t>curl http://localhost:5001/health</w:t>
-      </w:r>
-    </w:p>
-    <w:p>
-      <w:pPr>
-        <w:pStyle w:val="Heading1"/>
-      </w:pPr>
-      <w:r>
-        <w:t>NKP UI Registration</w:t>
-      </w:r>
-    </w:p>
-    <w:p>
-      <w:pPr>
-        <w:pStyle w:val="ListBullet"/>
-        <w:spacing w:after="80"/>
-        <w:ind w:left="540" w:hanging="271"/>
-      </w:pPr>
-      <w:r>
-        <w:t>Open NKP Framework in the ZTF-Orchestrator UI.</w:t>
-      </w:r>
-    </w:p>
-    <w:p>
-      <w:pPr>
-        <w:pStyle w:val="ListBullet"/>
-        <w:spacing w:after="80"/>
-        <w:ind w:left="540" w:hanging="271"/>
-      </w:pPr>
-      <w:r>
-        <w:t>Confirm the NKP framework path is /var/lib/ztf-orchestrator/nkp-zerotouch-framework.</w:t>
-      </w:r>
-    </w:p>
-    <w:p>
-      <w:pPr>
-        <w:pStyle w:val="ListBullet"/>
-        <w:spacing w:after="80"/>
-        <w:ind w:left="540" w:hanging="271"/>
-      </w:pPr>
-      <w:r>
-        <w:t>Register NKP bundle or binary paths under Binaries using /var/lib/ztf-orchestrator/bundles/&lt;artifact&gt;.</w:t>
-      </w:r>
-    </w:p>
-    <w:p>
-      <w:pPr>
-        <w:pStyle w:val="ListBullet"/>
-        <w:spacing w:after="80"/>
-        <w:ind w:left="540" w:hanging="271"/>
-      </w:pPr>
-      <w:r>
-        <w:t>Run Check CLI Compatibility before generating profiles or submitting NKP phases.</w:t>
-      </w:r>
-    </w:p>
-    <w:p>
-      <w:pPr>
-        <w:pStyle w:val="ListBullet"/>
-        <w:spacing w:after="80"/>
-        <w:ind w:left="540" w:hanging="271"/>
-      </w:pPr>
-      <w:r>
-        <w:t>Use only safe phases through the orchestrator unless a separately reviewed apply/destructive mode is added later.</w:t>
-      </w:r>
-    </w:p>
-    <w:tbl>
-      <w:tblPr>
-        <w:tblStyle w:val="TableGrid"/>
-        <w:tblW w:w="9360" w:type="dxa"/>
-        <w:tblInd w:w="120" w:type="dxa"/>
-        <w:tblLayout w:type="fixed"/>
-        <w:tblLook w:val="04A0" w:firstRow="1" w:lastRow="0" w:firstColumn="1" w:lastColumn="0" w:noHBand="0" w:noVBand="1"/>
-      </w:tblPr>
-      <w:tblGrid>
-        <w:gridCol w:w="9360"/>
-      </w:tblGrid>
-      <w:tr>
-        <w:tc>
-          <w:tcPr>
-            <w:tcW w:w="9360" w:type="dxa"/>
-            <w:shd w:val="clear" w:color="auto" w:fill="F4F6F9"/>
-            <w:tcMar>
-              <w:top w:w="80" w:type="dxa"/>
-              <w:left w:w="120" w:type="dxa"/>
-              <w:bottom w:w="80" w:type="dxa"/>
-              <w:right w:w="120" w:type="dxa"/>
-            </w:tcMar>
-            <w:vAlign w:val="center"/>
-          </w:tcPr>
-          <w:p>
-            <w:r>
-              <w:t>Security note: appliance runtime secrets are generated on first boot, not during image build. NKP preload mounts are read-only inside the app container. Do not commit NKP bundles or site-specific secrets to Git; use appliance/preload only as a local staging area.</w:t>
-            </w:r>
-          </w:p>
-        </w:tc>
-      </w:tr>
-    </w:tbl>
-    <w:p/>
-    <w:sectPr>
-      <w:pgSz w:w="12240" w:h="15840"/>
-      <w:pgMar w:top="1440" w:right="1440" w:bottom="1440" w:left="1440" w:header="708" w:footer="708" w:gutter="0"/>
-      <w:cols w:space="720"/>
-      <w:docGrid w:linePitch="360"/>
-    </w:sectPr>
-  </w:body>
-</w:document>
+<ns0:document xmlns:ns0="http://schemas.openxmlformats.org/wordprocessingml/2006/main" xmlns:ns1="http://schemas.openxmlformats.org/markup-compatibility/2006" xmlns:ns2="http://schemas.microsoft.com/office/word/2010/wordml" ns1:Ignorable="w14 w15 w16se w16cid w16 w16cex w16sdtdh w16sdtfl w16du wp14">
+  <ns0:body>
+    <ns0:p ns2:paraId="3477A6BD" ns2:textId="77777777" ns0:rsidR="00E01221" ns0:rsidRDefault="00E02EFA">
+      <ns0:pPr>
+        <ns0:spacing ns0:after="60"/>
+      </ns0:pPr>
+      <ns0:r>
+        <ns0:rPr>
+          <ns0:b/>
+          <ns0:color ns0:val="0B2545"/>
+          <ns0:sz ns0:val="44"/>
+        </ns0:rPr>
+        <ns0:t>AHV Appliance Build Guide</ns0:t>
+      </ns0:r>
+    </ns0:p>
+    <ns0:p ns2:paraId="6D4470E8" ns2:textId="77777777" ns0:rsidR="00E01221" ns0:rsidRDefault="00E02EFA">
+      <ns0:r>
+        <ns0:rPr>
+          <ns0:color ns0:val="4B5563"/>
+        </ns0:rPr>
+        <ns0:t>ZTF-Orchestrator with baked ZeroTouch Framework and optional NKP framework and bundle preload</ns0:t>
+      </ns0:r>
+    </ns0:p>
+    <ns0:tbl>
+      <ns0:tblPr>
+        <ns0:tblStyle ns0:val="TableGrid"/>
+        <ns0:tblW ns0:w="9360" ns0:type="dxa"/>
+        <ns0:tblInd ns0:w="120" ns0:type="dxa"/>
+        <ns0:tblLayout ns0:type="fixed"/>
+        <ns0:tblLook ns0:val="04A0" ns0:firstRow="1" ns0:lastRow="0" ns0:firstColumn="1" ns0:lastColumn="0" ns0:noHBand="0" ns0:noVBand="1"/>
+      </ns0:tblPr>
+      <ns0:tblGrid>
+        <ns0:gridCol ns0:w="2600"/>
+        <ns0:gridCol ns0:w="6760"/>
+      </ns0:tblGrid>
+      <ns0:tr ns0:rsidR="00E01221" ns2:paraId="499545F6" ns2:textId="77777777">
+        <ns0:tc>
+          <ns0:tcPr>
+            <ns0:tcW ns0:w="2600" ns0:type="dxa"/>
+            <ns0:shd ns0:val="clear" ns0:color="auto" ns0:fill="E8EEF5"/>
+            <ns0:tcMar>
+              <ns0:top ns0:w="80" ns0:type="dxa"/>
+              <ns0:left ns0:w="120" ns0:type="dxa"/>
+              <ns0:bottom ns0:w="80" ns0:type="dxa"/>
+              <ns0:right ns0:w="120" ns0:type="dxa"/>
+            </ns0:tcMar>
+            <ns0:vAlign ns0:val="center"/>
+          </ns0:tcPr>
+          <ns0:p ns2:paraId="75AC62B9" ns2:textId="77777777" ns0:rsidR="00E01221" ns0:rsidRDefault="00E02EFA">
+            <ns0:r>
+              <ns0:rPr>
+                <ns0:b/>
+                <ns0:color ns0:val="1F4D78"/>
+              </ns0:rPr>
+              <ns0:t>Field</ns0:t>
+            </ns0:r>
+          </ns0:p>
+        </ns0:tc>
+        <ns0:tc>
+          <ns0:tcPr>
+            <ns0:tcW ns0:w="6760" ns0:type="dxa"/>
+            <ns0:shd ns0:val="clear" ns0:color="auto" ns0:fill="E8EEF5"/>
+            <ns0:tcMar>
+              <ns0:top ns0:w="80" ns0:type="dxa"/>
+              <ns0:left ns0:w="120" ns0:type="dxa"/>
+              <ns0:bottom ns0:w="80" ns0:type="dxa"/>
+              <ns0:right ns0:w="120" ns0:type="dxa"/>
+            </ns0:tcMar>
+            <ns0:vAlign ns0:val="center"/>
+          </ns0:tcPr>
+          <ns0:p ns2:paraId="71544984" ns2:textId="77777777" ns0:rsidR="00E01221" ns0:rsidRDefault="00E02EFA">
+            <ns0:r>
+              <ns0:rPr>
+                <ns0:b/>
+                <ns0:color ns0:val="1F4D78"/>
+              </ns0:rPr>
+              <ns0:t>Value</ns0:t>
+            </ns0:r>
+          </ns0:p>
+        </ns0:tc>
+      </ns0:tr>
+      <ns0:tr ns0:rsidR="00E01221" ns2:paraId="13FF53F6" ns2:textId="77777777">
+        <ns0:tc>
+          <ns0:tcPr>
+            <ns0:tcW ns0:w="2600" ns0:type="dxa"/>
+            <ns0:tcMar>
+              <ns0:top ns0:w="80" ns0:type="dxa"/>
+              <ns0:left ns0:w="120" ns0:type="dxa"/>
+              <ns0:bottom ns0:w="80" ns0:type="dxa"/>
+              <ns0:right ns0:w="120" ns0:type="dxa"/>
+            </ns0:tcMar>
+            <ns0:vAlign ns0:val="center"/>
+          </ns0:tcPr>
+          <ns0:p ns2:paraId="7EA9D5B1" ns2:textId="77777777" ns0:rsidR="00E01221" ns0:rsidRDefault="00E02EFA">
+            <ns0:r>
+              <ns0:t>Repository</ns0:t>
+            </ns0:r>
+          </ns0:p>
+        </ns0:tc>
+        <ns0:tc>
+          <ns0:tcPr>
+            <ns0:tcW ns0:w="6760" ns0:type="dxa"/>
+            <ns0:tcMar>
+              <ns0:top ns0:w="80" ns0:type="dxa"/>
+              <ns0:left ns0:w="120" ns0:type="dxa"/>
+              <ns0:bottom ns0:w="80" ns0:type="dxa"/>
+              <ns0:right ns0:w="120" ns0:type="dxa"/>
+            </ns0:tcMar>
+            <ns0:vAlign ns0:val="center"/>
+          </ns0:tcPr>
+          <ns0:p ns2:paraId="5477D3A5" ns2:textId="77777777" ns0:rsidR="00E01221" ns0:rsidRDefault="00E02EFA">
+            <ns0:r>
+              <ns0:t>VirtuArchitect/ZTF-Orchestrator</ns0:t>
+            </ns0:r>
+          </ns0:p>
+        </ns0:tc>
+      </ns0:tr>
+      <ns0:tr ns0:rsidR="00E01221" ns2:paraId="4716E5A3" ns2:textId="77777777">
+        <ns0:tc>
+          <ns0:tcPr>
+            <ns0:tcW ns0:w="2600" ns0:type="dxa"/>
+            <ns0:tcMar>
+              <ns0:top ns0:w="80" ns0:type="dxa"/>
+              <ns0:left ns0:w="120" ns0:type="dxa"/>
+              <ns0:bottom ns0:w="80" ns0:type="dxa"/>
+              <ns0:right ns0:w="120" ns0:type="dxa"/>
+            </ns0:tcMar>
+            <ns0:vAlign ns0:val="center"/>
+          </ns0:tcPr>
+          <ns0:p ns2:paraId="4544B0E0" ns2:textId="77777777" ns0:rsidR="00E01221" ns0:rsidRDefault="00E02EFA">
+            <ns0:r>
+              <ns0:t>Primary artifact</ns0:t>
+            </ns0:r>
+          </ns0:p>
+        </ns0:tc>
+        <ns0:tc>
+          <ns0:tcPr>
+            <ns0:tcW ns0:w="6760" ns0:type="dxa"/>
+            <ns0:tcMar>
+              <ns0:top ns0:w="80" ns0:type="dxa"/>
+              <ns0:left ns0:w="120" ns0:type="dxa"/>
+              <ns0:bottom ns0:w="80" ns0:type="dxa"/>
+              <ns0:right ns0:w="120" ns0:type="dxa"/>
+            </ns0:tcMar>
+            <ns0:vAlign ns0:val="center"/>
+          </ns0:tcPr>
+          <ns0:p ns2:paraId="7742572A" ns2:textId="77777777" ns0:rsidR="00E01221" ns0:rsidRDefault="00E02EFA">
+            <ns0:r>
+              <ns0:t>AHV-importable QCOW2 appliance</ns0:t>
+            </ns0:r>
+          </ns0:p>
+        </ns0:tc>
+      </ns0:tr>
+      <ns0:tr ns0:rsidR="00E01221" ns2:paraId="74A679AC" ns2:textId="77777777">
+        <ns0:tc>
+          <ns0:tcPr>
+            <ns0:tcW ns0:w="2600" ns0:type="dxa"/>
+            <ns0:tcMar>
+              <ns0:top ns0:w="80" ns0:type="dxa"/>
+              <ns0:left ns0:w="120" ns0:type="dxa"/>
+              <ns0:bottom ns0:w="80" ns0:type="dxa"/>
+              <ns0:right ns0:w="120" ns0:type="dxa"/>
+            </ns0:tcMar>
+            <ns0:vAlign ns0:val="center"/>
+          </ns0:tcPr>
+          <ns0:p ns2:paraId="54746FF6" ns2:textId="77777777" ns0:rsidR="00E01221" ns0:rsidRDefault="00E02EFA">
+            <ns0:r>
+              <ns0:t>ZTF framework baked into app image</ns0:t>
+            </ns0:r>
+          </ns0:p>
+        </ns0:tc>
+        <ns0:tc>
+          <ns0:tcPr>
+            <ns0:tcW ns0:w="6760" ns0:type="dxa"/>
+            <ns0:tcMar>
+              <ns0:top ns0:w="80" ns0:type="dxa"/>
+              <ns0:left ns0:w="120" ns0:type="dxa"/>
+              <ns0:bottom ns0:w="80" ns0:type="dxa"/>
+              <ns0:right ns0:w="120" ns0:type="dxa"/>
+            </ns0:tcMar>
+            <ns0:vAlign ns0:val="center"/>
+          </ns0:tcPr>
+          <ns0:p ns2:paraId="11F810BA" ns2:textId="77777777" ns0:rsidR="00E01221" ns0:rsidRDefault="00E02EFA">
+            <ns0:r>
+              <ns0:t>/opt/zerotouch-framework</ns0:t>
+            </ns0:r>
+          </ns0:p>
+        </ns0:tc>
+      </ns0:tr>
+      <ns0:tr ns0:rsidR="00E01221" ns2:paraId="31B92812" ns2:textId="77777777">
+        <ns0:tc>
+          <ns0:tcPr>
+            <ns0:tcW ns0:w="2600" ns0:type="dxa"/>
+            <ns0:tcMar>
+              <ns0:top ns0:w="80" ns0:type="dxa"/>
+              <ns0:left ns0:w="120" ns0:type="dxa"/>
+              <ns0:bottom ns0:w="80" ns0:type="dxa"/>
+              <ns0:right ns0:w="120" ns0:type="dxa"/>
+            </ns0:tcMar>
+            <ns0:vAlign ns0:val="center"/>
+          </ns0:tcPr>
+          <ns0:p ns2:paraId="3196ADFA" ns2:textId="77777777" ns0:rsidR="00E01221" ns0:rsidRDefault="00E02EFA">
+            <ns0:r>
+              <ns0:t>NKP framework container path</ns0:t>
+            </ns0:r>
+          </ns0:p>
+        </ns0:tc>
+        <ns0:tc>
+          <ns0:tcPr>
+            <ns0:tcW ns0:w="6760" ns0:type="dxa"/>
+            <ns0:tcMar>
+              <ns0:top ns0:w="80" ns0:type="dxa"/>
+              <ns0:left ns0:w="120" ns0:type="dxa"/>
+              <ns0:bottom ns0:w="80" ns0:type="dxa"/>
+              <ns0:right ns0:w="120" ns0:type="dxa"/>
+            </ns0:tcMar>
+            <ns0:vAlign ns0:val="center"/>
+          </ns0:tcPr>
+          <ns0:p ns2:paraId="7C9D1846" ns2:textId="77777777" ns0:rsidR="00E01221" ns0:rsidRDefault="00E02EFA">
+            <ns0:r>
+              <ns0:t>/var/lib/ztf-orchestrator/nkp-zerotouch-framework</ns0:t>
+            </ns0:r>
+          </ns0:p>
+        </ns0:tc>
+      </ns0:tr>
+      <ns0:tr ns0:rsidR="00E01221" ns2:paraId="54CFF6D8" ns2:textId="77777777">
+        <ns0:tc>
+          <ns0:tcPr>
+            <ns0:tcW ns0:w="2600" ns0:type="dxa"/>
+            <ns0:tcMar>
+              <ns0:top ns0:w="80" ns0:type="dxa"/>
+              <ns0:left ns0:w="120" ns0:type="dxa"/>
+              <ns0:bottom ns0:w="80" ns0:type="dxa"/>
+              <ns0:right ns0:w="120" ns0:type="dxa"/>
+            </ns0:tcMar>
+            <ns0:vAlign ns0:val="center"/>
+          </ns0:tcPr>
+          <ns0:p ns2:paraId="27431115" ns2:textId="77777777" ns0:rsidR="00E01221" ns0:rsidRDefault="00E02EFA">
+            <ns0:r>
+              <ns0:t>NKP bundle container path</ns0:t>
+            </ns0:r>
+          </ns0:p>
+        </ns0:tc>
+        <ns0:tc>
+          <ns0:tcPr>
+            <ns0:tcW ns0:w="6760" ns0:type="dxa"/>
+            <ns0:tcMar>
+              <ns0:top ns0:w="80" ns0:type="dxa"/>
+              <ns0:left ns0:w="120" ns0:type="dxa"/>
+              <ns0:bottom ns0:w="80" ns0:type="dxa"/>
+              <ns0:right ns0:w="120" ns0:type="dxa"/>
+            </ns0:tcMar>
+            <ns0:vAlign ns0:val="center"/>
+          </ns0:tcPr>
+          <ns0:p ns2:paraId="52F3249A" ns2:textId="77777777" ns0:rsidR="00E01221" ns0:rsidRDefault="00E02EFA">
+            <ns0:r>
+              <ns0:t>/var/lib/ztf-orchestrator/bundles</ns0:t>
+            </ns0:r>
+          </ns0:p>
+        </ns0:tc>
+      </ns0:tr>
+      <ns0:tr>
+        <ns0:tc>
+          <ns0:tcPr>
+            <ns0:tcW ns0:type="dxa" ns0:w="2600"/>
+          </ns0:tcPr>
+          <ns0:p>
+            <ns0:r>
+              <ns0:t>Current ZTF-Orchestrator release</ns0:t>
+            </ns0:r>
+          </ns0:p>
+        </ns0:tc>
+        <ns0:tc>
+          <ns0:tcPr>
+            <ns0:tcW ns0:type="dxa" ns0:w="6760"/>
+          </ns0:tcPr>
+          <ns0:p>
+            <ns0:r>
+              <ns0:t>v1.8.1</ns0:t>
+            </ns0:r>
+          </ns0:p>
+        </ns0:tc>
+      </ns0:tr>
+    </ns0:tbl>
+    <ns0:p ns2:paraId="493DA093" ns2:textId="77777777" ns0:rsidR="00E01221" ns0:rsidRDefault="00E01221"/>
+    <ns0:p ns2:paraId="5C45F4A7" ns2:textId="77777777" ns0:rsidR="00E01221" ns0:rsidRDefault="00E02EFA">
+      <ns0:r>
+        <ns0:t>Purpose. This guide describes how to build a portable ZTF-Orchestrator AHV appliance for connected staging or air-gapped Nutanix AHV environments. For this source tree, the current ZTF-Orchestrator release is v1.8.1. The current build process can bake the ZTF-Orchestrator application image, legacy ZeroTouch Framework v1.5.2, and NKP framework assets into the QCOW2 before transfer.</ns0:t>
+      </ns0:r>
+    </ns0:p>
+    <ns0:p ns2:paraId="02C78EED" ns2:textId="77777777" ns0:rsidR="00E01221" ns0:rsidRDefault="00E02EFA">
+      <ns0:pPr>
+        <ns0:pStyle ns0:val="Heading1"/>
+      </ns0:pPr>
+      <ns0:r>
+        <ns0:t>Build Host Requirements</ns0:t>
+      </ns0:r>
+    </ns0:p>
+    <ns0:p ns2:paraId="3CC2CEEC" ns2:textId="77777777" ns0:rsidR="00E01221" ns0:rsidRDefault="00E02EFA">
+      <ns0:pPr>
+        <ns0:pStyle ns0:val="ListBullet"/>
+        <ns0:spacing ns0:after="80"/>
+        <ns0:ind ns0:left="540" ns0:hanging="271"/>
+      </ns0:pPr>
+      <ns0:r>
+        <ns0:t>Use a connected Linux build host or GitHub Actions for the actual QCOW2 build.</ns0:t>
+      </ns0:r>
+    </ns0:p>
+    <ns0:p ns2:paraId="18890FC0" ns2:textId="77777777" ns0:rsidR="00E01221" ns0:rsidRDefault="00E02EFA">
+      <ns0:pPr>
+        <ns0:pStyle ns0:val="ListBullet"/>
+        <ns0:spacing ns0:after="80"/>
+        <ns0:ind ns0:left="540" ns0:hanging="271"/>
+      </ns0:pPr>
+      <ns0:r>
+        <ns0:t>Install Git, QEMU, qemu-utils, and HashiCorp Packer on local Linux build hosts.</ns0:t>
+      </ns0:r>
+    </ns0:p>
+    <ns0:p ns2:paraId="5D2E0553" ns2:textId="77777777" ns0:rsidR="00E01221" ns0:rsidRDefault="00E02EFA">
+      <ns0:pPr>
+        <ns0:pStyle ns0:val="ListBullet"/>
+        <ns0:spacing ns0:after="80"/>
+        <ns0:ind ns0:left="540" ns0:hanging="271"/>
+      </ns0:pPr>
+      <ns0:r>
+        <ns0:t>Ensure outbound access to Ubuntu cloud images, GitHub, the ZeroTouch Framework repository, and the NKP framework repository when NKP bake-in is enabled.</ns0:t>
+      </ns0:r>
+    </ns0:p>
+    <ns0:p ns2:paraId="498F336B" ns2:textId="77777777" ns0:rsidR="00E01221" ns0:rsidRDefault="00E02EFA">
+      <ns0:pPr>
+        <ns0:pStyle ns0:val="ListBullet"/>
+        <ns0:spacing ns0:after="80"/>
+        <ns0:ind ns0:left="540" ns0:hanging="271"/>
+      </ns0:pPr>
+      <ns0:r>
+        <ns0:t>For air-gapped handoff, use an approved media or artifact transfer process for the finished QCOW2 and SHA256SUMS file.</ns0:t>
+      </ns0:r>
+    </ns0:p>
+    <ns0:p ns2:paraId="15B469CA" ns2:textId="77777777" ns0:rsidR="00E01221" ns0:rsidRDefault="00E02EFA">
+      <ns0:pPr>
+        <ns0:shd ns0:val="clear" ns0:color="auto" ns0:fill="F2F4F7"/>
+        <ns0:spacing ns0:before="40"/>
+        <ns0:ind ns0:left="216"/>
+      </ns0:pPr>
+      <ns0:r>
+        <ns0:rPr>
+          <ns0:rFonts ns0:ascii="Consolas" ns0:hAnsi="Consolas"/>
+          <ns0:color ns0:val="111827"/>
+          <ns0:sz ns0:val="17"/>
+        </ns0:rPr>
+        <ns0:t>sudo apt-get update</ns0:t>
+      </ns0:r>
+      <ns0:r>
+        <ns0:rPr>
+          <ns0:rFonts ns0:ascii="Consolas" ns0:hAnsi="Consolas"/>
+          <ns0:color ns0:val="111827"/>
+          <ns0:sz ns0:val="17"/>
+        </ns0:rPr>
+        <ns0:br/>
+        <ns0:t>sudo apt-get install -y git qemu-system-x86 qemu-utils packer</ns0:t>
+      </ns0:r>
+    </ns0:p>
+    <ns0:p ns2:paraId="454B1CA9" ns2:textId="77777777" ns0:rsidR="00E01221" ns0:rsidRDefault="00E02EFA">
+      <ns0:pPr>
+        <ns0:pStyle ns0:val="Heading1"/>
+      </ns0:pPr>
+      <ns0:r>
+        <ns0:t>Build Variables</ns0:t>
+      </ns0:r>
+    </ns0:p>
+    <ns0:tbl>
+      <ns0:tblPr>
+        <ns0:tblStyle ns0:val="TableGrid"/>
+        <ns0:tblW ns0:w="9360" ns0:type="dxa"/>
+        <ns0:tblInd ns0:w="120" ns0:type="dxa"/>
+        <ns0:tblLayout ns0:type="fixed"/>
+        <ns0:tblLook ns0:val="04A0" ns0:firstRow="1" ns0:lastRow="0" ns0:firstColumn="1" ns0:lastColumn="0" ns0:noHBand="0" ns0:noVBand="1"/>
+      </ns0:tblPr>
+      <ns0:tblGrid>
+        <ns0:gridCol ns0:w="2100"/>
+        <ns0:gridCol ns0:w="2300"/>
+        <ns0:gridCol ns0:w="4960"/>
+      </ns0:tblGrid>
+      <ns0:tr ns0:rsidR="00E01221" ns2:paraId="4B209D46" ns2:textId="77777777">
+        <ns0:tc>
+          <ns0:tcPr>
+            <ns0:tcW ns0:w="2100" ns0:type="dxa"/>
+            <ns0:shd ns0:val="clear" ns0:color="auto" ns0:fill="E8EEF5"/>
+            <ns0:tcMar>
+              <ns0:top ns0:w="80" ns0:type="dxa"/>
+              <ns0:left ns0:w="120" ns0:type="dxa"/>
+              <ns0:bottom ns0:w="80" ns0:type="dxa"/>
+              <ns0:right ns0:w="120" ns0:type="dxa"/>
+            </ns0:tcMar>
+            <ns0:vAlign ns0:val="center"/>
+          </ns0:tcPr>
+          <ns0:p ns2:paraId="6D9754A9" ns2:textId="77777777" ns0:rsidR="00E01221" ns0:rsidRDefault="00E02EFA">
+            <ns0:r>
+              <ns0:rPr>
+                <ns0:b/>
+                <ns0:color ns0:val="1F4D78"/>
+              </ns0:rPr>
+              <ns0:t>Variable</ns0:t>
+            </ns0:r>
+          </ns0:p>
+        </ns0:tc>
+        <ns0:tc>
+          <ns0:tcPr>
+            <ns0:tcW ns0:w="2300" ns0:type="dxa"/>
+            <ns0:shd ns0:val="clear" ns0:color="auto" ns0:fill="E8EEF5"/>
+            <ns0:tcMar>
+              <ns0:top ns0:w="80" ns0:type="dxa"/>
+              <ns0:left ns0:w="120" ns0:type="dxa"/>
+              <ns0:bottom ns0:w="80" ns0:type="dxa"/>
+              <ns0:right ns0:w="120" ns0:type="dxa"/>
+            </ns0:tcMar>
+            <ns0:vAlign ns0:val="center"/>
+          </ns0:tcPr>
+          <ns0:p ns2:paraId="6197CC5B" ns2:textId="77777777" ns0:rsidR="00E01221" ns0:rsidRDefault="00E02EFA">
+            <ns0:r>
+              <ns0:rPr>
+                <ns0:b/>
+                <ns0:color ns0:val="1F4D78"/>
+              </ns0:rPr>
+              <ns0:t>Default / Example</ns0:t>
+            </ns0:r>
+          </ns0:p>
+        </ns0:tc>
+        <ns0:tc>
+          <ns0:tcPr>
+            <ns0:tcW ns0:w="4960" ns0:type="dxa"/>
+            <ns0:shd ns0:val="clear" ns0:color="auto" ns0:fill="E8EEF5"/>
+            <ns0:tcMar>
+              <ns0:top ns0:w="80" ns0:type="dxa"/>
+              <ns0:left ns0:w="120" ns0:type="dxa"/>
+              <ns0:bottom ns0:w="80" ns0:type="dxa"/>
+              <ns0:right ns0:w="120" ns0:type="dxa"/>
+            </ns0:tcMar>
+            <ns0:vAlign ns0:val="center"/>
+          </ns0:tcPr>
+          <ns0:p ns2:paraId="1787ADBB" ns2:textId="77777777" ns0:rsidR="00E01221" ns0:rsidRDefault="00E02EFA">
+            <ns0:r>
+              <ns0:rPr>
+                <ns0:b/>
+                <ns0:color ns0:val="1F4D78"/>
+              </ns0:rPr>
+              <ns0:t>Purpose</ns0:t>
+            </ns0:r>
+          </ns0:p>
+        </ns0:tc>
+      </ns0:tr>
+      <ns0:tr ns0:rsidR="00E01221" ns2:paraId="2B8E11ED" ns2:textId="77777777">
+        <ns0:tc>
+          <ns0:tcPr>
+            <ns0:tcW ns0:w="2100" ns0:type="dxa"/>
+            <ns0:tcMar>
+              <ns0:top ns0:w="80" ns0:type="dxa"/>
+              <ns0:left ns0:w="120" ns0:type="dxa"/>
+              <ns0:bottom ns0:w="80" ns0:type="dxa"/>
+              <ns0:right ns0:w="120" ns0:type="dxa"/>
+            </ns0:tcMar>
+            <ns0:vAlign ns0:val="center"/>
+          </ns0:tcPr>
+          <ns0:p ns2:paraId="3D3E6511" ns2:textId="77777777" ns0:rsidR="00E01221" ns0:rsidRDefault="00E02EFA">
+            <ns0:r>
+              <ns0:t>VERSION</ns0:t>
+            </ns0:r>
+          </ns0:p>
+        </ns0:tc>
+        <ns0:tc>
+          <ns0:tcPr>
+            <ns0:tcW ns0:w="2300" ns0:type="dxa"/>
+            <ns0:tcMar>
+              <ns0:top ns0:w="80" ns0:type="dxa"/>
+              <ns0:left ns0:w="120" ns0:type="dxa"/>
+              <ns0:bottom ns0:w="80" ns0:type="dxa"/>
+              <ns0:right ns0:w="120" ns0:type="dxa"/>
+            </ns0:tcMar>
+            <ns0:vAlign ns0:val="center"/>
+          </ns0:tcPr>
+          <ns0:p>
+            <ns0:r>
+              <ns0:t>v1.8.1 or main</ns0:t>
+            </ns0:r>
+          </ns0:p>
+        </ns0:tc>
+        <ns0:tc>
+          <ns0:tcPr>
+            <ns0:tcW ns0:w="4960" ns0:type="dxa"/>
+            <ns0:tcMar>
+              <ns0:top ns0:w="80" ns0:type="dxa"/>
+              <ns0:left ns0:w="120" ns0:type="dxa"/>
+              <ns0:bottom ns0:w="80" ns0:type="dxa"/>
+              <ns0:right ns0:w="120" ns0:type="dxa"/>
+            </ns0:tcMar>
+            <ns0:vAlign ns0:val="center"/>
+          </ns0:tcPr>
+          <ns0:p ns2:paraId="36F68D0E" ns2:textId="77777777" ns0:rsidR="00E01221" ns0:rsidRDefault="00E02EFA">
+            <ns0:r>
+              <ns0:t>Git ref staged into the appliance source checkout.</ns0:t>
+            </ns0:r>
+          </ns0:p>
+        </ns0:tc>
+      </ns0:tr>
+      <ns0:tr ns0:rsidR="00E01221" ns2:paraId="132E9939" ns2:textId="77777777">
+        <ns0:tc>
+          <ns0:tcPr>
+            <ns0:tcW ns0:w="2100" ns0:type="dxa"/>
+            <ns0:tcMar>
+              <ns0:top ns0:w="80" ns0:type="dxa"/>
+              <ns0:left ns0:w="120" ns0:type="dxa"/>
+              <ns0:bottom ns0:w="80" ns0:type="dxa"/>
+              <ns0:right ns0:w="120" ns0:type="dxa"/>
+            </ns0:tcMar>
+            <ns0:vAlign ns0:val="center"/>
+          </ns0:tcPr>
+          <ns0:p ns2:paraId="045281A6" ns2:textId="77777777" ns0:rsidR="00E01221" ns0:rsidRDefault="00E02EFA">
+            <ns0:r>
+              <ns0:t>ZTF_ORCHESTRATOR_VERSION</ns0:t>
+            </ns0:r>
+          </ns0:p>
+        </ns0:tc>
+        <ns0:tc>
+          <ns0:tcPr>
+            <ns0:tcW ns0:w="2300" ns0:type="dxa"/>
+            <ns0:tcMar>
+              <ns0:top ns0:w="80" ns0:type="dxa"/>
+              <ns0:left ns0:w="120" ns0:type="dxa"/>
+              <ns0:bottom ns0:w="80" ns0:type="dxa"/>
+              <ns0:right ns0:w="120" ns0:type="dxa"/>
+            </ns0:tcMar>
+            <ns0:vAlign ns0:val="center"/>
+          </ns0:tcPr>
+          <ns0:p>
+            <ns0:r>
+              <ns0:t>v1.8.1 or latest</ns0:t>
+            </ns0:r>
+          </ns0:p>
+        </ns0:tc>
+        <ns0:tc>
+          <ns0:tcPr>
+            <ns0:tcW ns0:w="4960" ns0:type="dxa"/>
+            <ns0:tcMar>
+              <ns0:top ns0:w="80" ns0:type="dxa"/>
+              <ns0:left ns0:w="120" ns0:type="dxa"/>
+              <ns0:bottom ns0:w="80" ns0:type="dxa"/>
+              <ns0:right ns0:w="120" ns0:type="dxa"/>
+            </ns0:tcMar>
+            <ns0:vAlign ns0:val="center"/>
+          </ns0:tcPr>
+          <ns0:p ns2:paraId="1A2B88DF" ns2:textId="77777777" ns0:rsidR="00E01221" ns0:rsidRDefault="00E02EFA">
+            <ns0:r>
+              <ns0:t>Container tag the appliance runs.</ns0:t>
+            </ns0:r>
+          </ns0:p>
+        </ns0:tc>
+      </ns0:tr>
+      <ns0:tr ns0:rsidR="00E01221" ns2:paraId="40A197DE" ns2:textId="77777777">
+        <ns0:tc>
+          <ns0:tcPr>
+            <ns0:tcW ns0:w="2100" ns0:type="dxa"/>
+            <ns0:tcMar>
+              <ns0:top ns0:w="80" ns0:type="dxa"/>
+              <ns0:left ns0:w="120" ns0:type="dxa"/>
+              <ns0:bottom ns0:w="80" ns0:type="dxa"/>
+              <ns0:right ns0:w="120" ns0:type="dxa"/>
+            </ns0:tcMar>
+            <ns0:vAlign ns0:val="center"/>
+          </ns0:tcPr>
+          <ns0:p ns2:paraId="7DB8DABF" ns2:textId="77777777" ns0:rsidR="00E01221" ns0:rsidRDefault="00E02EFA">
+            <ns0:r>
+              <ns0:t>ZTF_BUILD_CONTAINER_IMAGE</ns0:t>
+            </ns0:r>
+          </ns0:p>
+        </ns0:tc>
+        <ns0:tc>
+          <ns0:tcPr>
+            <ns0:tcW ns0:w="2300" ns0:type="dxa"/>
+            <ns0:tcMar>
+              <ns0:top ns0:w="80" ns0:type="dxa"/>
+              <ns0:left ns0:w="120" ns0:type="dxa"/>
+              <ns0:bottom ns0:w="80" ns0:type="dxa"/>
+              <ns0:right ns0:w="120" ns0:type="dxa"/>
+            </ns0:tcMar>
+            <ns0:vAlign ns0:val="center"/>
+          </ns0:tcPr>
+          <ns0:p ns2:paraId="37ACD6AF" ns2:textId="77777777" ns0:rsidR="00E01221" ns0:rsidRDefault="00E02EFA">
+            <ns0:r>
+              <ns0:t>true</ns0:t>
+            </ns0:r>
+          </ns0:p>
+        </ns0:tc>
+        <ns0:tc>
+          <ns0:tcPr>
+            <ns0:tcW ns0:w="4960" ns0:type="dxa"/>
+            <ns0:tcMar>
+              <ns0:top ns0:w="80" ns0:type="dxa"/>
+              <ns0:left ns0:w="120" ns0:type="dxa"/>
+              <ns0:bottom ns0:w="80" ns0:type="dxa"/>
+              <ns0:right ns0:w="120" ns0:type="dxa"/>
+            </ns0:tcMar>
+            <ns0:vAlign ns0:val="center"/>
+          </ns0:tcPr>
+          <ns0:p ns2:paraId="7CB4D6CE" ns2:textId="77777777" ns0:rsidR="00E01221" ns0:rsidRDefault="00E02EFA">
+            <ns0:r>
+              <ns0:t>Builds the app image inside the QCOW2.</ns0:t>
+            </ns0:r>
+          </ns0:p>
+        </ns0:tc>
+      </ns0:tr>
+      <ns0:tr ns0:rsidR="00E01221" ns2:paraId="3DF31DCF" ns2:textId="77777777">
+        <ns0:tc>
+          <ns0:tcPr>
+            <ns0:tcW ns0:w="2100" ns0:type="dxa"/>
+            <ns0:tcMar>
+              <ns0:top ns0:w="80" ns0:type="dxa"/>
+              <ns0:left ns0:w="120" ns0:type="dxa"/>
+              <ns0:bottom ns0:w="80" ns0:type="dxa"/>
+              <ns0:right ns0:w="120" ns0:type="dxa"/>
+            </ns0:tcMar>
+            <ns0:vAlign ns0:val="center"/>
+          </ns0:tcPr>
+          <ns0:p ns2:paraId="124C0362" ns2:textId="77777777" ns0:rsidR="00E01221" ns0:rsidRDefault="00E02EFA">
+            <ns0:r>
+              <ns0:t>ZTF_FRAMEWORK_REF</ns0:t>
+            </ns0:r>
+          </ns0:p>
+        </ns0:tc>
+        <ns0:tc>
+          <ns0:tcPr>
+            <ns0:tcW ns0:w="2300" ns0:type="dxa"/>
+            <ns0:tcMar>
+              <ns0:top ns0:w="80" ns0:type="dxa"/>
+              <ns0:left ns0:w="120" ns0:type="dxa"/>
+              <ns0:bottom ns0:w="80" ns0:type="dxa"/>
+              <ns0:right ns0:w="120" ns0:type="dxa"/>
+            </ns0:tcMar>
+            <ns0:vAlign ns0:val="center"/>
+          </ns0:tcPr>
+          <ns0:p ns2:paraId="092A7104" ns2:textId="77777777" ns0:rsidR="00E01221" ns0:rsidRDefault="00E02EFA">
+            <ns0:r>
+              <ns0:t>v1.5.2</ns0:t>
+            </ns0:r>
+          </ns0:p>
+        </ns0:tc>
+        <ns0:tc>
+          <ns0:tcPr>
+            <ns0:tcW ns0:w="4960" ns0:type="dxa"/>
+            <ns0:tcMar>
+              <ns0:top ns0:w="80" ns0:type="dxa"/>
+              <ns0:left ns0:w="120" ns0:type="dxa"/>
+              <ns0:bottom ns0:w="80" ns0:type="dxa"/>
+              <ns0:right ns0:w="120" ns0:type="dxa"/>
+            </ns0:tcMar>
+            <ns0:vAlign ns0:val="center"/>
+          </ns0:tcPr>
+          <ns0:p ns2:paraId="3C3E5296" ns2:textId="77777777" ns0:rsidR="00E01221" ns0:rsidRDefault="00E02EFA">
+            <ns0:r>
+              <ns0:t>Legacy ZeroTouch Framework ref baked into the app image.</ns0:t>
+            </ns0:r>
+          </ns0:p>
+        </ns0:tc>
+      </ns0:tr>
+      <ns0:tr ns0:rsidR="00E01221" ns2:paraId="43BE6182" ns2:textId="77777777">
+        <ns0:tc>
+          <ns0:tcPr>
+            <ns0:tcW ns0:w="2100" ns0:type="dxa"/>
+            <ns0:tcMar>
+              <ns0:top ns0:w="80" ns0:type="dxa"/>
+              <ns0:left ns0:w="120" ns0:type="dxa"/>
+              <ns0:bottom ns0:w="80" ns0:type="dxa"/>
+              <ns0:right ns0:w="120" ns0:type="dxa"/>
+            </ns0:tcMar>
+            <ns0:vAlign ns0:val="center"/>
+          </ns0:tcPr>
+          <ns0:p ns2:paraId="32CB5575" ns2:textId="77777777" ns0:rsidR="00E01221" ns0:rsidRDefault="00E02EFA">
+            <ns0:r>
+              <ns0:t>ZTF_BAKE_NKP_FRAMEWORK</ns0:t>
+            </ns0:r>
+          </ns0:p>
+        </ns0:tc>
+        <ns0:tc>
+          <ns0:tcPr>
+            <ns0:tcW ns0:w="2300" ns0:type="dxa"/>
+            <ns0:tcMar>
+              <ns0:top ns0:w="80" ns0:type="dxa"/>
+              <ns0:left ns0:w="120" ns0:type="dxa"/>
+              <ns0:bottom ns0:w="80" ns0:type="dxa"/>
+              <ns0:right ns0:w="120" ns0:type="dxa"/>
+            </ns0:tcMar>
+            <ns0:vAlign ns0:val="center"/>
+          </ns0:tcPr>
+          <ns0:p ns2:paraId="3D9A3961" ns2:textId="77777777" ns0:rsidR="00E01221" ns0:rsidRDefault="00E02EFA">
+            <ns0:r>
+              <ns0:t>true</ns0:t>
+            </ns0:r>
+          </ns0:p>
+        </ns0:tc>
+        <ns0:tc>
+          <ns0:tcPr>
+            <ns0:tcW ns0:w="4960" ns0:type="dxa"/>
+            <ns0:tcMar>
+              <ns0:top ns0:w="80" ns0:type="dxa"/>
+              <ns0:left ns0:w="120" ns0:type="dxa"/>
+              <ns0:bottom ns0:w="80" ns0:type="dxa"/>
+              <ns0:right ns0:w="120" ns0:type="dxa"/>
+            </ns0:tcMar>
+            <ns0:vAlign ns0:val="center"/>
+          </ns0:tcPr>
+          <ns0:p ns2:paraId="609809D7" ns2:textId="77777777" ns0:rsidR="00E01221" ns0:rsidRDefault="00E02EFA">
+            <ns0:r>
+              <ns0:t>Clones or copies the NKP framework into the appliance.</ns0:t>
+            </ns0:r>
+          </ns0:p>
+        </ns0:tc>
+      </ns0:tr>
+      <ns0:tr ns0:rsidR="00E01221" ns2:paraId="3191070A" ns2:textId="77777777">
+        <ns0:tc>
+          <ns0:tcPr>
+            <ns0:tcW ns0:w="2100" ns0:type="dxa"/>
+            <ns0:tcMar>
+              <ns0:top ns0:w="80" ns0:type="dxa"/>
+              <ns0:left ns0:w="120" ns0:type="dxa"/>
+              <ns0:bottom ns0:w="80" ns0:type="dxa"/>
+              <ns0:right ns0:w="120" ns0:type="dxa"/>
+            </ns0:tcMar>
+            <ns0:vAlign ns0:val="center"/>
+          </ns0:tcPr>
+          <ns0:p ns2:paraId="79AFA159" ns2:textId="77777777" ns0:rsidR="00E01221" ns0:rsidRDefault="00E02EFA">
+            <ns0:r>
+              <ns0:t>ZTF_NKP_FRAMEWORK_REF</ns0:t>
+            </ns0:r>
+          </ns0:p>
+        </ns0:tc>
+        <ns0:tc>
+          <ns0:tcPr>
+            <ns0:tcW ns0:w="2300" ns0:type="dxa"/>
+            <ns0:tcMar>
+              <ns0:top ns0:w="80" ns0:type="dxa"/>
+              <ns0:left ns0:w="120" ns0:type="dxa"/>
+              <ns0:bottom ns0:w="80" ns0:type="dxa"/>
+              <ns0:right ns0:w="120" ns0:type="dxa"/>
+            </ns0:tcMar>
+            <ns0:vAlign ns0:val="center"/>
+          </ns0:tcPr>
+          <ns0:p ns2:paraId="61CDCD77" ns2:textId="77777777" ns0:rsidR="00E01221" ns0:rsidRDefault="00E02EFA">
+            <ns0:r>
+              <ns0:t>main</ns0:t>
+            </ns0:r>
+          </ns0:p>
+        </ns0:tc>
+        <ns0:tc>
+          <ns0:tcPr>
+            <ns0:tcW ns0:w="4960" ns0:type="dxa"/>
+            <ns0:tcMar>
+              <ns0:top ns0:w="80" ns0:type="dxa"/>
+              <ns0:left ns0:w="120" ns0:type="dxa"/>
+              <ns0:bottom ns0:w="80" ns0:type="dxa"/>
+              <ns0:right ns0:w="120" ns0:type="dxa"/>
+            </ns0:tcMar>
+            <ns0:vAlign ns0:val="center"/>
+          </ns0:tcPr>
+          <ns0:p ns2:paraId="2F502B11" ns2:textId="77777777" ns0:rsidR="00E01221" ns0:rsidRDefault="00E02EFA">
+            <ns0:r>
+              <ns0:t>NKP framework ref to bake.</ns0:t>
+            </ns0:r>
+          </ns0:p>
+        </ns0:tc>
+      </ns0:tr>
+      <ns0:tr ns0:rsidR="00E01221" ns2:paraId="2634B9EE" ns2:textId="77777777">
+        <ns0:tc>
+          <ns0:tcPr>
+            <ns0:tcW ns0:w="2100" ns0:type="dxa"/>
+            <ns0:tcMar>
+              <ns0:top ns0:w="80" ns0:type="dxa"/>
+              <ns0:left ns0:w="120" ns0:type="dxa"/>
+              <ns0:bottom ns0:w="80" ns0:type="dxa"/>
+              <ns0:right ns0:w="120" ns0:type="dxa"/>
+            </ns0:tcMar>
+            <ns0:vAlign ns0:val="center"/>
+          </ns0:tcPr>
+          <ns0:p ns2:paraId="23C7D8A3" ns2:textId="77777777" ns0:rsidR="00E01221" ns0:rsidRDefault="00E02EFA">
+            <ns0:r>
+              <ns0:t>ZTF_NKP_BUNDLE_URLS</ns0:t>
+            </ns0:r>
+          </ns0:p>
+        </ns0:tc>
+        <ns0:tc>
+          <ns0:tcPr>
+            <ns0:tcW ns0:w="2300" ns0:type="dxa"/>
+            <ns0:tcMar>
+              <ns0:top ns0:w="80" ns0:type="dxa"/>
+              <ns0:left ns0:w="120" ns0:type="dxa"/>
+              <ns0:bottom ns0:w="80" ns0:type="dxa"/>
+              <ns0:right ns0:w="120" ns0:type="dxa"/>
+            </ns0:tcMar>
+            <ns0:vAlign ns0:val="center"/>
+          </ns0:tcPr>
+          <ns0:p ns2:paraId="44CE9C10" ns2:textId="77777777" ns0:rsidR="00E01221" ns0:rsidRDefault="00E02EFA">
+            <ns0:r>
+              <ns0:t>comma-separated URLs</ns0:t>
+            </ns0:r>
+          </ns0:p>
+        </ns0:tc>
+        <ns0:tc>
+          <ns0:tcPr>
+            <ns0:tcW ns0:w="4960" ns0:type="dxa"/>
+            <ns0:tcMar>
+              <ns0:top ns0:w="80" ns0:type="dxa"/>
+              <ns0:left ns0:w="120" ns0:type="dxa"/>
+              <ns0:bottom ns0:w="80" ns0:type="dxa"/>
+              <ns0:right ns0:w="120" ns0:type="dxa"/>
+            </ns0:tcMar>
+            <ns0:vAlign ns0:val="center"/>
+          </ns0:tcPr>
+          <ns0:p ns2:paraId="4545EA27" ns2:textId="77777777" ns0:rsidR="00E01221" ns0:rsidRDefault="00E02EFA">
+            <ns0:r>
+              <ns0:t>Optional bundle downloads during connected staging builds.</ns0:t>
+            </ns0:r>
+          </ns0:p>
+        </ns0:tc>
+      </ns0:tr>
+      <ns0:tr ns0:rsidR="00E01221" ns2:paraId="42AA887B" ns2:textId="77777777">
+        <ns0:tc>
+          <ns0:tcPr>
+            <ns0:tcW ns0:w="2100" ns0:type="dxa"/>
+            <ns0:tcMar>
+              <ns0:top ns0:w="80" ns0:type="dxa"/>
+              <ns0:left ns0:w="120" ns0:type="dxa"/>
+              <ns0:bottom ns0:w="80" ns0:type="dxa"/>
+              <ns0:right ns0:w="120" ns0:type="dxa"/>
+            </ns0:tcMar>
+            <ns0:vAlign ns0:val="center"/>
+          </ns0:tcPr>
+          <ns0:p ns2:paraId="4FCD982E" ns2:textId="77777777" ns0:rsidR="00E01221" ns0:rsidRDefault="00E02EFA">
+            <ns0:r>
+              <ns0:t>QEMU_ACCELERATOR</ns0:t>
+            </ns0:r>
+          </ns0:p>
+        </ns0:tc>
+        <ns0:tc>
+          <ns0:tcPr>
+            <ns0:tcW ns0:w="2300" ns0:type="dxa"/>
+            <ns0:tcMar>
+              <ns0:top ns0:w="80" ns0:type="dxa"/>
+              <ns0:left ns0:w="120" ns0:type="dxa"/>
+              <ns0:bottom ns0:w="80" ns0:type="dxa"/>
+              <ns0:right ns0:w="120" ns0:type="dxa"/>
+            </ns0:tcMar>
+            <ns0:vAlign ns0:val="center"/>
+          </ns0:tcPr>
+          <ns0:p ns2:paraId="1D5409CF" ns2:textId="77777777" ns0:rsidR="00E01221" ns0:rsidRDefault="00E02EFA">
+            <ns0:r>
+              <ns0:t>kvm or tcg</ns0:t>
+            </ns0:r>
+          </ns0:p>
+        </ns0:tc>
+        <ns0:tc>
+          <ns0:tcPr>
+            <ns0:tcW ns0:w="4960" ns0:type="dxa"/>
+            <ns0:tcMar>
+              <ns0:top ns0:w="80" ns0:type="dxa"/>
+              <ns0:left ns0:w="120" ns0:type="dxa"/>
+              <ns0:bottom ns0:w="80" ns0:type="dxa"/>
+              <ns0:right ns0:w="120" ns0:type="dxa"/>
+            </ns0:tcMar>
+            <ns0:vAlign ns0:val="center"/>
+          </ns0:tcPr>
+          <ns0:p ns2:paraId="3C090FA9" ns2:textId="77777777" ns0:rsidR="00E01221" ns0:rsidRDefault="00E02EFA">
+            <ns0:r>
+              <ns0:t>Use kvm on Linux hosts with virtualization; use tcg otherwise.</ns0:t>
+            </ns0:r>
+          </ns0:p>
+        </ns0:tc>
+      </ns0:tr>
+    </ns0:tbl>
+    <ns0:p ns2:paraId="2342B878" ns2:textId="77777777" ns0:rsidR="00E01221" ns0:rsidRDefault="00E01221"/>
+    <ns0:p ns2:paraId="51AB88A4" ns2:textId="77777777" ns0:rsidR="00E01221" ns0:rsidRDefault="00E02EFA">
+      <ns0:pPr>
+        <ns0:pStyle ns0:val="Heading1"/>
+      </ns0:pPr>
+      <ns0:r>
+        <ns0:t>Step-by-Step Local Build</ns0:t>
+      </ns0:r>
+    </ns0:p>
+    <ns0:p ns2:paraId="3CA5EC7F" ns2:textId="77777777" ns0:rsidR="00E01221" ns0:rsidRDefault="00E02EFA">
+      <ns0:pPr>
+        <ns0:pStyle ns0:val="ListNumber"/>
+        <ns0:spacing ns0:after="80"/>
+        <ns0:ind ns0:left="540" ns0:hanging="271"/>
+      </ns0:pPr>
+      <ns0:r>
+        <ns0:t>Clone the repository on a connected Linux build host.</ns0:t>
+      </ns0:r>
+    </ns0:p>
+    <ns0:p ns2:paraId="446E93B6" ns2:textId="77777777" ns0:rsidR="00E01221" ns0:rsidRDefault="00E02EFA">
+      <ns0:pPr>
+        <ns0:pStyle ns0:val="ListNumber"/>
+        <ns0:spacing ns0:after="80"/>
+        <ns0:ind ns0:left="540" ns0:hanging="271"/>
+      </ns0:pPr>
+      <ns0:r>
+        <ns0:t>Optionally stage local NKP bundle artifacts before running Packer.</ns0:t>
+      </ns0:r>
+    </ns0:p>
+    <ns0:p ns2:paraId="61258335" ns2:textId="77777777" ns0:rsidR="00E01221" ns0:rsidRDefault="00E02EFA">
+      <ns0:pPr>
+        <ns0:pStyle ns0:val="ListNumber"/>
+        <ns0:spacing ns0:after="80"/>
+        <ns0:ind ns0:left="540" ns0:hanging="271"/>
+      </ns0:pPr>
+      <ns0:r>
+        <ns0:t>Optionally stage a reviewed local NKP framework checkout if you do not want Packer to clone it from Git.</ns0:t>
+      </ns0:r>
+    </ns0:p>
+    <ns0:p ns2:paraId="77277D24" ns2:textId="77777777" ns0:rsidR="00E01221" ns0:rsidRDefault="00E02EFA">
+      <ns0:pPr>
+        <ns0:pStyle ns0:val="ListNumber"/>
+        <ns0:spacing ns0:after="80"/>
+        <ns0:ind ns0:left="540" ns0:hanging="271"/>
+      </ns0:pPr>
+      <ns0:r>
+        <ns0:t>Run the AHV QCOW2 build wrapper with ZTF and NKP bake-in enabled.</ns0:t>
+      </ns0:r>
+    </ns0:p>
+    <ns0:p ns2:paraId="40F8B5B4" ns2:textId="77777777" ns0:rsidR="00E01221" ns0:rsidRDefault="00E02EFA">
+      <ns0:pPr>
+        <ns0:pStyle ns0:val="ListNumber"/>
+        <ns0:spacing ns0:after="80"/>
+        <ns0:ind ns0:left="540" ns0:hanging="271"/>
+      </ns0:pPr>
+      <ns0:r>
+        <ns0:t>Verify the generated SHA256SUMS file.</ns0:t>
+      </ns0:r>
+    </ns0:p>
+    <ns0:p ns2:paraId="205F9C53" ns2:textId="77777777" ns0:rsidR="00E01221" ns0:rsidRDefault="00E02EFA">
+      <ns0:pPr>
+        <ns0:pStyle ns0:val="ListNumber"/>
+        <ns0:spacing ns0:after="80"/>
+        <ns0:ind ns0:left="540" ns0:hanging="271"/>
+      </ns0:pPr>
+      <ns0:r>
+        <ns0:t>Transfer the QCOW2 and checksum to the target AHV environment.</ns0:t>
+      </ns0:r>
+    </ns0:p>
+    <ns0:p ns2:paraId="0EFCDF24" ns2:textId="77777777" ns0:rsidR="00E01221" ns0:rsidRDefault="00E02EFA">
+      <ns0:pPr>
+        <ns0:shd ns0:val="clear" ns0:color="auto" ns0:fill="F2F4F7"/>
+        <ns0:spacing ns0:before="40"/>
+        <ns0:ind ns0:left="216"/>
+      </ns0:pPr>
+      <ns0:r>
+        <ns0:rPr>
+          <ns0:rFonts ns0:ascii="Consolas" ns0:hAnsi="Consolas"/>
+          <ns0:color ns0:val="111827"/>
+          <ns0:sz ns0:val="17"/>
+        </ns0:rPr>
+        <ns0:t>git clone https://github.com/VirtuArchitect/ZTF-Orchestrator.git</ns0:t>
+      </ns0:r>
+      <ns0:r>
+        <ns0:rPr>
+          <ns0:rFonts ns0:ascii="Consolas" ns0:hAnsi="Consolas"/>
+          <ns0:color ns0:val="111827"/>
+          <ns0:sz ns0:val="17"/>
+        </ns0:rPr>
+        <ns0:br/>
+        <ns0:t>cd ZTF-Orchestrator</ns0:t>
+      </ns0:r>
+    </ns0:p>
+    <ns0:p ns2:paraId="16092A64" ns2:textId="77777777" ns0:rsidR="00E01221" ns0:rsidRDefault="00E02EFA">
+      <ns0:pPr>
+        <ns0:shd ns0:val="clear" ns0:color="auto" ns0:fill="F2F4F7"/>
+        <ns0:spacing ns0:before="40"/>
+        <ns0:ind ns0:left="216"/>
+      </ns0:pPr>
+      <ns0:r>
+        <ns0:rPr>
+          <ns0:rFonts ns0:ascii="Consolas" ns0:hAnsi="Consolas"/>
+          <ns0:color ns0:val="111827"/>
+          <ns0:sz ns0:val="17"/>
+        </ns0:rPr>
+        <ns0:t># Optional local bundle staging before build</ns0:t>
+      </ns0:r>
+      <ns0:r>
+        <ns0:rPr>
+          <ns0:rFonts ns0:ascii="Consolas" ns0:hAnsi="Consolas"/>
+          <ns0:color ns0:val="111827"/>
+          <ns0:sz ns0:val="17"/>
+        </ns0:rPr>
+        <ns0:br/>
+        <ns0:t>cp /path/to/nkp-bundle-or-binary appliance/preload/bundles/</ns0:t>
+      </ns0:r>
+    </ns0:p>
+    <ns0:p ns2:paraId="78AC0EA6" ns2:textId="77777777" ns0:rsidR="00E01221" ns0:rsidRDefault="00E02EFA">
+      <ns0:pPr>
+        <ns0:shd ns0:val="clear" ns0:color="auto" ns0:fill="F2F4F7"/>
+        <ns0:spacing ns0:before="40"/>
+        <ns0:ind ns0:left="216"/>
+      </ns0:pPr>
+      <ns0:r>
+        <ns0:rPr>
+          <ns0:rFonts ns0:ascii="Consolas" ns0:hAnsi="Consolas"/>
+          <ns0:color ns0:val="111827"/>
+          <ns0:sz ns0:val="17"/>
+        </ns0:rPr>
+        <ns0:t># Optional local NKP framework staging before build</ns0:t>
+      </ns0:r>
+      <ns0:r>
+        <ns0:rPr>
+          <ns0:rFonts ns0:ascii="Consolas" ns0:hAnsi="Consolas"/>
+          <ns0:color ns0:val="111827"/>
+          <ns0:sz ns0:val="17"/>
+        </ns0:rPr>
+        <ns0:br/>
+        <ns0:t>rsync -a /path/to/nkp-zerotouch-framework/ appliance/preload/nkp-zerotouch-framework/</ns0:t>
+      </ns0:r>
+    </ns0:p>
+    <ns0:p ns2:paraId="7BBAEBB7" ns2:textId="77777777" ns0:rsidR="00E01221" ns0:rsidRDefault="00E02EFA">
+      <ns0:pPr>
+        <ns0:shd ns0:val="clear" ns0:color="auto" ns0:fill="F2F4F7"/>
+        <ns0:spacing ns0:before="40"/>
+        <ns0:ind ns0:left="216"/>
+      </ns0:pPr>
+      <ns0:r>
+        <ns0:rPr>
+          <ns0:rFonts ns0:ascii="Consolas" ns0:hAnsi="Consolas"/>
+          <ns0:color ns0:val="111827"/>
+          <ns0:sz ns0:val="17"/>
+        </ns0:rPr>
+        <ns0:t>cd appliance</ns0:t>
+      </ns0:r>
+      <ns0:r>
+        <ns0:rPr>
+          <ns0:rFonts ns0:ascii="Consolas" ns0:hAnsi="Consolas"/>
+          <ns0:color ns0:val="111827"/>
+          <ns0:sz ns0:val="17"/>
+        </ns0:rPr>
+        <ns0:br/>
+        <ns0:t>VERSION=v1.8.1 \</ns0:t>
+      </ns0:r>
+      <ns0:r>
+        <ns0:rPr>
+          <ns0:rFonts ns0:ascii="Consolas" ns0:hAnsi="Consolas"/>
+          <ns0:color ns0:val="111827"/>
+          <ns0:sz ns0:val="17"/>
+        </ns0:rPr>
+        <ns0:br/>
+        <ns0:t>ZTF_ORCHESTRATOR_VERSION=v1.8.1 \</ns0:t>
+      </ns0:r>
+      <ns0:r>
+        <ns0:rPr>
+          <ns0:rFonts ns0:ascii="Consolas" ns0:hAnsi="Consolas"/>
+          <ns0:color ns0:val="111827"/>
+          <ns0:sz ns0:val="17"/>
+        </ns0:rPr>
+        <ns0:br/>
+        <ns0:t>ZTF_BUILD_CONTAINER_IMAGE=true \</ns0:t>
+      </ns0:r>
+      <ns0:r>
+        <ns0:rPr>
+          <ns0:rFonts ns0:ascii="Consolas" ns0:hAnsi="Consolas"/>
+          <ns0:color ns0:val="111827"/>
+          <ns0:sz ns0:val="17"/>
+        </ns0:rPr>
+        <ns0:br/>
+        <ns0:t>ZTF_PULL_CONTAINER_IMAGES=true \</ns0:t>
+      </ns0:r>
+      <ns0:r>
+        <ns0:rPr>
+          <ns0:rFonts ns0:ascii="Consolas" ns0:hAnsi="Consolas"/>
+          <ns0:color ns0:val="111827"/>
+          <ns0:sz ns0:val="17"/>
+        </ns0:rPr>
+        <ns0:br/>
+        <ns0:t>ZTF_FRAMEWORK_REF=v1.5.2 \</ns0:t>
+      </ns0:r>
+      <ns0:r>
+        <ns0:rPr>
+          <ns0:rFonts ns0:ascii="Consolas" ns0:hAnsi="Consolas"/>
+          <ns0:color ns0:val="111827"/>
+          <ns0:sz ns0:val="17"/>
+        </ns0:rPr>
+        <ns0:br/>
+        <ns0:t>ZTF_BAKE_NKP_FRAMEWORK=true \</ns0:t>
+      </ns0:r>
+      <ns0:r>
+        <ns0:rPr>
+          <ns0:rFonts ns0:ascii="Consolas" ns0:hAnsi="Consolas"/>
+          <ns0:color ns0:val="111827"/>
+          <ns0:sz ns0:val="17"/>
+        </ns0:rPr>
+        <ns0:br/>
+        <ns0:t>ZTF_NKP_FRAMEWORK_REF=main \</ns0:t>
+      </ns0:r>
+      <ns0:r>
+        <ns0:rPr>
+          <ns0:rFonts ns0:ascii="Consolas" ns0:hAnsi="Consolas"/>
+          <ns0:color ns0:val="111827"/>
+          <ns0:sz ns0:val="17"/>
+        </ns0:rPr>
+        <ns0:br/>
+        <ns0:t>QEMU_ACCELERATOR=kvm \</ns0:t>
+      </ns0:r>
+      <ns0:r>
+        <ns0:rPr>
+          <ns0:rFonts ns0:ascii="Consolas" ns0:hAnsi="Consolas"/>
+          <ns0:color ns0:val="111827"/>
+          <ns0:sz ns0:val="17"/>
+        </ns0:rPr>
+        <ns0:br/>
+        <ns0:t>scripts/build-ahv-qcow2.sh</ns0:t>
+      </ns0:r>
+    </ns0:p>
+    <ns0:p ns2:paraId="4CF1BD99" ns2:textId="77777777" ns0:rsidR="00E01221" ns0:rsidRDefault="00E02EFA">
+      <ns0:pPr>
+        <ns0:shd ns0:val="clear" ns0:color="auto" ns0:fill="F2F4F7"/>
+        <ns0:spacing ns0:before="40"/>
+        <ns0:ind ns0:left="216"/>
+      </ns0:pPr>
+      <ns0:r>
+        <ns0:rPr>
+          <ns0:rFonts ns0:ascii="Consolas" ns0:hAnsi="Consolas"/>
+          <ns0:color ns0:val="111827"/>
+          <ns0:sz ns0:val="17"/>
+        </ns0:rPr>
+        <ns0:t>cd appliance/packer/output</ns0:t>
+      </ns0:r>
+      <ns0:r>
+        <ns0:rPr>
+          <ns0:rFonts ns0:ascii="Consolas" ns0:hAnsi="Consolas"/>
+          <ns0:color ns0:val="111827"/>
+          <ns0:sz ns0:val="17"/>
+        </ns0:rPr>
+        <ns0:br/>
+        <ns0:t>sha256sum -c SHA256SUMS</ns0:t>
+      </ns0:r>
+    </ns0:p>
+    <ns0:p ns2:paraId="710362A2" ns2:textId="77777777" ns0:rsidR="00E01221" ns0:rsidRDefault="00E02EFA">
+      <ns0:pPr>
+        <ns0:pStyle ns0:val="Heading1"/>
+      </ns0:pPr>
+      <ns0:r>
+        <ns0:t>GitHub Actions Build Path</ns0:t>
+      </ns0:r>
+    </ns0:p>
+    <ns0:p ns2:paraId="29EBC8B4" ns2:textId="77777777" ns0:rsidR="00E01221" ns0:rsidRDefault="00E02EFA">
+      <ns0:pPr>
+        <ns0:pStyle ns0:val="ListBullet"/>
+        <ns0:spacing ns0:after="80"/>
+        <ns0:ind ns0:left="540" ns0:hanging="271"/>
+      </ns0:pPr>
+      <ns0:r>
+        <ns0:t>Open Actions &gt; Build AHV Appliance Image in the repository.</ns0:t>
+      </ns0:r>
+    </ns0:p>
+    <ns0:p ns2:paraId="557F71F0" ns2:textId="77777777" ns0:rsidR="00E01221" ns0:rsidRDefault="00E02EFA">
+      <ns0:pPr>
+        <ns0:pStyle ns0:val="ListBullet"/>
+        <ns0:spacing ns0:after="80"/>
+        <ns0:ind ns0:left="540" ns0:hanging="271"/>
+      </ns0:pPr>
+      <ns0:r>
+        <ns0:t>Select Run workflow.</ns0:t>
+      </ns0:r>
+    </ns0:p>
+    <ns0:p ns2:paraId="1542E825" ns2:textId="77777777" ns0:rsidR="00E01221" ns0:rsidRDefault="00E02EFA">
+      <ns0:pPr>
+        <ns0:pStyle ns0:val="ListBullet"/>
+        <ns0:spacing ns0:after="80"/>
+        <ns0:ind ns0:left="540" ns0:hanging="271"/>
+      </ns0:pPr>
+      <ns0:r>
+        <ns0:t>Use source_ref main or a release tag, image_version latest or the release tag, and qemu_accelerator tcg for GitHub-hosted runners.</ns0:t>
+      </ns0:r>
+    </ns0:p>
+    <ns0:p ns2:paraId="42D092C2" ns2:textId="77777777" ns0:rsidR="00E01221" ns0:rsidRDefault="00E02EFA">
+      <ns0:pPr>
+        <ns0:pStyle ns0:val="ListBullet"/>
+        <ns0:spacing ns0:after="80"/>
+        <ns0:ind ns0:left="540" ns0:hanging="271"/>
+      </ns0:pPr>
+      <ns0:r>
+        <ns0:t>Leave build_container_image, pull_container_images, and bake_nkp_framework set to true for a portable appliance.</ns0:t>
+      </ns0:r>
+    </ns0:p>
+    <ns0:p ns2:paraId="569AE29C" ns2:textId="77777777" ns0:rsidR="00E01221" ns0:rsidRDefault="00E02EFA">
+      <ns0:pPr>
+        <ns0:pStyle ns0:val="ListBullet"/>
+        <ns0:spacing ns0:after="80"/>
+        <ns0:ind ns0:left="540" ns0:hanging="271"/>
+      </ns0:pPr>
+      <ns0:r>
+        <ns0:t>Set nkp_bundle_urls only when bundles are available from approved connected staging URLs.</ns0:t>
+      </ns0:r>
+    </ns0:p>
+    <ns0:p ns2:paraId="0EF4551D" ns2:textId="77777777" ns0:rsidR="00E01221" ns0:rsidRDefault="00E02EFA">
+      <ns0:pPr>
+        <ns0:pStyle ns0:val="ListBullet"/>
+        <ns0:spacing ns0:after="80"/>
+        <ns0:ind ns0:left="540" ns0:hanging="271"/>
+      </ns0:pPr>
+      <ns0:r>
+        <ns0:t>Download the ztf-orchestrator-ahv-qcow2 artifact and verify SHA256SUMS before importing into AHV.</ns0:t>
+      </ns0:r>
+    </ns0:p>
+    <ns0:tbl>
+      <ns0:tblPr>
+        <ns0:tblStyle ns0:val="TableGrid"/>
+        <ns0:tblW ns0:w="9360" ns0:type="dxa"/>
+        <ns0:tblInd ns0:w="120" ns0:type="dxa"/>
+        <ns0:tblLayout ns0:type="fixed"/>
+        <ns0:tblLook ns0:val="04A0" ns0:firstRow="1" ns0:lastRow="0" ns0:firstColumn="1" ns0:lastColumn="0" ns0:noHBand="0" ns0:noVBand="1"/>
+      </ns0:tblPr>
+      <ns0:tblGrid>
+        <ns0:gridCol ns0:w="3000"/>
+        <ns0:gridCol ns0:w="6360"/>
+      </ns0:tblGrid>
+      <ns0:tr ns0:rsidR="00E01221" ns2:paraId="6954BBC7" ns2:textId="77777777">
+        <ns0:tc>
+          <ns0:tcPr>
+            <ns0:tcW ns0:w="3000" ns0:type="dxa"/>
+            <ns0:shd ns0:val="clear" ns0:color="auto" ns0:fill="E8EEF5"/>
+            <ns0:tcMar>
+              <ns0:top ns0:w="80" ns0:type="dxa"/>
+              <ns0:left ns0:w="120" ns0:type="dxa"/>
+              <ns0:bottom ns0:w="80" ns0:type="dxa"/>
+              <ns0:right ns0:w="120" ns0:type="dxa"/>
+            </ns0:tcMar>
+            <ns0:vAlign ns0:val="center"/>
+          </ns0:tcPr>
+          <ns0:p ns2:paraId="4E71F63A" ns2:textId="77777777" ns0:rsidR="00E01221" ns0:rsidRDefault="00E02EFA">
+            <ns0:r>
+              <ns0:rPr>
+                <ns0:b/>
+                <ns0:color ns0:val="1F4D78"/>
+              </ns0:rPr>
+              <ns0:t>Workflow Input</ns0:t>
+            </ns0:r>
+          </ns0:p>
+        </ns0:tc>
+        <ns0:tc>
+          <ns0:tcPr>
+            <ns0:tcW ns0:w="6360" ns0:type="dxa"/>
+            <ns0:shd ns0:val="clear" ns0:color="auto" ns0:fill="E8EEF5"/>
+            <ns0:tcMar>
+              <ns0:top ns0:w="80" ns0:type="dxa"/>
+              <ns0:left ns0:w="120" ns0:type="dxa"/>
+              <ns0:bottom ns0:w="80" ns0:type="dxa"/>
+              <ns0:right ns0:w="120" ns0:type="dxa"/>
+            </ns0:tcMar>
+            <ns0:vAlign ns0:val="center"/>
+          </ns0:tcPr>
+          <ns0:p ns2:paraId="04FFEDDC" ns2:textId="77777777" ns0:rsidR="00E01221" ns0:rsidRDefault="00E02EFA">
+            <ns0:r>
+              <ns0:rPr>
+                <ns0:b/>
+                <ns0:color ns0:val="1F4D78"/>
+              </ns0:rPr>
+              <ns0:t>Recommended Value</ns0:t>
+            </ns0:r>
+          </ns0:p>
+        </ns0:tc>
+      </ns0:tr>
+      <ns0:tr ns0:rsidR="00E01221" ns2:paraId="4B0EBA6C" ns2:textId="77777777">
+        <ns0:tc>
+          <ns0:tcPr>
+            <ns0:tcW ns0:w="3000" ns0:type="dxa"/>
+            <ns0:tcMar>
+              <ns0:top ns0:w="80" ns0:type="dxa"/>
+              <ns0:left ns0:w="120" ns0:type="dxa"/>
+              <ns0:bottom ns0:w="80" ns0:type="dxa"/>
+              <ns0:right ns0:w="120" ns0:type="dxa"/>
+            </ns0:tcMar>
+            <ns0:vAlign ns0:val="center"/>
+          </ns0:tcPr>
+          <ns0:p ns2:paraId="72B4BD99" ns2:textId="77777777" ns0:rsidR="00E01221" ns0:rsidRDefault="00E02EFA">
+            <ns0:r>
+              <ns0:t>source_ref</ns0:t>
+            </ns0:r>
+          </ns0:p>
+        </ns0:tc>
+        <ns0:tc>
+          <ns0:tcPr>
+            <ns0:tcW ns0:w="6360" ns0:type="dxa"/>
+            <ns0:tcMar>
+              <ns0:top ns0:w="80" ns0:type="dxa"/>
+              <ns0:left ns0:w="120" ns0:type="dxa"/>
+              <ns0:bottom ns0:w="80" ns0:type="dxa"/>
+              <ns0:right ns0:w="120" ns0:type="dxa"/>
+            </ns0:tcMar>
+            <ns0:vAlign ns0:val="center"/>
+          </ns0:tcPr>
+          <ns0:p ns2:paraId="1ADA7D89" ns2:textId="77777777" ns0:rsidR="00E01221" ns0:rsidRDefault="00E02EFA">
+            <ns0:r>
+              <ns0:t>main or release tag</ns0:t>
+            </ns0:r>
+          </ns0:p>
+        </ns0:tc>
+      </ns0:tr>
+      <ns0:tr ns0:rsidR="00E01221" ns2:paraId="61F164D9" ns2:textId="77777777">
+        <ns0:tc>
+          <ns0:tcPr>
+            <ns0:tcW ns0:w="3000" ns0:type="dxa"/>
+            <ns0:tcMar>
+              <ns0:top ns0:w="80" ns0:type="dxa"/>
+              <ns0:left ns0:w="120" ns0:type="dxa"/>
+              <ns0:bottom ns0:w="80" ns0:type="dxa"/>
+              <ns0:right ns0:w="120" ns0:type="dxa"/>
+            </ns0:tcMar>
+            <ns0:vAlign ns0:val="center"/>
+          </ns0:tcPr>
+          <ns0:p ns2:paraId="0F12B048" ns2:textId="77777777" ns0:rsidR="00E01221" ns0:rsidRDefault="00E02EFA">
+            <ns0:r>
+              <ns0:t>image_version</ns0:t>
+            </ns0:r>
+          </ns0:p>
+        </ns0:tc>
+        <ns0:tc>
+          <ns0:tcPr>
+            <ns0:tcW ns0:w="6360" ns0:type="dxa"/>
+            <ns0:tcMar>
+              <ns0:top ns0:w="80" ns0:type="dxa"/>
+              <ns0:left ns0:w="120" ns0:type="dxa"/>
+              <ns0:bottom ns0:w="80" ns0:type="dxa"/>
+              <ns0:right ns0:w="120" ns0:type="dxa"/>
+            </ns0:tcMar>
+            <ns0:vAlign ns0:val="center"/>
+          </ns0:tcPr>
+          <ns0:p ns2:paraId="5B0174F9" ns2:textId="77777777" ns0:rsidR="00E01221" ns0:rsidRDefault="00E02EFA">
+            <ns0:r>
+              <ns0:t>latest or release tag</ns0:t>
+            </ns0:r>
+          </ns0:p>
+        </ns0:tc>
+      </ns0:tr>
+      <ns0:tr ns0:rsidR="00E01221" ns2:paraId="3E6D701E" ns2:textId="77777777">
+        <ns0:tc>
+          <ns0:tcPr>
+            <ns0:tcW ns0:w="3000" ns0:type="dxa"/>
+            <ns0:tcMar>
+              <ns0:top ns0:w="80" ns0:type="dxa"/>
+              <ns0:left ns0:w="120" ns0:type="dxa"/>
+              <ns0:bottom ns0:w="80" ns0:type="dxa"/>
+              <ns0:right ns0:w="120" ns0:type="dxa"/>
+            </ns0:tcMar>
+            <ns0:vAlign ns0:val="center"/>
+          </ns0:tcPr>
+          <ns0:p ns2:paraId="04B6C45C" ns2:textId="77777777" ns0:rsidR="00E01221" ns0:rsidRDefault="00E02EFA">
+            <ns0:r>
+              <ns0:t>qemu_accelerator</ns0:t>
+            </ns0:r>
+          </ns0:p>
+        </ns0:tc>
+        <ns0:tc>
+          <ns0:tcPr>
+            <ns0:tcW ns0:w="6360" ns0:type="dxa"/>
+            <ns0:tcMar>
+              <ns0:top ns0:w="80" ns0:type="dxa"/>
+              <ns0:left ns0:w="120" ns0:type="dxa"/>
+              <ns0:bottom ns0:w="80" ns0:type="dxa"/>
+              <ns0:right ns0:w="120" ns0:type="dxa"/>
+            </ns0:tcMar>
+            <ns0:vAlign ns0:val="center"/>
+          </ns0:tcPr>
+          <ns0:p ns2:paraId="7297A3A2" ns2:textId="77777777" ns0:rsidR="00E01221" ns0:rsidRDefault="00E02EFA">
+            <ns0:r>
+              <ns0:t>tcg</ns0:t>
+            </ns0:r>
+          </ns0:p>
+        </ns0:tc>
+      </ns0:tr>
+      <ns0:tr ns0:rsidR="00E01221" ns2:paraId="2F29C60D" ns2:textId="77777777">
+        <ns0:tc>
+          <ns0:tcPr>
+            <ns0:tcW ns0:w="3000" ns0:type="dxa"/>
+            <ns0:tcMar>
+              <ns0:top ns0:w="80" ns0:type="dxa"/>
+              <ns0:left ns0:w="120" ns0:type="dxa"/>
+              <ns0:bottom ns0:w="80" ns0:type="dxa"/>
+              <ns0:right ns0:w="120" ns0:type="dxa"/>
+            </ns0:tcMar>
+            <ns0:vAlign ns0:val="center"/>
+          </ns0:tcPr>
+          <ns0:p ns2:paraId="077308E4" ns2:textId="77777777" ns0:rsidR="00E01221" ns0:rsidRDefault="00E02EFA">
+            <ns0:r>
+              <ns0:t>build_container_image</ns0:t>
+            </ns0:r>
+          </ns0:p>
+        </ns0:tc>
+        <ns0:tc>
+          <ns0:tcPr>
+            <ns0:tcW ns0:w="6360" ns0:type="dxa"/>
+            <ns0:tcMar>
+              <ns0:top ns0:w="80" ns0:type="dxa"/>
+              <ns0:left ns0:w="120" ns0:type="dxa"/>
+              <ns0:bottom ns0:w="80" ns0:type="dxa"/>
+              <ns0:right ns0:w="120" ns0:type="dxa"/>
+            </ns0:tcMar>
+            <ns0:vAlign ns0:val="center"/>
+          </ns0:tcPr>
+          <ns0:p ns2:paraId="6328CC12" ns2:textId="77777777" ns0:rsidR="00E01221" ns0:rsidRDefault="00E02EFA">
+            <ns0:r>
+              <ns0:t>true</ns0:t>
+            </ns0:r>
+          </ns0:p>
+        </ns0:tc>
+      </ns0:tr>
+      <ns0:tr ns0:rsidR="00E01221" ns2:paraId="3B885DDE" ns2:textId="77777777">
+        <ns0:tc>
+          <ns0:tcPr>
+            <ns0:tcW ns0:w="3000" ns0:type="dxa"/>
+            <ns0:tcMar>
+              <ns0:top ns0:w="80" ns0:type="dxa"/>
+              <ns0:left ns0:w="120" ns0:type="dxa"/>
+              <ns0:bottom ns0:w="80" ns0:type="dxa"/>
+              <ns0:right ns0:w="120" ns0:type="dxa"/>
+            </ns0:tcMar>
+            <ns0:vAlign ns0:val="center"/>
+          </ns0:tcPr>
+          <ns0:p ns2:paraId="709FAFB2" ns2:textId="77777777" ns0:rsidR="00E01221" ns0:rsidRDefault="00E02EFA">
+            <ns0:r>
+              <ns0:t>pull_container_images</ns0:t>
+            </ns0:r>
+          </ns0:p>
+        </ns0:tc>
+        <ns0:tc>
+          <ns0:tcPr>
+            <ns0:tcW ns0:w="6360" ns0:type="dxa"/>
+            <ns0:tcMar>
+              <ns0:top ns0:w="80" ns0:type="dxa"/>
+              <ns0:left ns0:w="120" ns0:type="dxa"/>
+              <ns0:bottom ns0:w="80" ns0:type="dxa"/>
+              <ns0:right ns0:w="120" ns0:type="dxa"/>
+            </ns0:tcMar>
+            <ns0:vAlign ns0:val="center"/>
+          </ns0:tcPr>
+          <ns0:p ns2:paraId="39242ABD" ns2:textId="77777777" ns0:rsidR="00E01221" ns0:rsidRDefault="00E02EFA">
+            <ns0:r>
+              <ns0:t>true</ns0:t>
+            </ns0:r>
+          </ns0:p>
+        </ns0:tc>
+      </ns0:tr>
+      <ns0:tr ns0:rsidR="00E01221" ns2:paraId="4D7DD729" ns2:textId="77777777">
+        <ns0:tc>
+          <ns0:tcPr>
+            <ns0:tcW ns0:w="3000" ns0:type="dxa"/>
+            <ns0:tcMar>
+              <ns0:top ns0:w="80" ns0:type="dxa"/>
+              <ns0:left ns0:w="120" ns0:type="dxa"/>
+              <ns0:bottom ns0:w="80" ns0:type="dxa"/>
+              <ns0:right ns0:w="120" ns0:type="dxa"/>
+            </ns0:tcMar>
+            <ns0:vAlign ns0:val="center"/>
+          </ns0:tcPr>
+          <ns0:p ns2:paraId="7985D2E1" ns2:textId="77777777" ns0:rsidR="00E01221" ns0:rsidRDefault="00E02EFA">
+            <ns0:r>
+              <ns0:t>ztf_framework_ref</ns0:t>
+            </ns0:r>
+          </ns0:p>
+        </ns0:tc>
+        <ns0:tc>
+          <ns0:tcPr>
+            <ns0:tcW ns0:w="6360" ns0:type="dxa"/>
+            <ns0:tcMar>
+              <ns0:top ns0:w="80" ns0:type="dxa"/>
+              <ns0:left ns0:w="120" ns0:type="dxa"/>
+              <ns0:bottom ns0:w="80" ns0:type="dxa"/>
+              <ns0:right ns0:w="120" ns0:type="dxa"/>
+            </ns0:tcMar>
+            <ns0:vAlign ns0:val="center"/>
+          </ns0:tcPr>
+          <ns0:p ns2:paraId="1DF7FBA6" ns2:textId="77777777" ns0:rsidR="00E01221" ns0:rsidRDefault="00E02EFA">
+            <ns0:r>
+              <ns0:t>v1.5.2</ns0:t>
+            </ns0:r>
+          </ns0:p>
+        </ns0:tc>
+      </ns0:tr>
+      <ns0:tr ns0:rsidR="00E01221" ns2:paraId="05BB80BD" ns2:textId="77777777">
+        <ns0:tc>
+          <ns0:tcPr>
+            <ns0:tcW ns0:w="3000" ns0:type="dxa"/>
+            <ns0:tcMar>
+              <ns0:top ns0:w="80" ns0:type="dxa"/>
+              <ns0:left ns0:w="120" ns0:type="dxa"/>
+              <ns0:bottom ns0:w="80" ns0:type="dxa"/>
+              <ns0:right ns0:w="120" ns0:type="dxa"/>
+            </ns0:tcMar>
+            <ns0:vAlign ns0:val="center"/>
+          </ns0:tcPr>
+          <ns0:p ns2:paraId="6FB42126" ns2:textId="77777777" ns0:rsidR="00E01221" ns0:rsidRDefault="00E02EFA">
+            <ns0:r>
+              <ns0:t>bake_nkp_framework</ns0:t>
+            </ns0:r>
+          </ns0:p>
+        </ns0:tc>
+        <ns0:tc>
+          <ns0:tcPr>
+            <ns0:tcW ns0:w="6360" ns0:type="dxa"/>
+            <ns0:tcMar>
+              <ns0:top ns0:w="80" ns0:type="dxa"/>
+              <ns0:left ns0:w="120" ns0:type="dxa"/>
+              <ns0:bottom ns0:w="80" ns0:type="dxa"/>
+              <ns0:right ns0:w="120" ns0:type="dxa"/>
+            </ns0:tcMar>
+            <ns0:vAlign ns0:val="center"/>
+          </ns0:tcPr>
+          <ns0:p ns2:paraId="6C68A62A" ns2:textId="77777777" ns0:rsidR="00E01221" ns0:rsidRDefault="00E02EFA">
+            <ns0:r>
+              <ns0:t>true</ns0:t>
+            </ns0:r>
+          </ns0:p>
+        </ns0:tc>
+      </ns0:tr>
+      <ns0:tr ns0:rsidR="00E01221" ns2:paraId="34E471E2" ns2:textId="77777777">
+        <ns0:tc>
+          <ns0:tcPr>
+            <ns0:tcW ns0:w="3000" ns0:type="dxa"/>
+            <ns0:tcMar>
+              <ns0:top ns0:w="80" ns0:type="dxa"/>
+              <ns0:left ns0:w="120" ns0:type="dxa"/>
+              <ns0:bottom ns0:w="80" ns0:type="dxa"/>
+              <ns0:right ns0:w="120" ns0:type="dxa"/>
+            </ns0:tcMar>
+            <ns0:vAlign ns0:val="center"/>
+          </ns0:tcPr>
+          <ns0:p ns2:paraId="0546804C" ns2:textId="77777777" ns0:rsidR="00E01221" ns0:rsidRDefault="00E02EFA">
+            <ns0:r>
+              <ns0:t>nkp_framework_ref</ns0:t>
+            </ns0:r>
+          </ns0:p>
+        </ns0:tc>
+        <ns0:tc>
+          <ns0:tcPr>
+            <ns0:tcW ns0:w="6360" ns0:type="dxa"/>
+            <ns0:tcMar>
+              <ns0:top ns0:w="80" ns0:type="dxa"/>
+              <ns0:left ns0:w="120" ns0:type="dxa"/>
+              <ns0:bottom ns0:w="80" ns0:type="dxa"/>
+              <ns0:right ns0:w="120" ns0:type="dxa"/>
+            </ns0:tcMar>
+            <ns0:vAlign ns0:val="center"/>
+          </ns0:tcPr>
+          <ns0:p ns2:paraId="7CB48879" ns2:textId="77777777" ns0:rsidR="00E01221" ns0:rsidRDefault="00E02EFA">
+            <ns0:r>
+              <ns0:t>main</ns0:t>
+            </ns0:r>
+          </ns0:p>
+        </ns0:tc>
+      </ns0:tr>
+      <ns0:tr ns0:rsidR="00E01221" ns2:paraId="780FDE98" ns2:textId="77777777">
+        <ns0:tc>
+          <ns0:tcPr>
+            <ns0:tcW ns0:w="3000" ns0:type="dxa"/>
+            <ns0:tcMar>
+              <ns0:top ns0:w="80" ns0:type="dxa"/>
+              <ns0:left ns0:w="120" ns0:type="dxa"/>
+              <ns0:bottom ns0:w="80" ns0:type="dxa"/>
+              <ns0:right ns0:w="120" ns0:type="dxa"/>
+            </ns0:tcMar>
+            <ns0:vAlign ns0:val="center"/>
+          </ns0:tcPr>
+          <ns0:p ns2:paraId="3AF1C28B" ns2:textId="77777777" ns0:rsidR="00E01221" ns0:rsidRDefault="00E02EFA">
+            <ns0:r>
+              <ns0:t>nkp_bundle_urls</ns0:t>
+            </ns0:r>
+          </ns0:p>
+        </ns0:tc>
+        <ns0:tc>
+          <ns0:tcPr>
+            <ns0:tcW ns0:w="6360" ns0:type="dxa"/>
+            <ns0:tcMar>
+              <ns0:top ns0:w="80" ns0:type="dxa"/>
+              <ns0:left ns0:w="120" ns0:type="dxa"/>
+              <ns0:bottom ns0:w="80" ns0:type="dxa"/>
+              <ns0:right ns0:w="120" ns0:type="dxa"/>
+            </ns0:tcMar>
+            <ns0:vAlign ns0:val="center"/>
+          </ns0:tcPr>
+          <ns0:p ns2:paraId="67C1275C" ns2:textId="77777777" ns0:rsidR="00E01221" ns0:rsidRDefault="00E02EFA">
+            <ns0:r>
+              <ns0:t>blank or approved comma-separated URLs</ns0:t>
+            </ns0:r>
+          </ns0:p>
+        </ns0:tc>
+      </ns0:tr>
+    </ns0:tbl>
+    <ns0:p ns2:paraId="13DB55D2" ns2:textId="77777777" ns0:rsidR="00E01221" ns0:rsidRDefault="00E01221"/>
+    <ns0:p ns2:paraId="607822A4" ns2:textId="77777777" ns0:rsidR="00E01221" ns0:rsidRDefault="00E02EFA">
+      <ns0:pPr>
+        <ns0:pStyle ns0:val="Heading1"/>
+      </ns0:pPr>
+      <ns0:r>
+        <ns0:t>Import Into Nutanix AHV</ns0:t>
+      </ns0:r>
+    </ns0:p>
+    <ns0:p ns2:paraId="7BD5E71C" ns2:textId="77777777" ns0:rsidR="00E01221" ns0:rsidRDefault="00E02EFA">
+      <ns0:pPr>
+        <ns0:pStyle ns0:val="ListNumber"/>
+        <ns0:spacing ns0:after="80"/>
+        <ns0:ind ns0:left="540" ns0:hanging="271"/>
+      </ns0:pPr>
+      <ns0:r>
+        <ns0:t>Upload the QCOW2 into Prism Central or Prism Element image management.</ns0:t>
+      </ns0:r>
+    </ns0:p>
+    <ns0:p ns2:paraId="58100ED6" ns2:textId="77777777" ns0:rsidR="00E01221" ns0:rsidRDefault="00E02EFA">
+      <ns0:pPr>
+        <ns0:pStyle ns0:val="ListNumber"/>
+        <ns0:spacing ns0:after="80"/>
+        <ns0:ind ns0:left="540" ns0:hanging="271"/>
+      </ns0:pPr>
+      <ns0:r>
+        <ns0:t>Create a VM from the image with 2 vCPU, 4-8 GB RAM, 80-100 GB disk, and the management VLAN.</ns0:t>
+      </ns0:r>
+    </ns0:p>
+    <ns0:p ns2:paraId="7B1616B5" ns2:textId="77777777" ns0:rsidR="00E01221" ns0:rsidRDefault="00E02EFA">
+      <ns0:pPr>
+        <ns0:pStyle ns0:val="ListNumber"/>
+        <ns0:spacing ns0:after="80"/>
+        <ns0:ind ns0:left="540" ns0:hanging="271"/>
+      </ns0:pPr>
+      <ns0:r>
+        <ns0:t>Provide cloud-init or your normal image process for administrator SSH access.</ns0:t>
+      </ns0:r>
+    </ns0:p>
+    <ns0:p ns2:paraId="19721E55" ns2:textId="77777777" ns0:rsidR="00E01221" ns0:rsidRDefault="00E02EFA">
+      <ns0:pPr>
+        <ns0:pStyle ns0:val="ListNumber"/>
+        <ns0:spacing ns0:after="80"/>
+        <ns0:ind ns0:left="540" ns0:hanging="271"/>
+      </ns0:pPr>
+      <ns0:r>
+        <ns0:t>Boot the VM and wait for first boot to finish.</ns0:t>
+      </ns0:r>
+    </ns0:p>
+    <ns0:p ns2:paraId="4A027107" ns2:textId="77777777" ns0:rsidR="00E01221" ns0:rsidRDefault="00E02EFA">
+      <ns0:pPr>
+        <ns0:pStyle ns0:val="ListNumber"/>
+        <ns0:spacing ns0:after="80"/>
+        <ns0:ind ns0:left="540" ns0:hanging="271"/>
+      </ns0:pPr>
+      <ns0:r>
+        <ns0:t>Open http://&lt;appliance-ip&gt;:5001 and sign in as admin using the generated password from service logs.</ns0:t>
+      </ns0:r>
+    </ns0:p>
+    <ns0:p ns2:paraId="5AB704B0" ns2:textId="77777777" ns0:rsidR="00E01221" ns0:rsidRDefault="00E02EFA">
+      <ns0:pPr>
+        <ns0:shd ns0:val="clear" ns0:color="auto" ns0:fill="F2F4F7"/>
+        <ns0:spacing ns0:before="40"/>
+        <ns0:ind ns0:left="216"/>
+      </ns0:pPr>
+      <ns0:r>
+        <ns0:rPr>
+          <ns0:rFonts ns0:ascii="Consolas" ns0:hAnsi="Consolas"/>
+          <ns0:color ns0:val="111827"/>
+          <ns0:sz ns0:val="17"/>
+        </ns0:rPr>
+        <ns0:t>sudo systemctl status ztf-orchestrator-firstboot</ns0:t>
+      </ns0:r>
+      <ns0:r>
+        <ns0:rPr>
+          <ns0:rFonts ns0:ascii="Consolas" ns0:hAnsi="Consolas"/>
+          <ns0:color ns0:val="111827"/>
+          <ns0:sz ns0:val="17"/>
+        </ns0:rPr>
+        <ns0:br/>
+        <ns0:t>sudo systemctl status ztf-orchestrator</ns0:t>
+      </ns0:r>
+      <ns0:r>
+        <ns0:rPr>
+          <ns0:rFonts ns0:ascii="Consolas" ns0:hAnsi="Consolas"/>
+          <ns0:color ns0:val="111827"/>
+          <ns0:sz ns0:val="17"/>
+        </ns0:rPr>
+        <ns0:br/>
+        <ns0:t>sudo journalctl -u ztf-orchestrator -n 200 --no-pager</ns0:t>
+      </ns0:r>
+    </ns0:p>
+    <ns0:p ns2:paraId="3A3BCA66" ns2:textId="77777777" ns0:rsidR="00E01221" ns0:rsidRDefault="00E02EFA">
+      <ns0:pPr>
+        <ns0:pStyle ns0:val="Heading1"/>
+      </ns0:pPr>
+      <ns0:r>
+        <ns0:t>Post-Boot Validation</ns0:t>
+      </ns0:r>
+    </ns0:p>
+    <ns0:tbl>
+      <ns0:tblPr>
+        <ns0:tblStyle ns0:val="TableGrid"/>
+        <ns0:tblW ns0:w="9360" ns0:type="dxa"/>
+        <ns0:tblInd ns0:w="120" ns0:type="dxa"/>
+        <ns0:tblLayout ns0:type="fixed"/>
+        <ns0:tblLook ns0:val="04A0" ns0:firstRow="1" ns0:lastRow="0" ns0:firstColumn="1" ns0:lastColumn="0" ns0:noHBand="0" ns0:noVBand="1"/>
+      </ns0:tblPr>
+      <ns0:tblGrid>
+        <ns0:gridCol ns0:w="2500"/>
+        <ns0:gridCol ns0:w="6860"/>
+      </ns0:tblGrid>
+      <ns0:tr ns0:rsidR="00E01221" ns2:paraId="13FFC5F2" ns2:textId="77777777">
+        <ns0:tc>
+          <ns0:tcPr>
+            <ns0:tcW ns0:w="2500" ns0:type="dxa"/>
+            <ns0:shd ns0:val="clear" ns0:color="auto" ns0:fill="E8EEF5"/>
+            <ns0:tcMar>
+              <ns0:top ns0:w="80" ns0:type="dxa"/>
+              <ns0:left ns0:w="120" ns0:type="dxa"/>
+              <ns0:bottom ns0:w="80" ns0:type="dxa"/>
+              <ns0:right ns0:w="120" ns0:type="dxa"/>
+            </ns0:tcMar>
+            <ns0:vAlign ns0:val="center"/>
+          </ns0:tcPr>
+          <ns0:p ns2:paraId="22D08B90" ns2:textId="77777777" ns0:rsidR="00E01221" ns0:rsidRDefault="00E02EFA">
+            <ns0:r>
+              <ns0:rPr>
+                <ns0:b/>
+                <ns0:color ns0:val="1F4D78"/>
+              </ns0:rPr>
+              <ns0:t>Check</ns0:t>
+            </ns0:r>
+          </ns0:p>
+        </ns0:tc>
+        <ns0:tc>
+          <ns0:tcPr>
+            <ns0:tcW ns0:w="6860" ns0:type="dxa"/>
+            <ns0:shd ns0:val="clear" ns0:color="auto" ns0:fill="E8EEF5"/>
+            <ns0:tcMar>
+              <ns0:top ns0:w="80" ns0:type="dxa"/>
+              <ns0:left ns0:w="120" ns0:type="dxa"/>
+              <ns0:bottom ns0:w="80" ns0:type="dxa"/>
+              <ns0:right ns0:w="120" ns0:type="dxa"/>
+            </ns0:tcMar>
+            <ns0:vAlign ns0:val="center"/>
+          </ns0:tcPr>
+          <ns0:p ns2:paraId="3586EB5B" ns2:textId="77777777" ns0:rsidR="00E01221" ns0:rsidRDefault="00E02EFA">
+            <ns0:r>
+              <ns0:rPr>
+                <ns0:b/>
+                <ns0:color ns0:val="1F4D78"/>
+              </ns0:rPr>
+              <ns0:t>Command / Path</ns0:t>
+            </ns0:r>
+          </ns0:p>
+        </ns0:tc>
+      </ns0:tr>
+      <ns0:tr ns0:rsidR="00E01221" ns2:paraId="5E326BAE" ns2:textId="77777777">
+        <ns0:tc>
+          <ns0:tcPr>
+            <ns0:tcW ns0:w="2500" ns0:type="dxa"/>
+            <ns0:tcMar>
+              <ns0:top ns0:w="80" ns0:type="dxa"/>
+              <ns0:left ns0:w="120" ns0:type="dxa"/>
+              <ns0:bottom ns0:w="80" ns0:type="dxa"/>
+              <ns0:right ns0:w="120" ns0:type="dxa"/>
+            </ns0:tcMar>
+            <ns0:vAlign ns0:val="center"/>
+          </ns0:tcPr>
+          <ns0:p ns2:paraId="56599E1E" ns2:textId="77777777" ns0:rsidR="00E01221" ns0:rsidRDefault="00E02EFA">
+            <ns0:r>
+              <ns0:t>Compose services</ns0:t>
+            </ns0:r>
+          </ns0:p>
+        </ns0:tc>
+        <ns0:tc>
+          <ns0:tcPr>
+            <ns0:tcW ns0:w="6860" ns0:type="dxa"/>
+            <ns0:tcMar>
+              <ns0:top ns0:w="80" ns0:type="dxa"/>
+              <ns0:left ns0:w="120" ns0:type="dxa"/>
+              <ns0:bottom ns0:w="80" ns0:type="dxa"/>
+              <ns0:right ns0:w="120" ns0:type="dxa"/>
+            </ns0:tcMar>
+            <ns0:vAlign ns0:val="center"/>
+          </ns0:tcPr>
+          <ns0:p ns2:paraId="4713D07F" ns2:textId="77777777" ns0:rsidR="00E01221" ns0:rsidRDefault="00E02EFA">
+            <ns0:r>
+              <ns0:t>sudo docker compose -f appliance/docker-compose.appliance.yml ps</ns0:t>
+            </ns0:r>
+          </ns0:p>
+        </ns0:tc>
+      </ns0:tr>
+      <ns0:tr ns0:rsidR="00E01221" ns2:paraId="2A387474" ns2:textId="77777777">
+        <ns0:tc>
+          <ns0:tcPr>
+            <ns0:tcW ns0:w="2500" ns0:type="dxa"/>
+            <ns0:tcMar>
+              <ns0:top ns0:w="80" ns0:type="dxa"/>
+              <ns0:left ns0:w="120" ns0:type="dxa"/>
+              <ns0:bottom ns0:w="80" ns0:type="dxa"/>
+              <ns0:right ns0:w="120" ns0:type="dxa"/>
+            </ns0:tcMar>
+            <ns0:vAlign ns0:val="center"/>
+          </ns0:tcPr>
+          <ns0:p ns2:paraId="4F59E05B" ns2:textId="77777777" ns0:rsidR="00E01221" ns0:rsidRDefault="00E02EFA">
+            <ns0:r>
+              <ns0:t>Application health</ns0:t>
+            </ns0:r>
+          </ns0:p>
+        </ns0:tc>
+        <ns0:tc>
+          <ns0:tcPr>
+            <ns0:tcW ns0:w="6860" ns0:type="dxa"/>
+            <ns0:tcMar>
+              <ns0:top ns0:w="80" ns0:type="dxa"/>
+              <ns0:left ns0:w="120" ns0:type="dxa"/>
+              <ns0:bottom ns0:w="80" ns0:type="dxa"/>
+              <ns0:right ns0:w="120" ns0:type="dxa"/>
+            </ns0:tcMar>
+            <ns0:vAlign ns0:val="center"/>
+          </ns0:tcPr>
+          <ns0:p ns2:paraId="4600DD59" ns2:textId="77777777" ns0:rsidR="00E01221" ns0:rsidRDefault="00E02EFA">
+            <ns0:r>
+              <ns0:t>curl http://localhost:5001/health</ns0:t>
+            </ns0:r>
+          </ns0:p>
+        </ns0:tc>
+      </ns0:tr>
+      <ns0:tr ns0:rsidR="00E01221" ns2:paraId="676E3CAF" ns2:textId="77777777">
+        <ns0:tc>
+          <ns0:tcPr>
+            <ns0:tcW ns0:w="2500" ns0:type="dxa"/>
+            <ns0:tcMar>
+              <ns0:top ns0:w="80" ns0:type="dxa"/>
+              <ns0:left ns0:w="120" ns0:type="dxa"/>
+              <ns0:bottom ns0:w="80" ns0:type="dxa"/>
+              <ns0:right ns0:w="120" ns0:type="dxa"/>
+            </ns0:tcMar>
+            <ns0:vAlign ns0:val="center"/>
+          </ns0:tcPr>
+          <ns0:p ns2:paraId="52D846CE" ns2:textId="77777777" ns0:rsidR="00E01221" ns0:rsidRDefault="00E02EFA">
+            <ns0:r>
+              <ns0:t>Baked ZTF framework</ns0:t>
+            </ns0:r>
+          </ns0:p>
+        </ns0:tc>
+        <ns0:tc>
+          <ns0:tcPr>
+            <ns0:tcW ns0:w="6860" ns0:type="dxa"/>
+            <ns0:tcMar>
+              <ns0:top ns0:w="80" ns0:type="dxa"/>
+              <ns0:left ns0:w="120" ns0:type="dxa"/>
+              <ns0:bottom ns0:w="80" ns0:type="dxa"/>
+              <ns0:right ns0:w="120" ns0:type="dxa"/>
+            </ns0:tcMar>
+            <ns0:vAlign ns0:val="center"/>
+          </ns0:tcPr>
+          <ns0:p ns2:paraId="4E211D4F" ns2:textId="77777777" ns0:rsidR="00E01221" ns0:rsidRDefault="00E02EFA">
+            <ns0:r>
+              <ns0:t>ls -la /opt/zerotouch-framework inside the ztf-orchestrator container</ns0:t>
+            </ns0:r>
+          </ns0:p>
+        </ns0:tc>
+      </ns0:tr>
+      <ns0:tr ns0:rsidR="00E01221" ns2:paraId="678B53CF" ns2:textId="77777777">
+        <ns0:tc>
+          <ns0:tcPr>
+            <ns0:tcW ns0:w="2500" ns0:type="dxa"/>
+            <ns0:tcMar>
+              <ns0:top ns0:w="80" ns0:type="dxa"/>
+              <ns0:left ns0:w="120" ns0:type="dxa"/>
+              <ns0:bottom ns0:w="80" ns0:type="dxa"/>
+              <ns0:right ns0:w="120" ns0:type="dxa"/>
+            </ns0:tcMar>
+            <ns0:vAlign ns0:val="center"/>
+          </ns0:tcPr>
+          <ns0:p ns2:paraId="0B1AEF60" ns2:textId="77777777" ns0:rsidR="00E01221" ns0:rsidRDefault="00E02EFA">
+            <ns0:r>
+              <ns0:t>Preloaded NKP framework</ns0:t>
+            </ns0:r>
+          </ns0:p>
+        </ns0:tc>
+        <ns0:tc>
+          <ns0:tcPr>
+            <ns0:tcW ns0:w="6860" ns0:type="dxa"/>
+            <ns0:tcMar>
+              <ns0:top ns0:w="80" ns0:type="dxa"/>
+              <ns0:left ns0:w="120" ns0:type="dxa"/>
+              <ns0:bottom ns0:w="80" ns0:type="dxa"/>
+              <ns0:right ns0:w="120" ns0:type="dxa"/>
+            </ns0:tcMar>
+            <ns0:vAlign ns0:val="center"/>
+          </ns0:tcPr>
+          <ns0:p ns2:paraId="235DFBA3" ns2:textId="77777777" ns0:rsidR="00E01221" ns0:rsidRDefault="00E02EFA">
+            <ns0:r>
+              <ns0:t>ls -la /var/lib/ztf-orchestrator/nkp-zerotouch-framework inside the container</ns0:t>
+            </ns0:r>
+          </ns0:p>
+        </ns0:tc>
+      </ns0:tr>
+      <ns0:tr ns0:rsidR="00E01221" ns2:paraId="62704D35" ns2:textId="77777777">
+        <ns0:tc>
+          <ns0:tcPr>
+            <ns0:tcW ns0:w="2500" ns0:type="dxa"/>
+            <ns0:tcMar>
+              <ns0:top ns0:w="80" ns0:type="dxa"/>
+              <ns0:left ns0:w="120" ns0:type="dxa"/>
+              <ns0:bottom ns0:w="80" ns0:type="dxa"/>
+              <ns0:right ns0:w="120" ns0:type="dxa"/>
+            </ns0:tcMar>
+            <ns0:vAlign ns0:val="center"/>
+          </ns0:tcPr>
+          <ns0:p ns2:paraId="671B23DC" ns2:textId="77777777" ns0:rsidR="00E01221" ns0:rsidRDefault="00E02EFA">
+            <ns0:r>
+              <ns0:t>Preloaded NKP bundles</ns0:t>
+            </ns0:r>
+          </ns0:p>
+        </ns0:tc>
+        <ns0:tc>
+          <ns0:tcPr>
+            <ns0:tcW ns0:w="6860" ns0:type="dxa"/>
+            <ns0:tcMar>
+              <ns0:top ns0:w="80" ns0:type="dxa"/>
+              <ns0:left ns0:w="120" ns0:type="dxa"/>
+              <ns0:bottom ns0:w="80" ns0:type="dxa"/>
+              <ns0:right ns0:w="120" ns0:type="dxa"/>
+            </ns0:tcMar>
+            <ns0:vAlign ns0:val="center"/>
+          </ns0:tcPr>
+          <ns0:p ns2:paraId="173B8BD6" ns2:textId="77777777" ns0:rsidR="00E01221" ns0:rsidRDefault="00E02EFA">
+            <ns0:r>
+              <ns0:t>ls -la /var/lib/ztf-orchestrator/bundles inside the container</ns0:t>
+            </ns0:r>
+          </ns0:p>
+        </ns0:tc>
+      </ns0:tr>
+    </ns0:tbl>
+    <ns0:p ns2:paraId="094EDA80" ns2:textId="77777777" ns0:rsidR="00E01221" ns0:rsidRDefault="00E01221"/>
+    <ns0:p ns2:paraId="312117B9" ns2:textId="77777777" ns0:rsidR="00E01221" ns0:rsidRDefault="00E02EFA">
+      <ns0:pPr>
+        <ns0:shd ns0:val="clear" ns0:color="auto" ns0:fill="F2F4F7"/>
+        <ns0:spacing ns0:before="40"/>
+        <ns0:ind ns0:left="216"/>
+      </ns0:pPr>
+      <ns0:r>
+        <ns0:rPr>
+          <ns0:rFonts ns0:ascii="Consolas" ns0:hAnsi="Consolas"/>
+          <ns0:color ns0:val="111827"/>
+          <ns0:sz ns0:val="17"/>
+        </ns0:rPr>
+        <ns0:t>cd /opt/ztf-orchestrator</ns0:t>
+      </ns0:r>
+      <ns0:r>
+        <ns0:rPr>
+          <ns0:rFonts ns0:ascii="Consolas" ns0:hAnsi="Consolas"/>
+          <ns0:color ns0:val="111827"/>
+          <ns0:sz ns0:val="17"/>
+        </ns0:rPr>
+        <ns0:br/>
+        <ns0:t>sudo docker compose -f appliance/docker-compose.appliance.yml exec ztf-orchestrator ls -la /opt/zerotouch-framework</ns0:t>
+      </ns0:r>
+      <ns0:r>
+        <ns0:rPr>
+          <ns0:rFonts ns0:ascii="Consolas" ns0:hAnsi="Consolas"/>
+          <ns0:color ns0:val="111827"/>
+          <ns0:sz ns0:val="17"/>
+        </ns0:rPr>
+        <ns0:br/>
+      </ns0:r>
+      <ns0:r>
+        <ns0:rPr>
+          <ns0:rFonts ns0:ascii="Consolas" ns0:hAnsi="Consolas"/>
+          <ns0:color ns0:val="111827"/>
+          <ns0:sz ns0:val="17"/>
+        </ns0:rPr>
+        <ns0:t>sudo docker compose -f appliance/docker-compose.appliance.yml exec ztf-orchestrator ls -la /var/lib/ztf-orchestrator/nkp-zerotouch-framework</ns0:t>
+      </ns0:r>
+      <ns0:r>
+        <ns0:rPr>
+          <ns0:rFonts ns0:ascii="Consolas" ns0:hAnsi="Consolas"/>
+          <ns0:color ns0:val="111827"/>
+          <ns0:sz ns0:val="17"/>
+        </ns0:rPr>
+        <ns0:br/>
+        <ns0:t>sudo docker compose -f appliance/docker-compose.appliance.yml exec ztf-orchestrator ls -la /var/lib/ztf-orchestrator/bundles</ns0:t>
+      </ns0:r>
+      <ns0:r>
+        <ns0:rPr>
+          <ns0:rFonts ns0:ascii="Consolas" ns0:hAnsi="Consolas"/>
+          <ns0:color ns0:val="111827"/>
+          <ns0:sz ns0:val="17"/>
+        </ns0:rPr>
+        <ns0:br/>
+        <ns0:t>curl http://localhost:5001/health</ns0:t>
+      </ns0:r>
+    </ns0:p>
+    <ns0:p ns2:paraId="5D97E906" ns2:textId="77777777" ns0:rsidR="00E01221" ns0:rsidRDefault="00E02EFA">
+      <ns0:pPr>
+        <ns0:pStyle ns0:val="Heading1"/>
+      </ns0:pPr>
+      <ns0:r>
+        <ns0:t>NKP UI Registration</ns0:t>
+      </ns0:r>
+    </ns0:p>
+    <ns0:p ns2:paraId="27D37CB3" ns2:textId="77777777" ns0:rsidR="00E01221" ns0:rsidRDefault="00E02EFA">
+      <ns0:pPr>
+        <ns0:pStyle ns0:val="ListBullet"/>
+        <ns0:spacing ns0:after="80"/>
+        <ns0:ind ns0:left="540" ns0:hanging="271"/>
+      </ns0:pPr>
+      <ns0:r>
+        <ns0:t>Open NKP Framework in the ZTF-Orchestrator UI.</ns0:t>
+      </ns0:r>
+    </ns0:p>
+    <ns0:p ns2:paraId="7763999E" ns2:textId="77777777" ns0:rsidR="00E01221" ns0:rsidRDefault="00E02EFA">
+      <ns0:pPr>
+        <ns0:pStyle ns0:val="ListBullet"/>
+        <ns0:spacing ns0:after="80"/>
+        <ns0:ind ns0:left="540" ns0:hanging="271"/>
+      </ns0:pPr>
+      <ns0:r>
+        <ns0:t>Confirm the NKP framework path is /var/lib/ztf-orchestrator/nkp-zerotouch-framework.</ns0:t>
+      </ns0:r>
+    </ns0:p>
+    <ns0:p ns2:paraId="43094440" ns2:textId="77777777" ns0:rsidR="00E01221" ns0:rsidRDefault="00E02EFA">
+      <ns0:pPr>
+        <ns0:pStyle ns0:val="ListBullet"/>
+        <ns0:spacing ns0:after="80"/>
+        <ns0:ind ns0:left="540" ns0:hanging="271"/>
+      </ns0:pPr>
+      <ns0:r>
+        <ns0:t>Register NKP bundle or binary paths under Binaries using /var/lib/ztf-orchestrator/bundles/&lt;artifact&gt;.</ns0:t>
+      </ns0:r>
+    </ns0:p>
+    <ns0:p ns2:paraId="558C1CD9" ns2:textId="77777777" ns0:rsidR="00E01221" ns0:rsidRDefault="00E02EFA">
+      <ns0:pPr>
+        <ns0:pStyle ns0:val="ListBullet"/>
+        <ns0:spacing ns0:after="80"/>
+        <ns0:ind ns0:left="540" ns0:hanging="271"/>
+      </ns0:pPr>
+      <ns0:r>
+        <ns0:t>Run Check CLI Compatibility before generating profiles or submitting NKP phases.</ns0:t>
+      </ns0:r>
+    </ns0:p>
+    <ns0:p ns2:paraId="7B3B8340" ns2:textId="77777777" ns0:rsidR="00E01221" ns0:rsidRDefault="00E02EFA">
+      <ns0:pPr>
+        <ns0:pStyle ns0:val="ListBullet"/>
+        <ns0:spacing ns0:after="80"/>
+        <ns0:ind ns0:left="540" ns0:hanging="271"/>
+      </ns0:pPr>
+      <ns0:r>
+        <ns0:t>Use only safe phases through the orchestrator unless a separately reviewed apply/destructive mode is added later.</ns0:t>
+      </ns0:r>
+    </ns0:p>
+    <ns0:tbl>
+      <ns0:tblPr>
+        <ns0:tblStyle ns0:val="TableGrid"/>
+        <ns0:tblW ns0:w="9360" ns0:type="dxa"/>
+        <ns0:tblInd ns0:w="120" ns0:type="dxa"/>
+        <ns0:tblLayout ns0:type="fixed"/>
+        <ns0:tblLook ns0:val="04A0" ns0:firstRow="1" ns0:lastRow="0" ns0:firstColumn="1" ns0:lastColumn="0" ns0:noHBand="0" ns0:noVBand="1"/>
+      </ns0:tblPr>
+      <ns0:tblGrid>
+        <ns0:gridCol ns0:w="9360"/>
+      </ns0:tblGrid>
+      <ns0:tr ns0:rsidR="00E01221" ns2:paraId="3A0E76D2" ns2:textId="77777777">
+        <ns0:tc>
+          <ns0:tcPr>
+            <ns0:tcW ns0:w="9360" ns0:type="dxa"/>
+            <ns0:shd ns0:val="clear" ns0:color="auto" ns0:fill="F4F6F9"/>
+            <ns0:tcMar>
+              <ns0:top ns0:w="80" ns0:type="dxa"/>
+              <ns0:left ns0:w="120" ns0:type="dxa"/>
+              <ns0:bottom ns0:w="80" ns0:type="dxa"/>
+              <ns0:right ns0:w="120" ns0:type="dxa"/>
+            </ns0:tcMar>
+            <ns0:vAlign ns0:val="center"/>
+          </ns0:tcPr>
+          <ns0:p ns2:paraId="352726F6" ns2:textId="77777777" ns0:rsidR="00E01221" ns0:rsidRDefault="00E02EFA">
+            <ns0:r>
+              <ns0:t>Security note: appliance runtime secrets are generated on first boot, not during image build. NKP preload mounts are read-only inside the app container. Do not commit NKP bundles or site-specific secrets to Git; use appliance/preload only as a local staging area.</ns0:t>
+            </ns0:r>
+          </ns0:p>
+        </ns0:tc>
+      </ns0:tr>
+    </ns0:tbl>
+    <ns0:p ns2:paraId="7E1748D2" ns2:textId="77777777" ns0:rsidR="00E02EFA" ns0:rsidRDefault="00E02EFA"/>
+    <ns0:sectPr ns0:rsidR="00E02EFA" ns0:rsidSect="00034616">
+      <ns0:pgSz ns0:w="12240" ns0:h="15840"/>
+      <ns0:pgMar ns0:top="1440" ns0:right="1440" ns0:bottom="1440" ns0:left="1440" ns0:header="708" ns0:footer="708" ns0:gutter="0"/>
+      <ns0:cols ns0:space="720"/>
+      <ns0:docGrid ns0:linePitch="360"/>
+    </ns0:sectPr>
+  </ns0:body>
+</ns0:document>
 </file>
 
 <file path=word/endnotes.xml><?xml version="1.0" encoding="utf-8"?>

</xml_diff>